<commit_message>
Fig. 15: regenerate as SCAPS-style band diagram (step connectors, Fn/Fp pair, layer labels above)
</commit_message>
<xml_diff>
--- a/paper/round3/RbGeI3_Round3.docx
+++ b/paper/round3/RbGeI3_Round3.docx
@@ -279,7 +279,63 @@
           <w:i w:val="0"/>
           <w:sz w:val="22"/>
         </w:rPr>
-        <w:t xml:space="preserve">/CuI/Au architecture was selected for further optimization on the grounds of long-term stability and cost. Eleven device parameters (absorber thickness, absorber defect density, dielectric constant, electron affinity, bandgap, conduction- and valence-band effective density of states, ETL and HTL thicknesses, and the interfacial defect densities at both heterojunctions) were varied sequentially under AM 1.5G illumination at 300 K. The optimized device reaches a power conversion efficiency (PCE) of 26.80%, with an open-circuit voltage (Voc) of 1.12 V, a short-circuit current density (Jsc) of 30.32 mA/cm², and a fill factor (FF) of 78.92%. The optimized parameter set comprises a 700 nm </w:t>
+        <w:t xml:space="preserve">/CuI/Au architecture was selected for further optimization on the grounds of long-term stability and cost. Eleven device parameters (absorber thickness, absorber defect density, dielectric constant, electron affinity, bandgap, conduction- and valence-band effective density of states, ETL and HTL thicknesses, and the interfacial defect densities at both heterojunctions) were varied sequentially under AM 1.5G illumination at 300 K. The optimized device reaches a power conversion efficiency (PCE) of 26.80%, with an open-circuit voltage (</w:t>
+      </w:r>
+      <w:r>
+        <w:rPr>
+          <w:rFonts w:ascii="Times New Roman" w:hAnsi="Times New Roman"/>
+          <w:b w:val="0"/>
+          <w:i w:val="0"/>
+          <w:sz w:val="22"/>
+        </w:rPr>
+        <w:t xml:space="preserve">V</w:t>
+      </w:r>
+      <w:r>
+        <w:rPr>
+          <w:rFonts w:ascii="Times New Roman" w:hAnsi="Times New Roman"/>
+          <w:b w:val="0"/>
+          <w:i w:val="0"/>
+          <w:sz w:val="22"/>
+          <w:vertAlign w:val="subscript"/>
+        </w:rPr>
+        <w:t xml:space="preserve">OC</w:t>
+      </w:r>
+      <w:r>
+        <w:rPr>
+          <w:rFonts w:ascii="Times New Roman" w:hAnsi="Times New Roman"/>
+          <w:b w:val="0"/>
+          <w:i w:val="0"/>
+          <w:sz w:val="22"/>
+        </w:rPr>
+        <w:t xml:space="preserve">) of 1.12 V, a short-circuit current density (</w:t>
+      </w:r>
+      <w:r>
+        <w:rPr>
+          <w:rFonts w:ascii="Times New Roman" w:hAnsi="Times New Roman"/>
+          <w:b w:val="0"/>
+          <w:i w:val="0"/>
+          <w:sz w:val="22"/>
+        </w:rPr>
+        <w:t xml:space="preserve">J</w:t>
+      </w:r>
+      <w:r>
+        <w:rPr>
+          <w:rFonts w:ascii="Times New Roman" w:hAnsi="Times New Roman"/>
+          <w:b w:val="0"/>
+          <w:i w:val="0"/>
+          <w:sz w:val="22"/>
+          <w:vertAlign w:val="subscript"/>
+        </w:rPr>
+        <w:t xml:space="preserve">SC</w:t>
+      </w:r>
+      <w:r>
+        <w:rPr>
+          <w:rFonts w:ascii="Times New Roman" w:hAnsi="Times New Roman"/>
+          <w:b w:val="0"/>
+          <w:i w:val="0"/>
+          <w:sz w:val="22"/>
+        </w:rPr>
+        <w:t xml:space="preserve">) of 30.32 mA/cm², and a fill factor (FF) of 78.92%. The optimized parameter set comprises a 700 nm </w:t>
       </w:r>
       <w:r>
         <w:rPr>
@@ -1267,9 +1323,17 @@
     </w:p>
     <w:tbl>
       <w:tblPr>
-        <w:tblStyle w:val="LightGrid-Accent1"/>
+        <w:tblStyle w:val="TableNormal"/>
         <w:tblLook w:firstColumn="1" w:firstRow="1" w:lastColumn="0" w:lastRow="0" w:noHBand="0" w:noVBand="1" w:val="04A0"/>
         <w:tblW w:type="pct" w:w="5000"/>
+        <w:tblBorders>
+          <w:top w:val="single" w:sz="4" w:space="0" w:color="000000"/>
+          <w:bottom w:val="single" w:sz="4" w:space="0" w:color="000000"/>
+          <w:left w:val="none"/>
+          <w:right w:val="none"/>
+          <w:insideH w:val="none"/>
+          <w:insideV w:val="none"/>
+        </w:tblBorders>
         <w:tblLayout w:type="autofit"/>
       </w:tblPr>
       <w:tblGrid>
@@ -1286,6 +1350,9 @@
         <w:tc>
           <w:tcPr>
             <w:tcW w:type="dxa" w:w="2041"/>
+            <w:tcBorders>
+              <w:bottom w:val="single" w:sz="4" w:space="0" w:color="000000"/>
+            </w:tcBorders>
           </w:tcPr>
           <w:p>
             <w:pPr>
@@ -1296,15 +1363,15 @@
                 <w:rFonts w:ascii="Times New Roman" w:hAnsi="Times New Roman" w:cs="Times New Roman"/>
                 <w:b w:val="0"/>
                 <w:i w:val="0"/>
-                <w:sz w:val="18"/>
-              </w:rPr>
-            </w:r>
-            <w:r>
-              <w:rPr>
-                <w:rFonts w:ascii="Times New Roman" w:hAnsi="Times New Roman" w:cs="Times New Roman"/>
-                <w:b/>
-                <w:i w:val="0"/>
-                <w:sz w:val="18"/>
+                <w:sz w:val="20"/>
+              </w:rPr>
+            </w:r>
+            <w:r>
+              <w:rPr>
+                <w:rFonts w:ascii="Times New Roman" w:hAnsi="Times New Roman" w:cs="Times New Roman"/>
+                <w:b w:val="0"/>
+                <w:i w:val="0"/>
+                <w:sz w:val="20"/>
               </w:rPr>
               <w:t>Study (Year) [Ref.]</w:t>
             </w:r>
@@ -1313,6 +1380,9 @@
         <w:tc>
           <w:tcPr>
             <w:tcW w:type="dxa" w:w="2494"/>
+            <w:tcBorders>
+              <w:bottom w:val="single" w:sz="4" w:space="0" w:color="000000"/>
+            </w:tcBorders>
           </w:tcPr>
           <w:p>
             <w:pPr>
@@ -1323,15 +1393,15 @@
                 <w:rFonts w:ascii="Times New Roman" w:hAnsi="Times New Roman" w:cs="Times New Roman"/>
                 <w:b w:val="0"/>
                 <w:i w:val="0"/>
-                <w:sz w:val="18"/>
-              </w:rPr>
-            </w:r>
-            <w:r>
-              <w:rPr>
-                <w:rFonts w:ascii="Times New Roman" w:hAnsi="Times New Roman" w:cs="Times New Roman"/>
-                <w:b/>
-                <w:i w:val="0"/>
-                <w:sz w:val="18"/>
+                <w:sz w:val="20"/>
+              </w:rPr>
+            </w:r>
+            <w:r>
+              <w:rPr>
+                <w:rFonts w:ascii="Times New Roman" w:hAnsi="Times New Roman" w:cs="Times New Roman"/>
+                <w:b w:val="0"/>
+                <w:i w:val="0"/>
+                <w:sz w:val="20"/>
               </w:rPr>
               <w:t>Device Structure</w:t>
             </w:r>
@@ -1340,6 +1410,9 @@
         <w:tc>
           <w:tcPr>
             <w:tcW w:type="dxa" w:w="850"/>
+            <w:tcBorders>
+              <w:bottom w:val="single" w:sz="4" w:space="0" w:color="000000"/>
+            </w:tcBorders>
           </w:tcPr>
           <w:p>
             <w:pPr>
@@ -1350,15 +1423,15 @@
                 <w:rFonts w:ascii="Times New Roman" w:hAnsi="Times New Roman" w:cs="Times New Roman"/>
                 <w:b w:val="0"/>
                 <w:i w:val="0"/>
-                <w:sz w:val="18"/>
-              </w:rPr>
-            </w:r>
-            <w:r>
-              <w:rPr>
-                <w:rFonts w:ascii="Times New Roman" w:hAnsi="Times New Roman" w:cs="Times New Roman"/>
-                <w:b/>
-                <w:i w:val="0"/>
-                <w:sz w:val="18"/>
+                <w:sz w:val="20"/>
+              </w:rPr>
+            </w:r>
+            <w:r>
+              <w:rPr>
+                <w:rFonts w:ascii="Times New Roman" w:hAnsi="Times New Roman" w:cs="Times New Roman"/>
+                <w:b w:val="0"/>
+                <w:i w:val="0"/>
+                <w:sz w:val="20"/>
               </w:rPr>
               <w:t>PCE (%)</w:t>
             </w:r>
@@ -1367,6 +1440,9 @@
         <w:tc>
           <w:tcPr>
             <w:tcW w:type="dxa" w:w="3969"/>
+            <w:tcBorders>
+              <w:bottom w:val="single" w:sz="4" w:space="0" w:color="000000"/>
+            </w:tcBorders>
           </w:tcPr>
           <w:p>
             <w:pPr>
@@ -1377,15 +1453,15 @@
                 <w:rFonts w:ascii="Times New Roman" w:hAnsi="Times New Roman" w:cs="Times New Roman"/>
                 <w:b w:val="0"/>
                 <w:i w:val="0"/>
-                <w:sz w:val="18"/>
-              </w:rPr>
-            </w:r>
-            <w:r>
-              <w:rPr>
-                <w:rFonts w:ascii="Times New Roman" w:hAnsi="Times New Roman" w:cs="Times New Roman"/>
-                <w:b/>
-                <w:i w:val="0"/>
-                <w:sz w:val="18"/>
+                <w:sz w:val="20"/>
+              </w:rPr>
+            </w:r>
+            <w:r>
+              <w:rPr>
+                <w:rFonts w:ascii="Times New Roman" w:hAnsi="Times New Roman" w:cs="Times New Roman"/>
+                <w:b w:val="0"/>
+                <w:i w:val="0"/>
+                <w:sz w:val="20"/>
               </w:rPr>
               <w:t>Key Limitation</w:t>
             </w:r>
@@ -1513,7 +1589,7 @@
           </w:tcPr>
           <w:p>
             <w:pPr>
-              <w:jc w:val="center"/>
+              <w:jc w:val="left"/>
             </w:pPr>
             <w:r>
               <w:rPr>
@@ -1656,7 +1732,7 @@
           </w:tcPr>
           <w:p>
             <w:pPr>
-              <w:jc w:val="center"/>
+              <w:jc w:val="left"/>
             </w:pPr>
             <w:r>
               <w:rPr>
@@ -1715,7 +1791,7 @@
           </w:tcPr>
           <w:p>
             <w:pPr>
-              <w:jc w:val="center"/>
+              <w:jc w:val="left"/>
             </w:pPr>
             <w:r>
               <w:rPr>
@@ -1856,7 +1932,7 @@
           </w:tcPr>
           <w:p>
             <w:pPr>
-              <w:jc w:val="center"/>
+              <w:jc w:val="left"/>
             </w:pPr>
             <w:r>
               <w:rPr>
@@ -1999,7 +2075,7 @@
           </w:tcPr>
           <w:p>
             <w:pPr>
-              <w:jc w:val="center"/>
+              <w:jc w:val="left"/>
             </w:pPr>
             <w:r>
               <w:rPr>
@@ -2145,7 +2221,7 @@
           </w:tcPr>
           <w:p>
             <w:pPr>
-              <w:jc w:val="center"/>
+              <w:jc w:val="left"/>
             </w:pPr>
             <w:r>
               <w:rPr>
@@ -2204,7 +2280,7 @@
           </w:tcPr>
           <w:p>
             <w:pPr>
-              <w:jc w:val="center"/>
+              <w:jc w:val="left"/>
             </w:pPr>
             <w:r>
               <w:rPr>
@@ -2288,7 +2364,7 @@
           </w:tcPr>
           <w:p>
             <w:pPr>
-              <w:jc w:val="center"/>
+              <w:jc w:val="left"/>
             </w:pPr>
             <w:r>
               <w:rPr>
@@ -2347,7 +2423,7 @@
           </w:tcPr>
           <w:p>
             <w:pPr>
-              <w:jc w:val="center"/>
+              <w:jc w:val="left"/>
             </w:pPr>
             <w:r>
               <w:rPr>
@@ -2412,7 +2488,7 @@
           </w:tcPr>
           <w:p>
             <w:pPr>
-              <w:jc w:val="center"/>
+              <w:jc w:val="left"/>
             </w:pPr>
             <w:r>
               <w:rPr>
@@ -3357,9 +3433,17 @@
     </w:p>
     <w:tbl>
       <w:tblPr>
-        <w:tblStyle w:val="LightGrid-Accent1"/>
+        <w:tblStyle w:val="TableNormal"/>
         <w:tblLook w:firstColumn="1" w:firstRow="1" w:lastColumn="0" w:lastRow="0" w:noHBand="0" w:noVBand="1" w:val="04A0"/>
         <w:tblW w:type="pct" w:w="5000"/>
+        <w:tblBorders>
+          <w:top w:val="single" w:sz="4" w:space="0" w:color="000000"/>
+          <w:bottom w:val="single" w:sz="4" w:space="0" w:color="000000"/>
+          <w:left w:val="none"/>
+          <w:right w:val="none"/>
+          <w:insideH w:val="none"/>
+          <w:insideV w:val="none"/>
+        </w:tblBorders>
         <w:tblLayout w:type="autofit"/>
       </w:tblPr>
       <w:tblGrid>
@@ -3377,6 +3461,9 @@
         <w:tc>
           <w:tcPr>
             <w:tcW w:type="dxa" w:w="3118"/>
+            <w:tcBorders>
+              <w:bottom w:val="single" w:sz="4" w:space="0" w:color="000000"/>
+            </w:tcBorders>
           </w:tcPr>
           <w:p>
             <w:pPr>
@@ -3387,15 +3474,15 @@
                 <w:rFonts w:ascii="Times New Roman" w:hAnsi="Times New Roman" w:cs="Times New Roman"/>
                 <w:b w:val="0"/>
                 <w:i w:val="0"/>
-                <w:sz w:val="18"/>
-              </w:rPr>
-            </w:r>
-            <w:r>
-              <w:rPr>
-                <w:rFonts w:ascii="Times New Roman" w:hAnsi="Times New Roman" w:cs="Times New Roman"/>
-                <w:b/>
-                <w:i w:val="0"/>
-                <w:sz w:val="18"/>
+                <w:sz w:val="20"/>
+              </w:rPr>
+            </w:r>
+            <w:r>
+              <w:rPr>
+                <w:rFonts w:ascii="Times New Roman" w:hAnsi="Times New Roman" w:cs="Times New Roman"/>
+                <w:b w:val="0"/>
+                <w:i w:val="0"/>
+                <w:sz w:val="20"/>
               </w:rPr>
               <w:t>Parameter</w:t>
             </w:r>
@@ -3404,6 +3491,9 @@
         <w:tc>
           <w:tcPr>
             <w:tcW w:type="dxa" w:w="1361"/>
+            <w:tcBorders>
+              <w:bottom w:val="single" w:sz="4" w:space="0" w:color="000000"/>
+            </w:tcBorders>
           </w:tcPr>
           <w:p>
             <w:pPr>
@@ -3412,7 +3502,7 @@
             <w:r>
               <w:rPr>
                 <w:rFonts w:ascii="Times New Roman" w:hAnsi="Times New Roman" w:cs="Times New Roman"/>
-                <w:sz w:val="18"/>
+                <w:sz w:val="20"/>
                 <w:b w:val="0"/>
                 <w:i w:val="0"/>
               </w:rPr>
@@ -3422,7 +3512,7 @@
               <w:rPr>
                 <w:rFonts w:ascii="Times New Roman" w:hAnsi="Times New Roman" w:cs="Times New Roman"/>
                 <w:vertAlign w:val="subscript"/>
-                <w:sz w:val="18"/>
+                <w:sz w:val="20"/>
                 <w:b w:val="0"/>
                 <w:i w:val="0"/>
               </w:rPr>
@@ -3433,6 +3523,9 @@
         <w:tc>
           <w:tcPr>
             <w:tcW w:type="dxa" w:w="1361"/>
+            <w:tcBorders>
+              <w:bottom w:val="single" w:sz="4" w:space="0" w:color="000000"/>
+            </w:tcBorders>
           </w:tcPr>
           <w:p>
             <w:pPr>
@@ -3443,15 +3536,15 @@
                 <w:rFonts w:ascii="Times New Roman" w:hAnsi="Times New Roman" w:cs="Times New Roman"/>
                 <w:b w:val="0"/>
                 <w:i w:val="0"/>
-                <w:sz w:val="18"/>
-              </w:rPr>
-            </w:r>
-            <w:r>
-              <w:rPr>
-                <w:rFonts w:ascii="Times New Roman" w:hAnsi="Times New Roman" w:cs="Times New Roman"/>
-                <w:b/>
-                <w:i w:val="0"/>
-                <w:sz w:val="18"/>
+                <w:sz w:val="20"/>
+              </w:rPr>
+            </w:r>
+            <w:r>
+              <w:rPr>
+                <w:rFonts w:ascii="Times New Roman" w:hAnsi="Times New Roman" w:cs="Times New Roman"/>
+                <w:b w:val="0"/>
+                <w:i w:val="0"/>
+                <w:sz w:val="20"/>
               </w:rPr>
               <w:t>FTO</w:t>
             </w:r>
@@ -3460,6 +3553,9 @@
         <w:tc>
           <w:tcPr>
             <w:tcW w:type="dxa" w:w="1361"/>
+            <w:tcBorders>
+              <w:bottom w:val="single" w:sz="4" w:space="0" w:color="000000"/>
+            </w:tcBorders>
           </w:tcPr>
           <w:p>
             <w:pPr>
@@ -3468,7 +3564,7 @@
             <w:r>
               <w:rPr>
                 <w:rFonts w:ascii="Times New Roman" w:hAnsi="Times New Roman" w:cs="Times New Roman"/>
-                <w:sz w:val="18"/>
+                <w:sz w:val="20"/>
                 <w:b w:val="0"/>
                 <w:i w:val="0"/>
               </w:rPr>
@@ -3478,7 +3574,7 @@
               <w:rPr>
                 <w:rFonts w:ascii="Times New Roman" w:hAnsi="Times New Roman" w:cs="Times New Roman"/>
                 <w:vertAlign w:val="subscript"/>
-                <w:sz w:val="18"/>
+                <w:sz w:val="20"/>
                 <w:b w:val="0"/>
                 <w:i w:val="0"/>
               </w:rPr>
@@ -3489,6 +3585,9 @@
         <w:tc>
           <w:tcPr>
             <w:tcW w:type="dxa" w:w="1361"/>
+            <w:tcBorders>
+              <w:bottom w:val="single" w:sz="4" w:space="0" w:color="000000"/>
+            </w:tcBorders>
           </w:tcPr>
           <w:p>
             <w:pPr>
@@ -3499,15 +3598,15 @@
                 <w:rFonts w:ascii="Times New Roman" w:hAnsi="Times New Roman" w:cs="Times New Roman"/>
                 <w:b w:val="0"/>
                 <w:i w:val="0"/>
-                <w:sz w:val="18"/>
-              </w:rPr>
-            </w:r>
-            <w:r>
-              <w:rPr>
-                <w:rFonts w:ascii="Times New Roman" w:hAnsi="Times New Roman" w:cs="Times New Roman"/>
-                <w:b/>
-                <w:i w:val="0"/>
-                <w:sz w:val="18"/>
+                <w:sz w:val="20"/>
+              </w:rPr>
+            </w:r>
+            <w:r>
+              <w:rPr>
+                <w:rFonts w:ascii="Times New Roman" w:hAnsi="Times New Roman" w:cs="Times New Roman"/>
+                <w:b w:val="0"/>
+                <w:i w:val="0"/>
+                <w:sz w:val="20"/>
               </w:rPr>
               <w:t>CuI</w:t>
             </w:r>
@@ -3755,6 +3854,9 @@
             <w:tcW w:type="dxa" w:w="1361"/>
           </w:tcPr>
           <w:p>
+            <w:pPr>
+              <w:jc w:val="center"/>
+            </w:pPr>
             <w:r>
               <w:rPr>
                 <w:rFonts w:ascii="Times New Roman" w:hAnsi="Times New Roman" w:cs="Times New Roman"/>
@@ -5152,9 +5254,17 @@
     </w:p>
     <w:tbl>
       <w:tblPr>
-        <w:tblStyle w:val="LightGrid-Accent1"/>
+        <w:tblStyle w:val="TableNormal"/>
         <w:tblLook w:firstColumn="1" w:firstRow="1" w:lastColumn="0" w:lastRow="0" w:noHBand="0" w:noVBand="1" w:val="04A0"/>
         <w:tblW w:type="pct" w:w="5000"/>
+        <w:tblBorders>
+          <w:top w:val="single" w:sz="4" w:space="0" w:color="000000"/>
+          <w:bottom w:val="single" w:sz="4" w:space="0" w:color="000000"/>
+          <w:left w:val="none"/>
+          <w:right w:val="none"/>
+          <w:insideH w:val="none"/>
+          <w:insideV w:val="none"/>
+        </w:tblBorders>
         <w:tblLayout w:type="autofit"/>
       </w:tblPr>
       <w:tblGrid>
@@ -5169,6 +5279,9 @@
         <w:tc>
           <w:tcPr>
             <w:tcW w:type="dxa" w:w="3402"/>
+            <w:tcBorders>
+              <w:bottom w:val="single" w:sz="4" w:space="0" w:color="000000"/>
+            </w:tcBorders>
           </w:tcPr>
           <w:p>
             <w:pPr>
@@ -5179,15 +5292,15 @@
                 <w:rFonts w:ascii="Times New Roman" w:hAnsi="Times New Roman" w:cs="Times New Roman"/>
                 <w:b w:val="0"/>
                 <w:i w:val="0"/>
-                <w:sz w:val="18"/>
-              </w:rPr>
-            </w:r>
-            <w:r>
-              <w:rPr>
-                <w:rFonts w:ascii="Times New Roman" w:hAnsi="Times New Roman" w:cs="Times New Roman"/>
-                <w:b/>
-                <w:i w:val="0"/>
-                <w:sz w:val="18"/>
+                <w:sz w:val="20"/>
+              </w:rPr>
+            </w:r>
+            <w:r>
+              <w:rPr>
+                <w:rFonts w:ascii="Times New Roman" w:hAnsi="Times New Roman" w:cs="Times New Roman"/>
+                <w:b w:val="0"/>
+                <w:i w:val="0"/>
+                <w:sz w:val="20"/>
               </w:rPr>
               <w:t>Interface</w:t>
             </w:r>
@@ -5196,6 +5309,9 @@
         <w:tc>
           <w:tcPr>
             <w:tcW w:type="dxa" w:w="3969"/>
+            <w:tcBorders>
+              <w:bottom w:val="single" w:sz="4" w:space="0" w:color="000000"/>
+            </w:tcBorders>
           </w:tcPr>
           <w:p>
             <w:pPr>
@@ -5204,7 +5320,7 @@
             <w:r>
               <w:rPr>
                 <w:rFonts w:ascii="Times New Roman" w:hAnsi="Times New Roman" w:cs="Times New Roman"/>
-                <w:sz w:val="18"/>
+                <w:sz w:val="20"/>
                 <w:b w:val="0"/>
                 <w:i w:val="0"/>
               </w:rPr>
@@ -5214,7 +5330,7 @@
               <w:rPr>
                 <w:rFonts w:ascii="Times New Roman" w:hAnsi="Times New Roman" w:cs="Times New Roman"/>
                 <w:vertAlign w:val="subscript"/>
-                <w:sz w:val="18"/>
+                <w:sz w:val="20"/>
                 <w:b w:val="0"/>
                 <w:i w:val="0"/>
               </w:rPr>
@@ -5223,7 +5339,7 @@
             <w:r>
               <w:rPr>
                 <w:rFonts w:ascii="Times New Roman" w:hAnsi="Times New Roman" w:cs="Times New Roman"/>
-                <w:sz w:val="18"/>
+                <w:sz w:val="20"/>
                 <w:b w:val="0"/>
                 <w:i w:val="0"/>
               </w:rPr>
@@ -5529,9 +5645,17 @@
     </w:p>
     <w:tbl>
       <w:tblPr>
-        <w:tblStyle w:val="LightGrid-Accent1"/>
+        <w:tblStyle w:val="TableNormal"/>
         <w:tblLook w:firstColumn="1" w:firstRow="1" w:lastColumn="0" w:lastRow="0" w:noHBand="0" w:noVBand="1" w:val="04A0"/>
         <w:tblW w:type="pct" w:w="5000"/>
+        <w:tblBorders>
+          <w:top w:val="single" w:sz="4" w:space="0" w:color="000000"/>
+          <w:bottom w:val="single" w:sz="4" w:space="0" w:color="000000"/>
+          <w:left w:val="none"/>
+          <w:right w:val="none"/>
+          <w:insideH w:val="none"/>
+          <w:insideV w:val="none"/>
+        </w:tblBorders>
         <w:tblLayout w:type="autofit"/>
       </w:tblPr>
       <w:tblGrid>
@@ -5546,6 +5670,9 @@
         <w:tc>
           <w:tcPr>
             <w:tcW w:type="dxa" w:w="3685"/>
+            <w:tcBorders>
+              <w:bottom w:val="single" w:sz="4" w:space="0" w:color="000000"/>
+            </w:tcBorders>
           </w:tcPr>
           <w:p>
             <w:pPr>
@@ -5556,15 +5683,15 @@
                 <w:rFonts w:ascii="Times New Roman" w:hAnsi="Times New Roman" w:cs="Times New Roman"/>
                 <w:b w:val="0"/>
                 <w:i w:val="0"/>
-                <w:sz w:val="18"/>
-              </w:rPr>
-            </w:r>
-            <w:r>
-              <w:rPr>
-                <w:rFonts w:ascii="Times New Roman" w:hAnsi="Times New Roman" w:cs="Times New Roman"/>
-                <w:b/>
-                <w:i w:val="0"/>
-                <w:sz w:val="18"/>
+                <w:sz w:val="20"/>
+              </w:rPr>
+            </w:r>
+            <w:r>
+              <w:rPr>
+                <w:rFonts w:ascii="Times New Roman" w:hAnsi="Times New Roman" w:cs="Times New Roman"/>
+                <w:b w:val="0"/>
+                <w:i w:val="0"/>
+                <w:sz w:val="20"/>
               </w:rPr>
               <w:t>Parameter</w:t>
             </w:r>
@@ -5573,6 +5700,9 @@
         <w:tc>
           <w:tcPr>
             <w:tcW w:type="dxa" w:w="4535"/>
+            <w:tcBorders>
+              <w:bottom w:val="single" w:sz="4" w:space="0" w:color="000000"/>
+            </w:tcBorders>
           </w:tcPr>
           <w:p>
             <w:pPr>
@@ -5583,15 +5713,15 @@
                 <w:rFonts w:ascii="Times New Roman" w:hAnsi="Times New Roman" w:cs="Times New Roman"/>
                 <w:b w:val="0"/>
                 <w:i w:val="0"/>
-                <w:sz w:val="18"/>
-              </w:rPr>
-            </w:r>
-            <w:r>
-              <w:rPr>
-                <w:rFonts w:ascii="Times New Roman" w:hAnsi="Times New Roman" w:cs="Times New Roman"/>
-                <w:b/>
-                <w:i w:val="0"/>
-                <w:sz w:val="18"/>
+                <w:sz w:val="20"/>
+              </w:rPr>
+            </w:r>
+            <w:r>
+              <w:rPr>
+                <w:rFonts w:ascii="Times New Roman" w:hAnsi="Times New Roman" w:cs="Times New Roman"/>
+                <w:b w:val="0"/>
+                <w:i w:val="0"/>
+                <w:sz w:val="20"/>
               </w:rPr>
               <w:t>Value</w:t>
             </w:r>
@@ -6277,7 +6407,119 @@
           <w:i w:val="0"/>
           <w:sz w:val="24"/>
         </w:rPr>
-        <w:t xml:space="preserve">Performance was evaluated using the four key parameters extracted from the simulated J–V curve: open-circuit voltage (Voc), short-circuit current density (Jsc), fill factor (FF), and power conversion efficiency (PCE), computed as PCE = (Voc × Jsc × FF)/Pin with Pin = 100 mW/cm² under AM 1.5G.</w:t>
+        <w:t xml:space="preserve">Performance was evaluated using the four key parameters extracted from the simulated J–V curve: open-circuit voltage (</w:t>
+      </w:r>
+      <w:r>
+        <w:rPr>
+          <w:rFonts w:ascii="Times New Roman" w:hAnsi="Times New Roman"/>
+          <w:b w:val="0"/>
+          <w:i w:val="0"/>
+          <w:sz w:val="24"/>
+        </w:rPr>
+        <w:t xml:space="preserve">V</w:t>
+      </w:r>
+      <w:r>
+        <w:rPr>
+          <w:rFonts w:ascii="Times New Roman" w:hAnsi="Times New Roman"/>
+          <w:b w:val="0"/>
+          <w:i w:val="0"/>
+          <w:sz w:val="24"/>
+          <w:vertAlign w:val="subscript"/>
+        </w:rPr>
+        <w:t xml:space="preserve">OC</w:t>
+      </w:r>
+      <w:r>
+        <w:rPr>
+          <w:rFonts w:ascii="Times New Roman" w:hAnsi="Times New Roman"/>
+          <w:b w:val="0"/>
+          <w:i w:val="0"/>
+          <w:sz w:val="24"/>
+        </w:rPr>
+        <w:t xml:space="preserve">), short-circuit current density (</w:t>
+      </w:r>
+      <w:r>
+        <w:rPr>
+          <w:rFonts w:ascii="Times New Roman" w:hAnsi="Times New Roman"/>
+          <w:b w:val="0"/>
+          <w:i w:val="0"/>
+          <w:sz w:val="24"/>
+        </w:rPr>
+        <w:t xml:space="preserve">J</w:t>
+      </w:r>
+      <w:r>
+        <w:rPr>
+          <w:rFonts w:ascii="Times New Roman" w:hAnsi="Times New Roman"/>
+          <w:b w:val="0"/>
+          <w:i w:val="0"/>
+          <w:sz w:val="24"/>
+          <w:vertAlign w:val="subscript"/>
+        </w:rPr>
+        <w:t xml:space="preserve">SC</w:t>
+      </w:r>
+      <w:r>
+        <w:rPr>
+          <w:rFonts w:ascii="Times New Roman" w:hAnsi="Times New Roman"/>
+          <w:b w:val="0"/>
+          <w:i w:val="0"/>
+          <w:sz w:val="24"/>
+        </w:rPr>
+        <w:t xml:space="preserve">), fill factor (FF), and power conversion efficiency (PCE), computed as PCE = (</w:t>
+      </w:r>
+      <w:r>
+        <w:rPr>
+          <w:rFonts w:ascii="Times New Roman" w:hAnsi="Times New Roman"/>
+          <w:b w:val="0"/>
+          <w:i w:val="0"/>
+          <w:sz w:val="24"/>
+        </w:rPr>
+        <w:t xml:space="preserve">V</w:t>
+      </w:r>
+      <w:r>
+        <w:rPr>
+          <w:rFonts w:ascii="Times New Roman" w:hAnsi="Times New Roman"/>
+          <w:b w:val="0"/>
+          <w:i w:val="0"/>
+          <w:sz w:val="24"/>
+          <w:vertAlign w:val="subscript"/>
+        </w:rPr>
+        <w:t xml:space="preserve">OC</w:t>
+      </w:r>
+      <w:r>
+        <w:rPr>
+          <w:rFonts w:ascii="Times New Roman" w:hAnsi="Times New Roman"/>
+          <w:b w:val="0"/>
+          <w:i w:val="0"/>
+          <w:sz w:val="24"/>
+        </w:rPr>
+        <w:t xml:space="preserve"> × </w:t>
+      </w:r>
+      <w:r>
+        <w:rPr>
+          <w:rFonts w:ascii="Times New Roman" w:hAnsi="Times New Roman"/>
+          <w:b w:val="0"/>
+          <w:i w:val="0"/>
+          <w:sz w:val="24"/>
+        </w:rPr>
+        <w:t xml:space="preserve">J</w:t>
+      </w:r>
+      <w:r>
+        <w:rPr>
+          <w:rFonts w:ascii="Times New Roman" w:hAnsi="Times New Roman"/>
+          <w:b w:val="0"/>
+          <w:i w:val="0"/>
+          <w:sz w:val="24"/>
+          <w:vertAlign w:val="subscript"/>
+        </w:rPr>
+        <w:t xml:space="preserve">SC</w:t>
+      </w:r>
+      <w:r>
+        <w:rPr>
+          <w:rFonts w:ascii="Times New Roman" w:hAnsi="Times New Roman"/>
+          <w:b w:val="0"/>
+          <w:i w:val="0"/>
+          <w:sz w:val="24"/>
+        </w:rPr>
+        <w:t xml:space="preserve"> × FF)/Pin with Pin = 100 mW/cm² under AM 1.5G.</w:t>
       </w:r>
     </w:p>
     <w:p>
@@ -6564,9 +6806,17 @@
     </w:p>
     <w:tbl>
       <w:tblPr>
-        <w:tblStyle w:val="LightGrid-Accent1"/>
+        <w:tblStyle w:val="TableNormal"/>
         <w:tblLook w:firstColumn="1" w:firstRow="1" w:lastColumn="0" w:lastRow="0" w:noHBand="0" w:noVBand="1" w:val="04A0"/>
         <w:tblW w:type="pct" w:w="5000"/>
+        <w:tblBorders>
+          <w:top w:val="single" w:sz="4" w:space="0" w:color="000000"/>
+          <w:bottom w:val="single" w:sz="4" w:space="0" w:color="000000"/>
+          <w:left w:val="none"/>
+          <w:right w:val="none"/>
+          <w:insideH w:val="none"/>
+          <w:insideV w:val="none"/>
+        </w:tblBorders>
         <w:tblLayout w:type="autofit"/>
       </w:tblPr>
       <w:tblGrid>
@@ -6581,6 +6831,9 @@
         <w:tc>
           <w:tcPr>
             <w:tcW w:type="dxa" w:w="1417"/>
+            <w:tcBorders>
+              <w:bottom w:val="single" w:sz="4" w:space="0" w:color="000000"/>
+            </w:tcBorders>
           </w:tcPr>
           <w:p>
             <w:pPr>
@@ -6591,15 +6844,15 @@
                 <w:rFonts w:ascii="Times New Roman" w:hAnsi="Times New Roman" w:cs="Times New Roman"/>
                 <w:b w:val="0"/>
                 <w:i w:val="0"/>
-                <w:sz w:val="18"/>
-              </w:rPr>
-            </w:r>
-            <w:r>
-              <w:rPr>
-                <w:rFonts w:ascii="Times New Roman" w:hAnsi="Times New Roman" w:cs="Times New Roman"/>
-                <w:b/>
-                <w:i w:val="0"/>
-                <w:sz w:val="18"/>
+                <w:sz w:val="20"/>
+              </w:rPr>
+            </w:r>
+            <w:r>
+              <w:rPr>
+                <w:rFonts w:ascii="Times New Roman" w:hAnsi="Times New Roman" w:cs="Times New Roman"/>
+                <w:b w:val="0"/>
+                <w:i w:val="0"/>
+                <w:sz w:val="20"/>
               </w:rPr>
               <w:t>Device</w:t>
             </w:r>
@@ -6608,6 +6861,9 @@
         <w:tc>
           <w:tcPr>
             <w:tcW w:type="dxa" w:w="6803"/>
+            <w:tcBorders>
+              <w:bottom w:val="single" w:sz="4" w:space="0" w:color="000000"/>
+            </w:tcBorders>
           </w:tcPr>
           <w:p>
             <w:pPr>
@@ -6618,15 +6874,15 @@
                 <w:rFonts w:ascii="Times New Roman" w:hAnsi="Times New Roman" w:cs="Times New Roman"/>
                 <w:b w:val="0"/>
                 <w:i w:val="0"/>
-                <w:sz w:val="18"/>
-              </w:rPr>
-            </w:r>
-            <w:r>
-              <w:rPr>
-                <w:rFonts w:ascii="Times New Roman" w:hAnsi="Times New Roman" w:cs="Times New Roman"/>
-                <w:b/>
-                <w:i w:val="0"/>
-                <w:sz w:val="18"/>
+                <w:sz w:val="20"/>
+              </w:rPr>
+            </w:r>
+            <w:r>
+              <w:rPr>
+                <w:rFonts w:ascii="Times New Roman" w:hAnsi="Times New Roman" w:cs="Times New Roman"/>
+                <w:b w:val="0"/>
+                <w:i w:val="0"/>
+                <w:sz w:val="20"/>
               </w:rPr>
               <w:t>Architecture</w:t>
             </w:r>
@@ -6988,7 +7244,7 @@
           </w:tcPr>
           <w:p>
             <w:pPr>
-              <w:jc w:val="center"/>
+              <w:jc w:val="left"/>
             </w:pPr>
             <w:r>
               <w:rPr>
@@ -7058,7 +7314,7 @@
           </w:tcPr>
           <w:p>
             <w:pPr>
-              <w:jc w:val="center"/>
+              <w:jc w:val="left"/>
             </w:pPr>
             <w:r>
               <w:rPr>
@@ -7147,7 +7403,7 @@
           </w:tcPr>
           <w:p>
             <w:pPr>
-              <w:jc w:val="center"/>
+              <w:jc w:val="left"/>
             </w:pPr>
             <w:r>
               <w:rPr>
@@ -7217,7 +7473,7 @@
           </w:tcPr>
           <w:p>
             <w:pPr>
-              <w:jc w:val="center"/>
+              <w:jc w:val="left"/>
             </w:pPr>
             <w:r>
               <w:rPr>
@@ -7409,9 +7665,17 @@
     </w:p>
     <w:tbl>
       <w:tblPr>
-        <w:tblStyle w:val="LightGrid-Accent1"/>
+        <w:tblStyle w:val="TableNormal"/>
         <w:tblLook w:firstColumn="1" w:firstRow="1" w:lastColumn="0" w:lastRow="0" w:noHBand="0" w:noVBand="1" w:val="04A0"/>
         <w:tblW w:type="pct" w:w="5000"/>
+        <w:tblBorders>
+          <w:top w:val="single" w:sz="4" w:space="0" w:color="000000"/>
+          <w:bottom w:val="single" w:sz="4" w:space="0" w:color="000000"/>
+          <w:left w:val="none"/>
+          <w:right w:val="none"/>
+          <w:insideH w:val="none"/>
+          <w:insideV w:val="none"/>
+        </w:tblBorders>
         <w:tblLayout w:type="autofit"/>
       </w:tblPr>
       <w:tblGrid>
@@ -7430,6 +7694,9 @@
         <w:tc>
           <w:tcPr>
             <w:tcW w:type="dxa" w:w="737"/>
+            <w:tcBorders>
+              <w:bottom w:val="single" w:sz="4" w:space="0" w:color="000000"/>
+            </w:tcBorders>
           </w:tcPr>
           <w:p>
             <w:pPr>
@@ -7440,15 +7707,15 @@
                 <w:rFonts w:ascii="Times New Roman" w:hAnsi="Times New Roman" w:cs="Times New Roman"/>
                 <w:b w:val="0"/>
                 <w:i w:val="0"/>
-                <w:sz w:val="18"/>
-              </w:rPr>
-            </w:r>
-            <w:r>
-              <w:rPr>
-                <w:rFonts w:ascii="Times New Roman" w:hAnsi="Times New Roman" w:cs="Times New Roman"/>
-                <w:b/>
-                <w:i w:val="0"/>
-                <w:sz w:val="18"/>
+                <w:sz w:val="20"/>
+              </w:rPr>
+            </w:r>
+            <w:r>
+              <w:rPr>
+                <w:rFonts w:ascii="Times New Roman" w:hAnsi="Times New Roman" w:cs="Times New Roman"/>
+                <w:b w:val="0"/>
+                <w:i w:val="0"/>
+                <w:sz w:val="20"/>
               </w:rPr>
               <w:t>Dev.</w:t>
             </w:r>
@@ -7457,6 +7724,9 @@
         <w:tc>
           <w:tcPr>
             <w:tcW w:type="dxa" w:w="3118"/>
+            <w:tcBorders>
+              <w:bottom w:val="single" w:sz="4" w:space="0" w:color="000000"/>
+            </w:tcBorders>
           </w:tcPr>
           <w:p>
             <w:pPr>
@@ -7467,15 +7737,15 @@
                 <w:rFonts w:ascii="Times New Roman" w:hAnsi="Times New Roman" w:cs="Times New Roman"/>
                 <w:b w:val="0"/>
                 <w:i w:val="0"/>
-                <w:sz w:val="18"/>
-              </w:rPr>
-            </w:r>
-            <w:r>
-              <w:rPr>
-                <w:rFonts w:ascii="Times New Roman" w:hAnsi="Times New Roman" w:cs="Times New Roman"/>
-                <w:b/>
-                <w:i w:val="0"/>
-                <w:sz w:val="18"/>
+                <w:sz w:val="20"/>
+              </w:rPr>
+            </w:r>
+            <w:r>
+              <w:rPr>
+                <w:rFonts w:ascii="Times New Roman" w:hAnsi="Times New Roman" w:cs="Times New Roman"/>
+                <w:b w:val="0"/>
+                <w:i w:val="0"/>
+                <w:sz w:val="20"/>
               </w:rPr>
               <w:t>Architecture</w:t>
             </w:r>
@@ -7484,6 +7754,9 @@
         <w:tc>
           <w:tcPr>
             <w:tcW w:type="dxa" w:w="964"/>
+            <w:tcBorders>
+              <w:bottom w:val="single" w:sz="4" w:space="0" w:color="000000"/>
+            </w:tcBorders>
           </w:tcPr>
           <w:p>
             <w:pPr>
@@ -7492,7 +7765,7 @@
             <w:r>
               <w:rPr>
                 <w:rFonts w:ascii="Times New Roman" w:hAnsi="Times New Roman" w:cs="Times New Roman"/>
-                <w:sz w:val="18"/>
+                <w:sz w:val="20"/>
                 <w:b w:val="0"/>
                 <w:i w:val="0"/>
               </w:rPr>
@@ -7502,16 +7775,16 @@
               <w:rPr>
                 <w:rFonts w:ascii="Times New Roman" w:hAnsi="Times New Roman" w:cs="Times New Roman"/>
                 <w:vertAlign w:val="subscript"/>
-                <w:sz w:val="18"/>
-                <w:b w:val="0"/>
-                <w:i w:val="0"/>
-              </w:rPr>
-              <w:t>oc</w:t>
-            </w:r>
-            <w:r>
-              <w:rPr>
-                <w:rFonts w:ascii="Times New Roman" w:hAnsi="Times New Roman" w:cs="Times New Roman"/>
-                <w:sz w:val="18"/>
+                <w:sz w:val="20"/>
+                <w:b w:val="0"/>
+                <w:i w:val="0"/>
+              </w:rPr>
+              <w:t>OC</w:t>
+            </w:r>
+            <w:r>
+              <w:rPr>
+                <w:rFonts w:ascii="Times New Roman" w:hAnsi="Times New Roman" w:cs="Times New Roman"/>
+                <w:sz w:val="20"/>
                 <w:b w:val="0"/>
                 <w:i w:val="0"/>
               </w:rPr>
@@ -7522,6 +7795,9 @@
         <w:tc>
           <w:tcPr>
             <w:tcW w:type="dxa" w:w="1417"/>
+            <w:tcBorders>
+              <w:bottom w:val="single" w:sz="4" w:space="0" w:color="000000"/>
+            </w:tcBorders>
           </w:tcPr>
           <w:p>
             <w:pPr>
@@ -7530,7 +7806,7 @@
             <w:r>
               <w:rPr>
                 <w:rFonts w:ascii="Times New Roman" w:hAnsi="Times New Roman" w:cs="Times New Roman"/>
-                <w:sz w:val="18"/>
+                <w:sz w:val="20"/>
                 <w:b w:val="0"/>
                 <w:i w:val="0"/>
               </w:rPr>
@@ -7540,16 +7816,16 @@
               <w:rPr>
                 <w:rFonts w:ascii="Times New Roman" w:hAnsi="Times New Roman" w:cs="Times New Roman"/>
                 <w:vertAlign w:val="subscript"/>
-                <w:sz w:val="18"/>
-                <w:b w:val="0"/>
-                <w:i w:val="0"/>
-              </w:rPr>
-              <w:t>sc</w:t>
-            </w:r>
-            <w:r>
-              <w:rPr>
-                <w:rFonts w:ascii="Times New Roman" w:hAnsi="Times New Roman" w:cs="Times New Roman"/>
-                <w:sz w:val="18"/>
+                <w:sz w:val="20"/>
+                <w:b w:val="0"/>
+                <w:i w:val="0"/>
+              </w:rPr>
+              <w:t>SC</w:t>
+            </w:r>
+            <w:r>
+              <w:rPr>
+                <w:rFonts w:ascii="Times New Roman" w:hAnsi="Times New Roman" w:cs="Times New Roman"/>
+                <w:sz w:val="20"/>
                 <w:b w:val="0"/>
                 <w:i w:val="0"/>
               </w:rPr>
@@ -7560,6 +7836,9 @@
         <w:tc>
           <w:tcPr>
             <w:tcW w:type="dxa" w:w="850"/>
+            <w:tcBorders>
+              <w:bottom w:val="single" w:sz="4" w:space="0" w:color="000000"/>
+            </w:tcBorders>
           </w:tcPr>
           <w:p>
             <w:pPr>
@@ -7570,15 +7849,15 @@
                 <w:rFonts w:ascii="Times New Roman" w:hAnsi="Times New Roman" w:cs="Times New Roman"/>
                 <w:b w:val="0"/>
                 <w:i w:val="0"/>
-                <w:sz w:val="18"/>
-              </w:rPr>
-            </w:r>
-            <w:r>
-              <w:rPr>
-                <w:rFonts w:ascii="Times New Roman" w:hAnsi="Times New Roman" w:cs="Times New Roman"/>
-                <w:b/>
-                <w:i w:val="0"/>
-                <w:sz w:val="18"/>
+                <w:sz w:val="20"/>
+              </w:rPr>
+            </w:r>
+            <w:r>
+              <w:rPr>
+                <w:rFonts w:ascii="Times New Roman" w:hAnsi="Times New Roman" w:cs="Times New Roman"/>
+                <w:b w:val="0"/>
+                <w:i w:val="0"/>
+                <w:sz w:val="20"/>
               </w:rPr>
               <w:t>FF (%)</w:t>
             </w:r>
@@ -7587,6 +7866,9 @@
         <w:tc>
           <w:tcPr>
             <w:tcW w:type="dxa" w:w="850"/>
+            <w:tcBorders>
+              <w:bottom w:val="single" w:sz="4" w:space="0" w:color="000000"/>
+            </w:tcBorders>
           </w:tcPr>
           <w:p>
             <w:pPr>
@@ -7597,15 +7879,15 @@
                 <w:rFonts w:ascii="Times New Roman" w:hAnsi="Times New Roman" w:cs="Times New Roman"/>
                 <w:b w:val="0"/>
                 <w:i w:val="0"/>
-                <w:sz w:val="18"/>
-              </w:rPr>
-            </w:r>
-            <w:r>
-              <w:rPr>
-                <w:rFonts w:ascii="Times New Roman" w:hAnsi="Times New Roman" w:cs="Times New Roman"/>
-                <w:b/>
-                <w:i w:val="0"/>
-                <w:sz w:val="18"/>
+                <w:sz w:val="20"/>
+              </w:rPr>
+            </w:r>
+            <w:r>
+              <w:rPr>
+                <w:rFonts w:ascii="Times New Roman" w:hAnsi="Times New Roman" w:cs="Times New Roman"/>
+                <w:b w:val="0"/>
+                <w:i w:val="0"/>
+                <w:sz w:val="20"/>
               </w:rPr>
               <w:t>PCE (%)</w:t>
             </w:r>
@@ -9113,7 +9395,35 @@
           <w:i w:val="0"/>
           <w:sz w:val="24"/>
         </w:rPr>
-        <w:t xml:space="preserve">Absorber thickness determines how much incident light is captured and how many carriers are generated. Thicker layers absorb more photons and raise Jsc, but beyond a point recombination offsets the gain.</w:t>
+        <w:t xml:space="preserve">Absorber thickness determines how much incident light is captured and how many carriers are generated. Thicker layers absorb more photons and raise </w:t>
+      </w:r>
+      <w:r>
+        <w:rPr>
+          <w:rFonts w:ascii="Times New Roman" w:hAnsi="Times New Roman"/>
+          <w:b w:val="0"/>
+          <w:i w:val="0"/>
+          <w:sz w:val="24"/>
+        </w:rPr>
+        <w:t xml:space="preserve">J</w:t>
+      </w:r>
+      <w:r>
+        <w:rPr>
+          <w:rFonts w:ascii="Times New Roman" w:hAnsi="Times New Roman"/>
+          <w:b w:val="0"/>
+          <w:i w:val="0"/>
+          <w:sz w:val="24"/>
+          <w:vertAlign w:val="subscript"/>
+        </w:rPr>
+        <w:t xml:space="preserve">SC</w:t>
+      </w:r>
+      <w:r>
+        <w:rPr>
+          <w:rFonts w:ascii="Times New Roman" w:hAnsi="Times New Roman"/>
+          <w:b w:val="0"/>
+          <w:i w:val="0"/>
+          <w:sz w:val="24"/>
+        </w:rPr>
+        <w:t xml:space="preserve">, but beyond a point recombination offsets the gain.</w:t>
       </w:r>
     </w:p>
     <w:p>
@@ -9139,7 +9449,7 @@
           <w:sz w:val="24"/>
           <w:vertAlign w:val="subscript"/>
         </w:rPr>
-        <w:t>sc</w:t>
+        <w:t>SC</w:t>
       </w:r>
       <w:r>
         <w:rPr>
@@ -9158,7 +9468,7 @@
           <w:sz w:val="24"/>
           <w:vertAlign w:val="subscript"/>
         </w:rPr>
-        <w:t>oc</w:t>
+        <w:t>OC</w:t>
       </w:r>
       <w:r>
         <w:rPr>
@@ -9234,7 +9544,7 @@
           <w:sz w:val="20"/>
           <w:vertAlign w:val="subscript"/>
         </w:rPr>
-        <w:t>oc</w:t>
+        <w:t>OC</w:t>
       </w:r>
       <w:r>
         <w:rPr>
@@ -9253,7 +9563,7 @@
           <w:sz w:val="20"/>
           <w:vertAlign w:val="subscript"/>
         </w:rPr>
-        <w:t>sc</w:t>
+        <w:t>SC</w:t>
       </w:r>
       <w:r>
         <w:rPr>
@@ -9348,7 +9658,35 @@
           <w:i w:val="0"/>
           <w:sz w:val="24"/>
         </w:rPr>
-        <w:t xml:space="preserve">Above 10¹⁴ cm⁻³, PCE drops from 20.40% to 7.58% as the defect density increases to 10¹⁸ cm⁻³, driven by Voc reduction (0.848 to 0.550 V), while below 10¹⁴ cm⁻³ the device is insensitive. The sweep therefore settles at 10¹⁴ cm⁻³, the bulk defect density commonly assumed for lead-free perovskite absorbers in SCAPS studies.</w:t>
+        <w:t xml:space="preserve">Above 10¹⁴ cm⁻³, PCE drops from 20.40% to 7.58% as the defect density increases to 10¹⁸ cm⁻³, driven by </w:t>
+      </w:r>
+      <w:r>
+        <w:rPr>
+          <w:rFonts w:ascii="Times New Roman" w:hAnsi="Times New Roman"/>
+          <w:b w:val="0"/>
+          <w:i w:val="0"/>
+          <w:sz w:val="24"/>
+        </w:rPr>
+        <w:t xml:space="preserve">V</w:t>
+      </w:r>
+      <w:r>
+        <w:rPr>
+          <w:rFonts w:ascii="Times New Roman" w:hAnsi="Times New Roman"/>
+          <w:b w:val="0"/>
+          <w:i w:val="0"/>
+          <w:sz w:val="24"/>
+          <w:vertAlign w:val="subscript"/>
+        </w:rPr>
+        <w:t xml:space="preserve">OC</w:t>
+      </w:r>
+      <w:r>
+        <w:rPr>
+          <w:rFonts w:ascii="Times New Roman" w:hAnsi="Times New Roman"/>
+          <w:b w:val="0"/>
+          <w:i w:val="0"/>
+          <w:sz w:val="24"/>
+        </w:rPr>
+        <w:t xml:space="preserve"> reduction (0.848 to 0.550 V), while below 10¹⁴ cm⁻³ the device is insensitive. The sweep therefore settles at 10¹⁴ cm⁻³, the bulk defect density commonly assumed for lead-free perovskite absorbers in SCAPS studies.</w:t>
       </w:r>
     </w:p>
     <w:p>
@@ -9415,7 +9753,7 @@
           <w:sz w:val="20"/>
           <w:vertAlign w:val="subscript"/>
         </w:rPr>
-        <w:t>oc</w:t>
+        <w:t>OC</w:t>
       </w:r>
       <w:r>
         <w:rPr>
@@ -9434,7 +9772,7 @@
           <w:sz w:val="20"/>
           <w:vertAlign w:val="subscript"/>
         </w:rPr>
-        <w:t>sc</w:t>
+        <w:t>SC</w:t>
       </w:r>
       <w:r>
         <w:rPr>
@@ -9542,16 +9880,44 @@
           <w:sz w:val="24"/>
           <w:vertAlign w:val="subscript"/>
         </w:rPr>
-        <w:t>oc</w:t>
-      </w:r>
-      <w:r>
-        <w:rPr>
-          <w:rFonts w:ascii="Times New Roman" w:hAnsi="Times New Roman"/>
-          <w:b w:val="0"/>
-          <w:i w:val="0"/>
-          <w:sz w:val="24"/>
-        </w:rPr>
-        <w:t xml:space="preserve"> (0.819 to 0.812 V), while Jsc and FF remained practically unchanged, so the low value of 15 is kept.</w:t>
+        <w:t>OC</w:t>
+      </w:r>
+      <w:r>
+        <w:rPr>
+          <w:rFonts w:ascii="Times New Roman" w:hAnsi="Times New Roman"/>
+          <w:b w:val="0"/>
+          <w:i w:val="0"/>
+          <w:sz w:val="24"/>
+        </w:rPr>
+        <w:t xml:space="preserve"> (0.819 to 0.812 V), while </w:t>
+      </w:r>
+      <w:r>
+        <w:rPr>
+          <w:rFonts w:ascii="Times New Roman" w:hAnsi="Times New Roman"/>
+          <w:b w:val="0"/>
+          <w:i w:val="0"/>
+          <w:sz w:val="24"/>
+        </w:rPr>
+        <w:t xml:space="preserve">J</w:t>
+      </w:r>
+      <w:r>
+        <w:rPr>
+          <w:rFonts w:ascii="Times New Roman" w:hAnsi="Times New Roman"/>
+          <w:b w:val="0"/>
+          <w:i w:val="0"/>
+          <w:sz w:val="24"/>
+          <w:vertAlign w:val="subscript"/>
+        </w:rPr>
+        <w:t xml:space="preserve">SC</w:t>
+      </w:r>
+      <w:r>
+        <w:rPr>
+          <w:rFonts w:ascii="Times New Roman" w:hAnsi="Times New Roman"/>
+          <w:b w:val="0"/>
+          <w:i w:val="0"/>
+          <w:sz w:val="24"/>
+        </w:rPr>
+        <w:t xml:space="preserve"> and FF remained practically unchanged, so the low value of 15 is kept.</w:t>
       </w:r>
       <w:r>
         <w:rPr>
@@ -9628,7 +9994,7 @@
           <w:sz w:val="20"/>
           <w:vertAlign w:val="subscript"/>
         </w:rPr>
-        <w:t>oc</w:t>
+        <w:t>OC</w:t>
       </w:r>
       <w:r>
         <w:rPr>
@@ -9641,7 +10007,7 @@
           <w:sz w:val="20"/>
           <w:vertAlign w:val="subscript"/>
         </w:rPr>
-        <w:t>sc</w:t>
+        <w:t>SC</w:t>
       </w:r>
       <w:r>
         <w:rPr>
@@ -9744,7 +10110,7 @@
           <w:sz w:val="24"/>
           <w:vertAlign w:val="subscript"/>
         </w:rPr>
-        <w:t>oc</w:t>
+        <w:t>OC</w:t>
       </w:r>
       <w:r>
         <w:rPr>
@@ -9763,7 +10129,7 @@
           <w:sz w:val="24"/>
           <w:vertAlign w:val="subscript"/>
         </w:rPr>
-        <w:t>sc</w:t>
+        <w:t>SC</w:t>
       </w:r>
       <w:r>
         <w:rPr>
@@ -9782,7 +10148,7 @@
           <w:sz w:val="24"/>
           <w:vertAlign w:val="subscript"/>
         </w:rPr>
-        <w:t>oc</w:t>
+        <w:t>OC</w:t>
       </w:r>
       <w:r>
         <w:rPr>
@@ -9858,7 +10224,7 @@
           <w:sz w:val="20"/>
           <w:vertAlign w:val="subscript"/>
         </w:rPr>
-        <w:t>oc</w:t>
+        <w:t>OC</w:t>
       </w:r>
       <w:r>
         <w:rPr>
@@ -9877,7 +10243,7 @@
           <w:sz w:val="20"/>
           <w:vertAlign w:val="subscript"/>
         </w:rPr>
-        <w:t>sc</w:t>
+        <w:t>SC</w:t>
       </w:r>
       <w:r>
         <w:rPr>
@@ -10042,7 +10408,7 @@
           <w:sz w:val="24"/>
           <w:vertAlign w:val="subscript"/>
         </w:rPr>
-        <w:t>oc</w:t>
+        <w:t>OC</w:t>
       </w:r>
       <w:r>
         <w:rPr>
@@ -10061,7 +10427,7 @@
           <w:sz w:val="24"/>
           <w:vertAlign w:val="subscript"/>
         </w:rPr>
-        <w:t>sc</w:t>
+        <w:t>SC</w:t>
       </w:r>
       <w:r>
         <w:rPr>
@@ -10086,7 +10452,63 @@
           <w:i w:val="0"/>
           <w:sz w:val="24"/>
         </w:rPr>
-        <w:t xml:space="preserve">The degradation is SRH recombination at the heterojunction: more defect states capture photogenerated carriers before they reach the electrodes, and Voc, Jsc, and FF fall together. Although 10¹² cm⁻² yields the best performance, the final device targets 10¹⁴ cm⁻², a realistic fabrication goal, since achieving interface defect densities below 10¹⁴ cm⁻² consistently in </w:t>
+        <w:t xml:space="preserve">The degradation is SRH recombination at the heterojunction: more defect states capture photogenerated carriers before they reach the electrodes, and </w:t>
+      </w:r>
+      <w:r>
+        <w:rPr>
+          <w:rFonts w:ascii="Times New Roman" w:hAnsi="Times New Roman"/>
+          <w:b w:val="0"/>
+          <w:i w:val="0"/>
+          <w:sz w:val="24"/>
+        </w:rPr>
+        <w:t xml:space="preserve">V</w:t>
+      </w:r>
+      <w:r>
+        <w:rPr>
+          <w:rFonts w:ascii="Times New Roman" w:hAnsi="Times New Roman"/>
+          <w:b w:val="0"/>
+          <w:i w:val="0"/>
+          <w:sz w:val="24"/>
+          <w:vertAlign w:val="subscript"/>
+        </w:rPr>
+        <w:t xml:space="preserve">OC</w:t>
+      </w:r>
+      <w:r>
+        <w:rPr>
+          <w:rFonts w:ascii="Times New Roman" w:hAnsi="Times New Roman"/>
+          <w:b w:val="0"/>
+          <w:i w:val="0"/>
+          <w:sz w:val="24"/>
+        </w:rPr>
+        <w:t xml:space="preserve">, </w:t>
+      </w:r>
+      <w:r>
+        <w:rPr>
+          <w:rFonts w:ascii="Times New Roman" w:hAnsi="Times New Roman"/>
+          <w:b w:val="0"/>
+          <w:i w:val="0"/>
+          <w:sz w:val="24"/>
+        </w:rPr>
+        <w:t xml:space="preserve">J</w:t>
+      </w:r>
+      <w:r>
+        <w:rPr>
+          <w:rFonts w:ascii="Times New Roman" w:hAnsi="Times New Roman"/>
+          <w:b w:val="0"/>
+          <w:i w:val="0"/>
+          <w:sz w:val="24"/>
+          <w:vertAlign w:val="subscript"/>
+        </w:rPr>
+        <w:t xml:space="preserve">SC</w:t>
+      </w:r>
+      <w:r>
+        <w:rPr>
+          <w:rFonts w:ascii="Times New Roman" w:hAnsi="Times New Roman"/>
+          <w:b w:val="0"/>
+          <w:i w:val="0"/>
+          <w:sz w:val="24"/>
+        </w:rPr>
+        <w:t xml:space="preserve">, and FF fall together. Although 10¹² cm⁻² yields the best performance, the final device targets 10¹⁴ cm⁻², a realistic fabrication goal, since achieving interface defect densities below 10¹⁴ cm⁻² consistently in </w:t>
       </w:r>
       <w:r>
         <w:rPr>
@@ -10171,7 +10593,63 @@
           <w:i/>
           <w:sz w:val="20"/>
         </w:rPr>
-        <w:t xml:space="preserve">Fig. 7. Variation of PCE, Voc, Jsc, and FF with </w:t>
+        <w:t xml:space="preserve">Fig. 7. Variation of PCE, </w:t>
+      </w:r>
+      <w:r>
+        <w:rPr>
+          <w:rFonts w:ascii="Times New Roman" w:hAnsi="Times New Roman"/>
+          <w:b w:val="0"/>
+          <w:i/>
+          <w:sz w:val="20"/>
+        </w:rPr>
+        <w:t xml:space="preserve">V</w:t>
+      </w:r>
+      <w:r>
+        <w:rPr>
+          <w:rFonts w:ascii="Times New Roman" w:hAnsi="Times New Roman"/>
+          <w:b w:val="0"/>
+          <w:i/>
+          <w:sz w:val="20"/>
+          <w:vertAlign w:val="subscript"/>
+        </w:rPr>
+        <w:t xml:space="preserve">OC</w:t>
+      </w:r>
+      <w:r>
+        <w:rPr>
+          <w:rFonts w:ascii="Times New Roman" w:hAnsi="Times New Roman"/>
+          <w:b w:val="0"/>
+          <w:i/>
+          <w:sz w:val="20"/>
+        </w:rPr>
+        <w:t xml:space="preserve">, </w:t>
+      </w:r>
+      <w:r>
+        <w:rPr>
+          <w:rFonts w:ascii="Times New Roman" w:hAnsi="Times New Roman"/>
+          <w:b w:val="0"/>
+          <w:i/>
+          <w:sz w:val="20"/>
+        </w:rPr>
+        <w:t xml:space="preserve">J</w:t>
+      </w:r>
+      <w:r>
+        <w:rPr>
+          <w:rFonts w:ascii="Times New Roman" w:hAnsi="Times New Roman"/>
+          <w:b w:val="0"/>
+          <w:i/>
+          <w:sz w:val="20"/>
+          <w:vertAlign w:val="subscript"/>
+        </w:rPr>
+        <w:t xml:space="preserve">SC</w:t>
+      </w:r>
+      <w:r>
+        <w:rPr>
+          <w:rFonts w:ascii="Times New Roman" w:hAnsi="Times New Roman"/>
+          <w:b w:val="0"/>
+          <w:i/>
+          <w:sz w:val="20"/>
+        </w:rPr>
+        <w:t xml:space="preserve">, and FF with </w:t>
       </w:r>
       <w:r>
         <w:rPr>
@@ -10545,7 +11023,7 @@
           <w:sz w:val="20"/>
           <w:vertAlign w:val="subscript"/>
         </w:rPr>
-        <w:t>oc</w:t>
+        <w:t>OC</w:t>
       </w:r>
       <w:r>
         <w:rPr>
@@ -10558,7 +11036,7 @@
           <w:sz w:val="20"/>
           <w:vertAlign w:val="subscript"/>
         </w:rPr>
-        <w:t>sc</w:t>
+        <w:t>SC</w:t>
       </w:r>
       <w:r>
         <w:rPr>
@@ -10689,7 +11167,175 @@
           <w:i w:val="0"/>
           <w:sz w:val="24"/>
         </w:rPr>
-        <w:t xml:space="preserve">The maximum thus sits at 1.4 eV, within 0.06 eV of the Shockley–Queisser (SQ) optimum of ≈1.34 eV for a single junction [35,36,37], so 1.4 eV is kept; tabulated SQ limits imply an ideal Jsc of ≈29.0 mA/cm² and a maximum efficiency of ≈33% at this bandgap [36]. On both sides of the SQ optimum the limiting efficiency declines, steeply for wider bandgaps because fewer photons are absorbed [36,37]: a 2.0 eV absorber would shift its absorption edge to λc ≈ 620 nm and exclude most of the visible spectrum, and our sweep already shows Jsc falling to 20.30 mA/cm² at 1.7 eV, whereas at 1.3 eV the higher Jsc (33.59 mA/cm²) does not offset the Voc loss (0.840 V). The corresponding cutoff wavelength is λc = 1240 / 1.4 ≈ 886 nm, consistent with the absorption edge observed in the quantum-efficiency spectrum of Section V.M. Note that the consolidated final device applies an absorption grading across the absorber layer (absorption cutoff graded from ≈885.7 nm at the front to ≈1033.3 nm at the back in seven linear steps): the electrical bandgap remains 1.4 eV, which sets Voc, while the effective absorption cutoff extends toward 1.2 eV and increases Jsc by ≈3 mA/cm² relative to a uniform 1.4 eV absorption model.</w:t>
+        <w:t xml:space="preserve">The maximum thus sits at 1.4 eV, within 0.06 eV of the Shockley–Queisser (SQ) optimum of ≈1.34 eV for a single junction [35,36,37], so 1.4 eV is kept; tabulated SQ limits imply an ideal </w:t>
+      </w:r>
+      <w:r>
+        <w:rPr>
+          <w:rFonts w:ascii="Times New Roman" w:hAnsi="Times New Roman" w:cs="Times New Roman"/>
+          <w:b w:val="0"/>
+          <w:i w:val="0"/>
+          <w:sz w:val="24"/>
+        </w:rPr>
+        <w:t xml:space="preserve">J</w:t>
+      </w:r>
+      <w:r>
+        <w:rPr>
+          <w:rFonts w:ascii="Times New Roman" w:hAnsi="Times New Roman" w:cs="Times New Roman"/>
+          <w:b w:val="0"/>
+          <w:i w:val="0"/>
+          <w:sz w:val="24"/>
+          <w:vertAlign w:val="subscript"/>
+        </w:rPr>
+        <w:t xml:space="preserve">SC</w:t>
+      </w:r>
+      <w:r>
+        <w:rPr>
+          <w:rFonts w:ascii="Times New Roman" w:hAnsi="Times New Roman" w:cs="Times New Roman"/>
+          <w:b w:val="0"/>
+          <w:i w:val="0"/>
+          <w:sz w:val="24"/>
+        </w:rPr>
+        <w:t xml:space="preserve"> of ≈29.0 mA/cm² and a maximum efficiency of ≈33% at this bandgap [36]. On both sides of the SQ optimum the limiting efficiency declines, steeply for wider bandgaps because fewer photons are absorbed [36,37]: a 2.0 eV absorber would shift its absorption edge to λc ≈ 620 nm and exclude most of the visible spectrum, and our sweep already shows </w:t>
+      </w:r>
+      <w:r>
+        <w:rPr>
+          <w:rFonts w:ascii="Times New Roman" w:hAnsi="Times New Roman" w:cs="Times New Roman"/>
+          <w:b w:val="0"/>
+          <w:i w:val="0"/>
+          <w:sz w:val="24"/>
+        </w:rPr>
+        <w:t xml:space="preserve">J</w:t>
+      </w:r>
+      <w:r>
+        <w:rPr>
+          <w:rFonts w:ascii="Times New Roman" w:hAnsi="Times New Roman" w:cs="Times New Roman"/>
+          <w:b w:val="0"/>
+          <w:i w:val="0"/>
+          <w:sz w:val="24"/>
+          <w:vertAlign w:val="subscript"/>
+        </w:rPr>
+        <w:t xml:space="preserve">SC</w:t>
+      </w:r>
+      <w:r>
+        <w:rPr>
+          <w:rFonts w:ascii="Times New Roman" w:hAnsi="Times New Roman" w:cs="Times New Roman"/>
+          <w:b w:val="0"/>
+          <w:i w:val="0"/>
+          <w:sz w:val="24"/>
+        </w:rPr>
+        <w:t xml:space="preserve"> falling to 20.30 mA/cm² at 1.7 eV, whereas at 1.3 eV the higher </w:t>
+      </w:r>
+      <w:r>
+        <w:rPr>
+          <w:rFonts w:ascii="Times New Roman" w:hAnsi="Times New Roman" w:cs="Times New Roman"/>
+          <w:b w:val="0"/>
+          <w:i w:val="0"/>
+          <w:sz w:val="24"/>
+        </w:rPr>
+        <w:t xml:space="preserve">J</w:t>
+      </w:r>
+      <w:r>
+        <w:rPr>
+          <w:rFonts w:ascii="Times New Roman" w:hAnsi="Times New Roman" w:cs="Times New Roman"/>
+          <w:b w:val="0"/>
+          <w:i w:val="0"/>
+          <w:sz w:val="24"/>
+          <w:vertAlign w:val="subscript"/>
+        </w:rPr>
+        <w:t xml:space="preserve">SC</w:t>
+      </w:r>
+      <w:r>
+        <w:rPr>
+          <w:rFonts w:ascii="Times New Roman" w:hAnsi="Times New Roman" w:cs="Times New Roman"/>
+          <w:b w:val="0"/>
+          <w:i w:val="0"/>
+          <w:sz w:val="24"/>
+        </w:rPr>
+        <w:t xml:space="preserve"> (33.59 mA/cm²) does not offset the </w:t>
+      </w:r>
+      <w:r>
+        <w:rPr>
+          <w:rFonts w:ascii="Times New Roman" w:hAnsi="Times New Roman" w:cs="Times New Roman"/>
+          <w:b w:val="0"/>
+          <w:i w:val="0"/>
+          <w:sz w:val="24"/>
+        </w:rPr>
+        <w:t xml:space="preserve">V</w:t>
+      </w:r>
+      <w:r>
+        <w:rPr>
+          <w:rFonts w:ascii="Times New Roman" w:hAnsi="Times New Roman" w:cs="Times New Roman"/>
+          <w:b w:val="0"/>
+          <w:i w:val="0"/>
+          <w:sz w:val="24"/>
+          <w:vertAlign w:val="subscript"/>
+        </w:rPr>
+        <w:t xml:space="preserve">OC</w:t>
+      </w:r>
+      <w:r>
+        <w:rPr>
+          <w:rFonts w:ascii="Times New Roman" w:hAnsi="Times New Roman" w:cs="Times New Roman"/>
+          <w:b w:val="0"/>
+          <w:i w:val="0"/>
+          <w:sz w:val="24"/>
+        </w:rPr>
+        <w:t xml:space="preserve"> loss (0.840 V). The corresponding cutoff wavelength is λc = 1240 / 1.4 ≈ 886 nm, consistent with the absorption edge observed in the quantum-efficiency spectrum of Section V.M. Note that the consolidated final device applies an absorption grading across the absorber layer (absorption cutoff graded from ≈885.7 nm at the front to ≈1033.3 nm at the back in seven linear steps): the electrical bandgap remains 1.4 eV, which sets </w:t>
+      </w:r>
+      <w:r>
+        <w:rPr>
+          <w:rFonts w:ascii="Times New Roman" w:hAnsi="Times New Roman" w:cs="Times New Roman"/>
+          <w:b w:val="0"/>
+          <w:i w:val="0"/>
+          <w:sz w:val="24"/>
+        </w:rPr>
+        <w:t xml:space="preserve">V</w:t>
+      </w:r>
+      <w:r>
+        <w:rPr>
+          <w:rFonts w:ascii="Times New Roman" w:hAnsi="Times New Roman" w:cs="Times New Roman"/>
+          <w:b w:val="0"/>
+          <w:i w:val="0"/>
+          <w:sz w:val="24"/>
+          <w:vertAlign w:val="subscript"/>
+        </w:rPr>
+        <w:t xml:space="preserve">OC</w:t>
+      </w:r>
+      <w:r>
+        <w:rPr>
+          <w:rFonts w:ascii="Times New Roman" w:hAnsi="Times New Roman" w:cs="Times New Roman"/>
+          <w:b w:val="0"/>
+          <w:i w:val="0"/>
+          <w:sz w:val="24"/>
+        </w:rPr>
+        <w:t xml:space="preserve">, while the effective absorption cutoff extends toward 1.2 eV and increases </w:t>
+      </w:r>
+      <w:r>
+        <w:rPr>
+          <w:rFonts w:ascii="Times New Roman" w:hAnsi="Times New Roman" w:cs="Times New Roman"/>
+          <w:b w:val="0"/>
+          <w:i w:val="0"/>
+          <w:sz w:val="24"/>
+        </w:rPr>
+        <w:t xml:space="preserve">J</w:t>
+      </w:r>
+      <w:r>
+        <w:rPr>
+          <w:rFonts w:ascii="Times New Roman" w:hAnsi="Times New Roman" w:cs="Times New Roman"/>
+          <w:b w:val="0"/>
+          <w:i w:val="0"/>
+          <w:sz w:val="24"/>
+          <w:vertAlign w:val="subscript"/>
+        </w:rPr>
+        <w:t xml:space="preserve">SC</w:t>
+      </w:r>
+      <w:r>
+        <w:rPr>
+          <w:rFonts w:ascii="Times New Roman" w:hAnsi="Times New Roman" w:cs="Times New Roman"/>
+          <w:b w:val="0"/>
+          <w:i w:val="0"/>
+          <w:sz w:val="24"/>
+        </w:rPr>
+        <w:t xml:space="preserve"> by ≈3 mA/cm² relative to a uniform 1.4 eV absorption model.</w:t>
       </w:r>
     </w:p>
     <w:p>
@@ -10756,7 +11402,7 @@
           <w:sz w:val="20"/>
           <w:vertAlign w:val="subscript"/>
         </w:rPr>
-        <w:t>oc</w:t>
+        <w:t>OC</w:t>
       </w:r>
       <w:r>
         <w:rPr>
@@ -10775,7 +11421,7 @@
           <w:sz w:val="20"/>
           <w:vertAlign w:val="subscript"/>
         </w:rPr>
-        <w:t>sc</w:t>
+        <w:t>SC</w:t>
       </w:r>
       <w:r>
         <w:rPr>
@@ -10968,7 +11614,7 @@
           <w:sz w:val="20"/>
           <w:vertAlign w:val="subscript"/>
         </w:rPr>
-        <w:t>oc</w:t>
+        <w:t>OC</w:t>
       </w:r>
       <w:r>
         <w:rPr>
@@ -10987,7 +11633,7 @@
           <w:sz w:val="20"/>
           <w:vertAlign w:val="subscript"/>
         </w:rPr>
-        <w:t>sc</w:t>
+        <w:t>SC</w:t>
       </w:r>
       <w:r>
         <w:rPr>
@@ -11047,7 +11693,63 @@
           <w:i w:val="0"/>
           <w:sz w:val="24"/>
         </w:rPr>
-        <w:t xml:space="preserve">The CuI HTL thickness was swept from 0.1 to 1.9 µm. The effect on device performance was negligible: PCE varied by less than 0.002 percentage points, and Voc, Jsc, and FF were essentially constant. A thickness of 100 nm was selected to minimize material usage. This lies at the lower end of the 0.1–1.0 µm HTL thickness range explored in comparable studies, which likewise reported a weak thickness dependence.</w:t>
+        <w:t xml:space="preserve">The CuI HTL thickness was swept from 0.1 to 1.9 µm. The effect on device performance was negligible: PCE varied by less than 0.002 percentage points, and </w:t>
+      </w:r>
+      <w:r>
+        <w:rPr>
+          <w:rFonts w:ascii="Times New Roman" w:hAnsi="Times New Roman"/>
+          <w:b w:val="0"/>
+          <w:i w:val="0"/>
+          <w:sz w:val="24"/>
+        </w:rPr>
+        <w:t xml:space="preserve">V</w:t>
+      </w:r>
+      <w:r>
+        <w:rPr>
+          <w:rFonts w:ascii="Times New Roman" w:hAnsi="Times New Roman"/>
+          <w:b w:val="0"/>
+          <w:i w:val="0"/>
+          <w:sz w:val="24"/>
+          <w:vertAlign w:val="subscript"/>
+        </w:rPr>
+        <w:t xml:space="preserve">OC</w:t>
+      </w:r>
+      <w:r>
+        <w:rPr>
+          <w:rFonts w:ascii="Times New Roman" w:hAnsi="Times New Roman"/>
+          <w:b w:val="0"/>
+          <w:i w:val="0"/>
+          <w:sz w:val="24"/>
+        </w:rPr>
+        <w:t xml:space="preserve">, </w:t>
+      </w:r>
+      <w:r>
+        <w:rPr>
+          <w:rFonts w:ascii="Times New Roman" w:hAnsi="Times New Roman"/>
+          <w:b w:val="0"/>
+          <w:i w:val="0"/>
+          <w:sz w:val="24"/>
+        </w:rPr>
+        <w:t xml:space="preserve">J</w:t>
+      </w:r>
+      <w:r>
+        <w:rPr>
+          <w:rFonts w:ascii="Times New Roman" w:hAnsi="Times New Roman"/>
+          <w:b w:val="0"/>
+          <w:i w:val="0"/>
+          <w:sz w:val="24"/>
+          <w:vertAlign w:val="subscript"/>
+        </w:rPr>
+        <w:t xml:space="preserve">SC</w:t>
+      </w:r>
+      <w:r>
+        <w:rPr>
+          <w:rFonts w:ascii="Times New Roman" w:hAnsi="Times New Roman"/>
+          <w:b w:val="0"/>
+          <w:i w:val="0"/>
+          <w:sz w:val="24"/>
+        </w:rPr>
+        <w:t xml:space="preserve">, and FF were essentially constant. A thickness of 100 nm was selected to minimize material usage. This lies at the lower end of the 0.1–1.0 µm HTL thickness range explored in comparable studies, which likewise reported a weak thickness dependence.</w:t>
       </w:r>
     </w:p>
     <w:p>
@@ -11107,7 +11809,7 @@
           <w:sz w:val="20"/>
           <w:vertAlign w:val="subscript"/>
         </w:rPr>
-        <w:t>oc</w:t>
+        <w:t>OC</w:t>
       </w:r>
       <w:r>
         <w:rPr>
@@ -11120,7 +11822,7 @@
           <w:sz w:val="20"/>
           <w:vertAlign w:val="subscript"/>
         </w:rPr>
-        <w:t>sc</w:t>
+        <w:t>SC</w:t>
       </w:r>
       <w:r>
         <w:rPr>
@@ -11168,7 +11870,91 @@
           <w:i w:val="0"/>
           <w:sz w:val="24"/>
         </w:rPr>
-        <w:t xml:space="preserve">NC was varied from 1×10¹⁷ to 1×10²⁰ cm⁻³. PCE decreased monotonically from 20.65% to 18.15%, driven by a drop in Voc (0.859 to 0.764 V), while Jsc remained constant at ~30.46 mA/cm². The lowest NC in the sweep, 1×10¹⁷ cm⁻³, is used in the final device. Effective densities of states of ≈10¹⁸ cm⁻³ are commonly assumed for lead-free perovskite absorbers in SCAPS studies; lowering NC reduces the intrinsic carrier density and thereby raises Voc, so the sweep optimum is retained.</w:t>
+        <w:t xml:space="preserve">NC was varied from 1×10¹⁷ to 1×10²⁰ cm⁻³. PCE decreased monotonically from 20.65% to 18.15%, driven by a drop in </w:t>
+      </w:r>
+      <w:r>
+        <w:rPr>
+          <w:rFonts w:ascii="Times New Roman" w:hAnsi="Times New Roman"/>
+          <w:b w:val="0"/>
+          <w:i w:val="0"/>
+          <w:sz w:val="24"/>
+        </w:rPr>
+        <w:t xml:space="preserve">V</w:t>
+      </w:r>
+      <w:r>
+        <w:rPr>
+          <w:rFonts w:ascii="Times New Roman" w:hAnsi="Times New Roman"/>
+          <w:b w:val="0"/>
+          <w:i w:val="0"/>
+          <w:sz w:val="24"/>
+          <w:vertAlign w:val="subscript"/>
+        </w:rPr>
+        <w:t xml:space="preserve">OC</w:t>
+      </w:r>
+      <w:r>
+        <w:rPr>
+          <w:rFonts w:ascii="Times New Roman" w:hAnsi="Times New Roman"/>
+          <w:b w:val="0"/>
+          <w:i w:val="0"/>
+          <w:sz w:val="24"/>
+        </w:rPr>
+        <w:t xml:space="preserve"> (0.859 to 0.764 V), while </w:t>
+      </w:r>
+      <w:r>
+        <w:rPr>
+          <w:rFonts w:ascii="Times New Roman" w:hAnsi="Times New Roman"/>
+          <w:b w:val="0"/>
+          <w:i w:val="0"/>
+          <w:sz w:val="24"/>
+        </w:rPr>
+        <w:t xml:space="preserve">J</w:t>
+      </w:r>
+      <w:r>
+        <w:rPr>
+          <w:rFonts w:ascii="Times New Roman" w:hAnsi="Times New Roman"/>
+          <w:b w:val="0"/>
+          <w:i w:val="0"/>
+          <w:sz w:val="24"/>
+          <w:vertAlign w:val="subscript"/>
+        </w:rPr>
+        <w:t xml:space="preserve">SC</w:t>
+      </w:r>
+      <w:r>
+        <w:rPr>
+          <w:rFonts w:ascii="Times New Roman" w:hAnsi="Times New Roman"/>
+          <w:b w:val="0"/>
+          <w:i w:val="0"/>
+          <w:sz w:val="24"/>
+        </w:rPr>
+        <w:t xml:space="preserve"> remained constant at ~30.46 mA/cm². The lowest NC in the sweep, 1×10¹⁷ cm⁻³, is used in the final device. Effective densities of states of ≈10¹⁸ cm⁻³ are commonly assumed for lead-free perovskite absorbers in SCAPS studies; lowering NC reduces the intrinsic carrier density and thereby raises </w:t>
+      </w:r>
+      <w:r>
+        <w:rPr>
+          <w:rFonts w:ascii="Times New Roman" w:hAnsi="Times New Roman"/>
+          <w:b w:val="0"/>
+          <w:i w:val="0"/>
+          <w:sz w:val="24"/>
+        </w:rPr>
+        <w:t xml:space="preserve">V</w:t>
+      </w:r>
+      <w:r>
+        <w:rPr>
+          <w:rFonts w:ascii="Times New Roman" w:hAnsi="Times New Roman"/>
+          <w:b w:val="0"/>
+          <w:i w:val="0"/>
+          <w:sz w:val="24"/>
+          <w:vertAlign w:val="subscript"/>
+        </w:rPr>
+        <w:t xml:space="preserve">OC</w:t>
+      </w:r>
+      <w:r>
+        <w:rPr>
+          <w:rFonts w:ascii="Times New Roman" w:hAnsi="Times New Roman"/>
+          <w:b w:val="0"/>
+          <w:i w:val="0"/>
+          <w:sz w:val="24"/>
+        </w:rPr>
+        <w:t xml:space="preserve">, so the sweep optimum is retained.</w:t>
       </w:r>
     </w:p>
     <w:p>
@@ -11228,7 +12014,7 @@
           <w:sz w:val="20"/>
           <w:vertAlign w:val="subscript"/>
         </w:rPr>
-        <w:t>oc</w:t>
+        <w:t>OC</w:t>
       </w:r>
       <w:r>
         <w:rPr>
@@ -11241,7 +12027,7 @@
           <w:sz w:val="20"/>
           <w:vertAlign w:val="subscript"/>
         </w:rPr>
-        <w:t>sc</w:t>
+        <w:t>SC</w:t>
       </w:r>
       <w:r>
         <w:rPr>
@@ -11315,7 +12101,63 @@
           <w:i w:val="0"/>
           <w:sz w:val="24"/>
         </w:rPr>
-        <w:t xml:space="preserve">NV was varied from 1×10¹⁷ to 1×10²⁰ cm⁻³. PCE decreased from 23.54% to 18.86% as Voc dropped from 0.945 to 0.780 V, with Jsc unchanged. The effect was stronger than for NC, and the lowest value again performs best. NV = 1×10¹⁷ cm⁻³ is therefore retained.</w:t>
+        <w:t xml:space="preserve">NV was varied from 1×10¹⁷ to 1×10²⁰ cm⁻³. PCE decreased from 23.54% to 18.86% as </w:t>
+      </w:r>
+      <w:r>
+        <w:rPr>
+          <w:rFonts w:ascii="Times New Roman" w:hAnsi="Times New Roman"/>
+          <w:b w:val="0"/>
+          <w:i w:val="0"/>
+          <w:sz w:val="24"/>
+        </w:rPr>
+        <w:t xml:space="preserve">V</w:t>
+      </w:r>
+      <w:r>
+        <w:rPr>
+          <w:rFonts w:ascii="Times New Roman" w:hAnsi="Times New Roman"/>
+          <w:b w:val="0"/>
+          <w:i w:val="0"/>
+          <w:sz w:val="24"/>
+          <w:vertAlign w:val="subscript"/>
+        </w:rPr>
+        <w:t xml:space="preserve">OC</w:t>
+      </w:r>
+      <w:r>
+        <w:rPr>
+          <w:rFonts w:ascii="Times New Roman" w:hAnsi="Times New Roman"/>
+          <w:b w:val="0"/>
+          <w:i w:val="0"/>
+          <w:sz w:val="24"/>
+        </w:rPr>
+        <w:t xml:space="preserve"> dropped from 0.945 to 0.780 V, with </w:t>
+      </w:r>
+      <w:r>
+        <w:rPr>
+          <w:rFonts w:ascii="Times New Roman" w:hAnsi="Times New Roman"/>
+          <w:b w:val="0"/>
+          <w:i w:val="0"/>
+          <w:sz w:val="24"/>
+        </w:rPr>
+        <w:t xml:space="preserve">J</w:t>
+      </w:r>
+      <w:r>
+        <w:rPr>
+          <w:rFonts w:ascii="Times New Roman" w:hAnsi="Times New Roman"/>
+          <w:b w:val="0"/>
+          <w:i w:val="0"/>
+          <w:sz w:val="24"/>
+          <w:vertAlign w:val="subscript"/>
+        </w:rPr>
+        <w:t xml:space="preserve">SC</w:t>
+      </w:r>
+      <w:r>
+        <w:rPr>
+          <w:rFonts w:ascii="Times New Roman" w:hAnsi="Times New Roman"/>
+          <w:b w:val="0"/>
+          <w:i w:val="0"/>
+          <w:sz w:val="24"/>
+        </w:rPr>
+        <w:t xml:space="preserve"> unchanged. The effect was stronger than for NC, and the lowest value again performs best. NV = 1×10¹⁷ cm⁻³ is therefore retained.</w:t>
       </w:r>
     </w:p>
     <w:p>
@@ -11375,7 +12217,7 @@
           <w:sz w:val="20"/>
           <w:vertAlign w:val="subscript"/>
         </w:rPr>
-        <w:t>oc</w:t>
+        <w:t>OC</w:t>
       </w:r>
       <w:r>
         <w:rPr>
@@ -11388,7 +12230,7 @@
           <w:sz w:val="20"/>
           <w:vertAlign w:val="subscript"/>
         </w:rPr>
-        <w:t>sc</w:t>
+        <w:t>SC</w:t>
       </w:r>
       <w:r>
         <w:rPr>
@@ -12181,7 +13023,35 @@
           <w:i w:val="0"/>
           <w:sz w:val="24"/>
         </w:rPr>
-        <w:t xml:space="preserve"> layer. Under illumination, the quasi-Fermi levels split apart across the device, with the electron quasi-Fermi level Fn lying close to the conduction band in the absorber and ETL and the hole quasi-Fermi level Fp following the valence band. The Fn − Fp splitting sets the photovoltage (Voc ≈ 1.12 V) and is consistent with the high open-circuit voltage of the optimized device. Slight band bending near both heterojunctions reflects the built-in electric field established after contact formation, which drives photogenerated electrons toward the </w:t>
+        <w:t xml:space="preserve"> layer. Under illumination, the quasi-Fermi levels split apart across the device, with the electron quasi-Fermi level Fn lying close to the conduction band in the absorber and ETL and the hole quasi-Fermi level Fp following the valence band. The Fn − Fp splitting sets the photovoltage (</w:t>
+      </w:r>
+      <w:r>
+        <w:rPr>
+          <w:rFonts w:ascii="Times New Roman" w:hAnsi="Times New Roman"/>
+          <w:b w:val="0"/>
+          <w:i w:val="0"/>
+          <w:sz w:val="24"/>
+        </w:rPr>
+        <w:t xml:space="preserve">V</w:t>
+      </w:r>
+      <w:r>
+        <w:rPr>
+          <w:rFonts w:ascii="Times New Roman" w:hAnsi="Times New Roman"/>
+          <w:b w:val="0"/>
+          <w:i w:val="0"/>
+          <w:sz w:val="24"/>
+          <w:vertAlign w:val="subscript"/>
+        </w:rPr>
+        <w:t xml:space="preserve">OC</w:t>
+      </w:r>
+      <w:r>
+        <w:rPr>
+          <w:rFonts w:ascii="Times New Roman" w:hAnsi="Times New Roman"/>
+          <w:b w:val="0"/>
+          <w:i w:val="0"/>
+          <w:sz w:val="24"/>
+        </w:rPr>
+        <w:t xml:space="preserve"> ≈ 1.12 V) and is consistent with the high open-circuit voltage of the optimized device. Slight band bending near both heterojunctions reflects the built-in electric field established after contact formation, which drives photogenerated electrons toward the </w:t>
       </w:r>
       <w:r>
         <w:rPr>
@@ -12482,7 +13352,7 @@
         <w:rPr>
           <w:vertAlign w:val="subscript"/>
         </w:rPr>
-        <w:t>oc</w:t>
+        <w:t>OC</w:t>
       </w:r>
       <w:r>
         <w:rPr/>
@@ -12492,7 +13362,7 @@
         <w:rPr>
           <w:vertAlign w:val="subscript"/>
         </w:rPr>
-        <w:t>sc</w:t>
+        <w:t>SC</w:t>
       </w:r>
       <w:r>
         <w:rPr/>
@@ -12655,7 +13525,7 @@
           <w:sz w:val="24"/>
           <w:vertAlign w:val="subscript"/>
         </w:rPr>
-        <w:t>oc</w:t>
+        <w:t>OC</w:t>
       </w:r>
       <w:r>
         <w:rPr>
@@ -12674,7 +13544,7 @@
           <w:sz w:val="24"/>
           <w:vertAlign w:val="subscript"/>
         </w:rPr>
-        <w:t>sc</w:t>
+        <w:t>SC</w:t>
       </w:r>
       <w:r>
         <w:rPr>
@@ -12742,9 +13612,17 @@
     </w:p>
     <w:tbl>
       <w:tblPr>
-        <w:tblStyle w:val="LightGrid-Accent1"/>
+        <w:tblStyle w:val="TableNormal"/>
         <w:tblLook w:firstColumn="1" w:firstRow="1" w:lastColumn="0" w:lastRow="0" w:noHBand="0" w:noVBand="1" w:val="04A0"/>
         <w:tblW w:type="pct" w:w="5000"/>
+        <w:tblBorders>
+          <w:top w:val="single" w:sz="4" w:space="0" w:color="000000"/>
+          <w:bottom w:val="single" w:sz="4" w:space="0" w:color="000000"/>
+          <w:left w:val="none"/>
+          <w:right w:val="none"/>
+          <w:insideH w:val="none"/>
+          <w:insideV w:val="none"/>
+        </w:tblBorders>
         <w:tblLayout w:type="autofit"/>
       </w:tblPr>
       <w:tblGrid>
@@ -12762,6 +13640,9 @@
         <w:tc>
           <w:tcPr>
             <w:tcW w:type="dxa" w:w="3118"/>
+            <w:tcBorders>
+              <w:bottom w:val="single" w:sz="4" w:space="0" w:color="000000"/>
+            </w:tcBorders>
           </w:tcPr>
           <w:p>
             <w:pPr>
@@ -12772,15 +13653,15 @@
                 <w:rFonts w:ascii="Times New Roman" w:hAnsi="Times New Roman" w:cs="Times New Roman"/>
                 <w:b w:val="0"/>
                 <w:i w:val="0"/>
-                <w:sz w:val="18"/>
-              </w:rPr>
-            </w:r>
-            <w:r>
-              <w:rPr>
-                <w:rFonts w:ascii="Times New Roman" w:hAnsi="Times New Roman" w:cs="Times New Roman"/>
-                <w:b/>
-                <w:i w:val="0"/>
-                <w:sz w:val="18"/>
+                <w:sz w:val="20"/>
+              </w:rPr>
+            </w:r>
+            <w:r>
+              <w:rPr>
+                <w:rFonts w:ascii="Times New Roman" w:hAnsi="Times New Roman" w:cs="Times New Roman"/>
+                <w:b w:val="0"/>
+                <w:i w:val="0"/>
+                <w:sz w:val="20"/>
               </w:rPr>
               <w:t>Parameter</w:t>
             </w:r>
@@ -12789,6 +13670,9 @@
         <w:tc>
           <w:tcPr>
             <w:tcW w:type="dxa" w:w="1361"/>
+            <w:tcBorders>
+              <w:bottom w:val="single" w:sz="4" w:space="0" w:color="000000"/>
+            </w:tcBorders>
           </w:tcPr>
           <w:p>
             <w:pPr>
@@ -12797,7 +13681,7 @@
             <w:r>
               <w:rPr>
                 <w:rFonts w:ascii="Times New Roman" w:hAnsi="Times New Roman" w:cs="Times New Roman"/>
-                <w:sz w:val="18"/>
+                <w:sz w:val="20"/>
                 <w:b w:val="0"/>
                 <w:i w:val="0"/>
               </w:rPr>
@@ -12807,7 +13691,7 @@
               <w:rPr>
                 <w:rFonts w:ascii="Times New Roman" w:hAnsi="Times New Roman" w:cs="Times New Roman"/>
                 <w:vertAlign w:val="subscript"/>
-                <w:sz w:val="18"/>
+                <w:sz w:val="20"/>
                 <w:b w:val="0"/>
                 <w:i w:val="0"/>
               </w:rPr>
@@ -12818,6 +13702,9 @@
         <w:tc>
           <w:tcPr>
             <w:tcW w:type="dxa" w:w="1361"/>
+            <w:tcBorders>
+              <w:bottom w:val="single" w:sz="4" w:space="0" w:color="000000"/>
+            </w:tcBorders>
           </w:tcPr>
           <w:p>
             <w:pPr>
@@ -12828,15 +13715,15 @@
                 <w:rFonts w:ascii="Times New Roman" w:hAnsi="Times New Roman" w:cs="Times New Roman"/>
                 <w:b w:val="0"/>
                 <w:i w:val="0"/>
-                <w:sz w:val="18"/>
-              </w:rPr>
-            </w:r>
-            <w:r>
-              <w:rPr>
-                <w:rFonts w:ascii="Times New Roman" w:hAnsi="Times New Roman" w:cs="Times New Roman"/>
-                <w:b/>
-                <w:i w:val="0"/>
-                <w:sz w:val="18"/>
+                <w:sz w:val="20"/>
+              </w:rPr>
+            </w:r>
+            <w:r>
+              <w:rPr>
+                <w:rFonts w:ascii="Times New Roman" w:hAnsi="Times New Roman" w:cs="Times New Roman"/>
+                <w:b w:val="0"/>
+                <w:i w:val="0"/>
+                <w:sz w:val="20"/>
               </w:rPr>
               <w:t>FTO</w:t>
             </w:r>
@@ -12845,6 +13732,9 @@
         <w:tc>
           <w:tcPr>
             <w:tcW w:type="dxa" w:w="1361"/>
+            <w:tcBorders>
+              <w:bottom w:val="single" w:sz="4" w:space="0" w:color="000000"/>
+            </w:tcBorders>
           </w:tcPr>
           <w:p>
             <w:pPr>
@@ -12853,7 +13743,7 @@
             <w:r>
               <w:rPr>
                 <w:rFonts w:ascii="Times New Roman" w:hAnsi="Times New Roman" w:cs="Times New Roman"/>
-                <w:sz w:val="18"/>
+                <w:sz w:val="20"/>
                 <w:b w:val="0"/>
                 <w:i w:val="0"/>
               </w:rPr>
@@ -12863,7 +13753,7 @@
               <w:rPr>
                 <w:rFonts w:ascii="Times New Roman" w:hAnsi="Times New Roman" w:cs="Times New Roman"/>
                 <w:vertAlign w:val="subscript"/>
-                <w:sz w:val="18"/>
+                <w:sz w:val="20"/>
                 <w:b w:val="0"/>
                 <w:i w:val="0"/>
               </w:rPr>
@@ -12874,6 +13764,9 @@
         <w:tc>
           <w:tcPr>
             <w:tcW w:type="dxa" w:w="1361"/>
+            <w:tcBorders>
+              <w:bottom w:val="single" w:sz="4" w:space="0" w:color="000000"/>
+            </w:tcBorders>
           </w:tcPr>
           <w:p>
             <w:pPr>
@@ -12884,15 +13777,15 @@
                 <w:rFonts w:ascii="Times New Roman" w:hAnsi="Times New Roman" w:cs="Times New Roman"/>
                 <w:b w:val="0"/>
                 <w:i w:val="0"/>
-                <w:sz w:val="18"/>
-              </w:rPr>
-            </w:r>
-            <w:r>
-              <w:rPr>
-                <w:rFonts w:ascii="Times New Roman" w:hAnsi="Times New Roman" w:cs="Times New Roman"/>
-                <w:b/>
-                <w:i w:val="0"/>
-                <w:sz w:val="18"/>
+                <w:sz w:val="20"/>
+              </w:rPr>
+            </w:r>
+            <w:r>
+              <w:rPr>
+                <w:rFonts w:ascii="Times New Roman" w:hAnsi="Times New Roman" w:cs="Times New Roman"/>
+                <w:b w:val="0"/>
+                <w:i w:val="0"/>
+                <w:sz w:val="20"/>
               </w:rPr>
               <w:t>CuI</w:t>
             </w:r>
@@ -14728,7 +15621,7 @@
           <w:sz w:val="20"/>
           <w:vertAlign w:val="subscript"/>
         </w:rPr>
-        <w:t>oc</w:t>
+        <w:t>OC</w:t>
       </w:r>
       <w:r>
         <w:rPr>
@@ -14745,7 +15638,7 @@
           <w:sz w:val="20"/>
           <w:vertAlign w:val="subscript"/>
         </w:rPr>
-        <w:t>sc</w:t>
+        <w:t>SC</w:t>
       </w:r>
       <w:r>
         <w:rPr>
@@ -14765,7 +15658,29 @@
           <w:rFonts w:ascii="Times New Roman" w:hAnsi="Times New Roman"/>
           <w:sz w:val="22"/>
         </w:rPr>
-        <w:t xml:space="preserve">Mean PCE = 25.92 ± 1.78 % (median 25.85 %), with 5th/95th percentiles 23.38 % / 28.81 %. Mean Voc = 1.087 ± 0.021 V. The UQ gives a 5th-to-95th percentile window of 23.38–28.81 %.</w:t>
+        <w:t xml:space="preserve">Mean PCE = 25.92 ± 1.78 % (median 25.85 %), with 5th/95th percentiles 23.38 % / 28.81 %. Mean </w:t>
+      </w:r>
+      <w:r>
+        <w:rPr>
+          <w:rFonts w:ascii="Times New Roman" w:hAnsi="Times New Roman"/>
+          <w:sz w:val="22"/>
+        </w:rPr>
+        <w:t xml:space="preserve">V</w:t>
+      </w:r>
+      <w:r>
+        <w:rPr>
+          <w:rFonts w:ascii="Times New Roman" w:hAnsi="Times New Roman"/>
+          <w:sz w:val="22"/>
+          <w:vertAlign w:val="subscript"/>
+        </w:rPr>
+        <w:t xml:space="preserve">OC</w:t>
+      </w:r>
+      <w:r>
+        <w:rPr>
+          <w:rFonts w:ascii="Times New Roman" w:hAnsi="Times New Roman"/>
+          <w:sz w:val="22"/>
+        </w:rPr>
+        <w:t xml:space="preserve"> = 1.087 ± 0.021 V. The UQ gives a 5th-to-95th percentile window of 23.38–28.81 %.</w:t>
       </w:r>
     </w:p>
     <w:p>
@@ -14785,7 +15700,7 @@
         <w:rPr>
           <w:vertAlign w:val="subscript"/>
         </w:rPr>
-        <w:t>sc</w:t>
+        <w:t>SC</w:t>
       </w:r>
       <w:r>
         <w:rPr/>
@@ -14795,7 +15710,7 @@
         <w:rPr>
           <w:vertAlign w:val="subscript"/>
         </w:rPr>
-        <w:t>oc</w:t>
+        <w:t>OC</w:t>
       </w:r>
       <w:r>
         <w:rPr/>
@@ -14805,7 +15720,7 @@
         <w:rPr>
           <w:vertAlign w:val="subscript"/>
         </w:rPr>
-        <w:t>oc</w:t>
+        <w:t>OC</w:t>
       </w:r>
       <w:r>
         <w:rPr/>
@@ -15023,7 +15938,7 @@
           <w:sz w:val="22"/>
           <w:vertAlign w:val="subscript"/>
         </w:rPr>
-        <w:t>oc</w:t>
+        <w:t>OC</w:t>
       </w:r>
       <w:r>
         <w:rPr>
@@ -15038,7 +15953,7 @@
           <w:sz w:val="22"/>
           <w:vertAlign w:val="subscript"/>
         </w:rPr>
-        <w:t>sc</w:t>
+        <w:t>SC</w:t>
       </w:r>
       <w:r>
         <w:rPr>
@@ -15167,7 +16082,35 @@
           <w:i w:val="0"/>
           <w:sz w:val="24"/>
         </w:rPr>
-        <w:t xml:space="preserve">-based and related lead-free Ge/Sn-based perovskite solar cells. The proposed device delivers the highest Voc (1.12 V) among the </w:t>
+        <w:t xml:space="preserve">-based and related lead-free Ge/Sn-based perovskite solar cells. The proposed device delivers the highest </w:t>
+      </w:r>
+      <w:r>
+        <w:rPr>
+          <w:rFonts w:ascii="Times New Roman" w:hAnsi="Times New Roman"/>
+          <w:b w:val="0"/>
+          <w:i w:val="0"/>
+          <w:sz w:val="24"/>
+        </w:rPr>
+        <w:t xml:space="preserve">V</w:t>
+      </w:r>
+      <w:r>
+        <w:rPr>
+          <w:rFonts w:ascii="Times New Roman" w:hAnsi="Times New Roman"/>
+          <w:b w:val="0"/>
+          <w:i w:val="0"/>
+          <w:sz w:val="24"/>
+          <w:vertAlign w:val="subscript"/>
+        </w:rPr>
+        <w:t xml:space="preserve">OC</w:t>
+      </w:r>
+      <w:r>
+        <w:rPr>
+          <w:rFonts w:ascii="Times New Roman" w:hAnsi="Times New Roman"/>
+          <w:b w:val="0"/>
+          <w:i w:val="0"/>
+          <w:sz w:val="24"/>
+        </w:rPr>
+        <w:t xml:space="preserve"> (1.12 V) among the </w:t>
       </w:r>
       <w:r>
         <w:rPr>
@@ -15267,7 +16210,63 @@
           <w:i w:val="0"/>
           <w:sz w:val="24"/>
         </w:rPr>
-        <w:t xml:space="preserve">All comparator values in Table VIII were cross-checked against the primary sources; where an entry was internally inconsistent, the efficiency consistent with its reported Voc, Jsc, and FF was adopted. All entries are SCAPS-1D simulation studies, including the Pindolia et al. entry (not an experimental study, despite occasional mischaracterization); the Loumachi et al. device string is ITO/C60/</w:t>
+        <w:t xml:space="preserve">All comparator values in Table VIII were cross-checked against the primary sources; where an entry was internally inconsistent, the efficiency consistent with its reported </w:t>
+      </w:r>
+      <w:r>
+        <w:rPr>
+          <w:rFonts w:ascii="Times New Roman" w:hAnsi="Times New Roman"/>
+          <w:b w:val="0"/>
+          <w:i w:val="0"/>
+          <w:sz w:val="24"/>
+        </w:rPr>
+        <w:t xml:space="preserve">V</w:t>
+      </w:r>
+      <w:r>
+        <w:rPr>
+          <w:rFonts w:ascii="Times New Roman" w:hAnsi="Times New Roman"/>
+          <w:b w:val="0"/>
+          <w:i w:val="0"/>
+          <w:sz w:val="24"/>
+          <w:vertAlign w:val="subscript"/>
+        </w:rPr>
+        <w:t xml:space="preserve">OC</w:t>
+      </w:r>
+      <w:r>
+        <w:rPr>
+          <w:rFonts w:ascii="Times New Roman" w:hAnsi="Times New Roman"/>
+          <w:b w:val="0"/>
+          <w:i w:val="0"/>
+          <w:sz w:val="24"/>
+        </w:rPr>
+        <w:t xml:space="preserve">, </w:t>
+      </w:r>
+      <w:r>
+        <w:rPr>
+          <w:rFonts w:ascii="Times New Roman" w:hAnsi="Times New Roman"/>
+          <w:b w:val="0"/>
+          <w:i w:val="0"/>
+          <w:sz w:val="24"/>
+        </w:rPr>
+        <w:t xml:space="preserve">J</w:t>
+      </w:r>
+      <w:r>
+        <w:rPr>
+          <w:rFonts w:ascii="Times New Roman" w:hAnsi="Times New Roman"/>
+          <w:b w:val="0"/>
+          <w:i w:val="0"/>
+          <w:sz w:val="24"/>
+          <w:vertAlign w:val="subscript"/>
+        </w:rPr>
+        <w:t xml:space="preserve">SC</w:t>
+      </w:r>
+      <w:r>
+        <w:rPr>
+          <w:rFonts w:ascii="Times New Roman" w:hAnsi="Times New Roman"/>
+          <w:b w:val="0"/>
+          <w:i w:val="0"/>
+          <w:sz w:val="24"/>
+        </w:rPr>
+        <w:t xml:space="preserve">, and FF was adopted. All entries are SCAPS-1D simulation studies, including the Pindolia et al. entry (not an experimental study, despite occasional mischaracterization); the Loumachi et al. device string is ITO/C60/</w:t>
       </w:r>
       <w:r>
         <w:rPr>
@@ -15316,9 +16315,17 @@
     </w:p>
     <w:tbl>
       <w:tblPr>
-        <w:tblStyle w:val="LightGrid-Accent1"/>
+        <w:tblStyle w:val="TableNormal"/>
         <w:tblLook w:firstColumn="1" w:firstRow="1" w:lastColumn="0" w:lastRow="0" w:noHBand="0" w:noVBand="1" w:val="04A0"/>
         <w:tblW w:type="pct" w:w="5000"/>
+        <w:tblBorders>
+          <w:top w:val="single" w:sz="4" w:space="0" w:color="000000"/>
+          <w:bottom w:val="single" w:sz="4" w:space="0" w:color="000000"/>
+          <w:left w:val="none"/>
+          <w:right w:val="none"/>
+          <w:insideH w:val="none"/>
+          <w:insideV w:val="none"/>
+        </w:tblBorders>
         <w:tblLayout w:type="autofit"/>
       </w:tblPr>
       <w:tblGrid>
@@ -15338,6 +16345,9 @@
         <w:tc>
           <w:tcPr>
             <w:tcW w:type="dxa" w:w="3118"/>
+            <w:tcBorders>
+              <w:bottom w:val="single" w:sz="4" w:space="0" w:color="000000"/>
+            </w:tcBorders>
           </w:tcPr>
           <w:p>
             <w:pPr>
@@ -15348,15 +16358,15 @@
                 <w:rFonts w:ascii="Times New Roman" w:hAnsi="Times New Roman" w:cs="Times New Roman"/>
                 <w:b w:val="0"/>
                 <w:i w:val="0"/>
-                <w:sz w:val="18"/>
-              </w:rPr>
-            </w:r>
-            <w:r>
-              <w:rPr>
-                <w:rFonts w:ascii="Times New Roman" w:hAnsi="Times New Roman" w:cs="Times New Roman"/>
-                <w:b/>
-                <w:i w:val="0"/>
-                <w:sz w:val="18"/>
+                <w:sz w:val="20"/>
+              </w:rPr>
+            </w:r>
+            <w:r>
+              <w:rPr>
+                <w:rFonts w:ascii="Times New Roman" w:hAnsi="Times New Roman" w:cs="Times New Roman"/>
+                <w:b w:val="0"/>
+                <w:i w:val="0"/>
+                <w:sz w:val="20"/>
               </w:rPr>
               <w:t>Device Structure</w:t>
             </w:r>
@@ -15365,6 +16375,9 @@
         <w:tc>
           <w:tcPr>
             <w:tcW w:type="dxa" w:w="964"/>
+            <w:tcBorders>
+              <w:bottom w:val="single" w:sz="4" w:space="0" w:color="000000"/>
+            </w:tcBorders>
           </w:tcPr>
           <w:p>
             <w:pPr>
@@ -15373,7 +16386,7 @@
             <w:r>
               <w:rPr>
                 <w:rFonts w:ascii="Times New Roman" w:hAnsi="Times New Roman" w:cs="Times New Roman"/>
-                <w:sz w:val="18"/>
+                <w:sz w:val="20"/>
                 <w:b w:val="0"/>
                 <w:i w:val="0"/>
               </w:rPr>
@@ -15383,16 +16396,16 @@
               <w:rPr>
                 <w:rFonts w:ascii="Times New Roman" w:hAnsi="Times New Roman" w:cs="Times New Roman"/>
                 <w:vertAlign w:val="subscript"/>
-                <w:sz w:val="18"/>
-                <w:b w:val="0"/>
-                <w:i w:val="0"/>
-              </w:rPr>
-              <w:t>oc</w:t>
-            </w:r>
-            <w:r>
-              <w:rPr>
-                <w:rFonts w:ascii="Times New Roman" w:hAnsi="Times New Roman" w:cs="Times New Roman"/>
-                <w:sz w:val="18"/>
+                <w:sz w:val="20"/>
+                <w:b w:val="0"/>
+                <w:i w:val="0"/>
+              </w:rPr>
+              <w:t>OC</w:t>
+            </w:r>
+            <w:r>
+              <w:rPr>
+                <w:rFonts w:ascii="Times New Roman" w:hAnsi="Times New Roman" w:cs="Times New Roman"/>
+                <w:sz w:val="20"/>
                 <w:b w:val="0"/>
                 <w:i w:val="0"/>
               </w:rPr>
@@ -15403,6 +16416,9 @@
         <w:tc>
           <w:tcPr>
             <w:tcW w:type="dxa" w:w="1134"/>
+            <w:tcBorders>
+              <w:bottom w:val="single" w:sz="4" w:space="0" w:color="000000"/>
+            </w:tcBorders>
           </w:tcPr>
           <w:p>
             <w:pPr>
@@ -15411,7 +16427,7 @@
             <w:r>
               <w:rPr>
                 <w:rFonts w:ascii="Times New Roman" w:hAnsi="Times New Roman" w:cs="Times New Roman"/>
-                <w:sz w:val="18"/>
+                <w:sz w:val="20"/>
                 <w:b w:val="0"/>
                 <w:i w:val="0"/>
               </w:rPr>
@@ -15421,16 +16437,16 @@
               <w:rPr>
                 <w:rFonts w:ascii="Times New Roman" w:hAnsi="Times New Roman" w:cs="Times New Roman"/>
                 <w:vertAlign w:val="subscript"/>
-                <w:sz w:val="18"/>
-                <w:b w:val="0"/>
-                <w:i w:val="0"/>
-              </w:rPr>
-              <w:t>sc</w:t>
-            </w:r>
-            <w:r>
-              <w:rPr>
-                <w:rFonts w:ascii="Times New Roman" w:hAnsi="Times New Roman" w:cs="Times New Roman"/>
-                <w:sz w:val="18"/>
+                <w:sz w:val="20"/>
+                <w:b w:val="0"/>
+                <w:i w:val="0"/>
+              </w:rPr>
+              <w:t>SC</w:t>
+            </w:r>
+            <w:r>
+              <w:rPr>
+                <w:rFonts w:ascii="Times New Roman" w:hAnsi="Times New Roman" w:cs="Times New Roman"/>
+                <w:sz w:val="20"/>
                 <w:b w:val="0"/>
                 <w:i w:val="0"/>
               </w:rPr>
@@ -15441,6 +16457,9 @@
         <w:tc>
           <w:tcPr>
             <w:tcW w:type="dxa" w:w="794"/>
+            <w:tcBorders>
+              <w:bottom w:val="single" w:sz="4" w:space="0" w:color="000000"/>
+            </w:tcBorders>
           </w:tcPr>
           <w:p>
             <w:pPr>
@@ -15451,15 +16470,15 @@
                 <w:rFonts w:ascii="Times New Roman" w:hAnsi="Times New Roman" w:cs="Times New Roman"/>
                 <w:b w:val="0"/>
                 <w:i w:val="0"/>
-                <w:sz w:val="18"/>
-              </w:rPr>
-            </w:r>
-            <w:r>
-              <w:rPr>
-                <w:rFonts w:ascii="Times New Roman" w:hAnsi="Times New Roman" w:cs="Times New Roman"/>
-                <w:b/>
-                <w:i w:val="0"/>
-                <w:sz w:val="18"/>
+                <w:sz w:val="20"/>
+              </w:rPr>
+            </w:r>
+            <w:r>
+              <w:rPr>
+                <w:rFonts w:ascii="Times New Roman" w:hAnsi="Times New Roman" w:cs="Times New Roman"/>
+                <w:b w:val="0"/>
+                <w:i w:val="0"/>
+                <w:sz w:val="20"/>
               </w:rPr>
               <w:t>FF (%)</w:t>
             </w:r>
@@ -15468,6 +16487,9 @@
         <w:tc>
           <w:tcPr>
             <w:tcW w:type="dxa" w:w="794"/>
+            <w:tcBorders>
+              <w:bottom w:val="single" w:sz="4" w:space="0" w:color="000000"/>
+            </w:tcBorders>
           </w:tcPr>
           <w:p>
             <w:pPr>
@@ -15478,15 +16500,15 @@
                 <w:rFonts w:ascii="Times New Roman" w:hAnsi="Times New Roman" w:cs="Times New Roman"/>
                 <w:b w:val="0"/>
                 <w:i w:val="0"/>
-                <w:sz w:val="18"/>
-              </w:rPr>
-            </w:r>
-            <w:r>
-              <w:rPr>
-                <w:rFonts w:ascii="Times New Roman" w:hAnsi="Times New Roman" w:cs="Times New Roman"/>
-                <w:b/>
-                <w:i w:val="0"/>
-                <w:sz w:val="18"/>
+                <w:sz w:val="20"/>
+              </w:rPr>
+            </w:r>
+            <w:r>
+              <w:rPr>
+                <w:rFonts w:ascii="Times New Roman" w:hAnsi="Times New Roman" w:cs="Times New Roman"/>
+                <w:b w:val="0"/>
+                <w:i w:val="0"/>
+                <w:sz w:val="20"/>
               </w:rPr>
               <w:t>PCE (%)</w:t>
             </w:r>
@@ -15495,6 +16517,9 @@
         <w:tc>
           <w:tcPr>
             <w:tcW w:type="dxa" w:w="1134"/>
+            <w:tcBorders>
+              <w:bottom w:val="single" w:sz="4" w:space="0" w:color="000000"/>
+            </w:tcBorders>
           </w:tcPr>
           <w:p>
             <w:pPr>
@@ -15505,15 +16530,15 @@
                 <w:rFonts w:ascii="Times New Roman" w:hAnsi="Times New Roman" w:cs="Times New Roman"/>
                 <w:b w:val="0"/>
                 <w:i w:val="0"/>
-                <w:sz w:val="18"/>
-              </w:rPr>
-            </w:r>
-            <w:r>
-              <w:rPr>
-                <w:rFonts w:ascii="Times New Roman" w:hAnsi="Times New Roman" w:cs="Times New Roman"/>
-                <w:b/>
-                <w:i w:val="0"/>
-                <w:sz w:val="18"/>
+                <w:sz w:val="20"/>
+              </w:rPr>
+            </w:r>
+            <w:r>
+              <w:rPr>
+                <w:rFonts w:ascii="Times New Roman" w:hAnsi="Times New Roman" w:cs="Times New Roman"/>
+                <w:b w:val="0"/>
+                <w:i w:val="0"/>
+                <w:sz w:val="20"/>
               </w:rPr>
               <w:t>Year [Ref.]</w:t>
             </w:r>
@@ -15522,6 +16547,9 @@
         <w:tc>
           <w:tcPr>
             <w:tcW w:type="dxa" w:w="850"/>
+            <w:tcBorders>
+              <w:bottom w:val="single" w:sz="4" w:space="0" w:color="000000"/>
+            </w:tcBorders>
           </w:tcPr>
           <w:p>
             <w:pPr>
@@ -15532,15 +16560,15 @@
                 <w:rFonts w:ascii="Times New Roman" w:hAnsi="Times New Roman" w:cs="Times New Roman"/>
                 <w:b w:val="0"/>
                 <w:i w:val="0"/>
-                <w:sz w:val="18"/>
-              </w:rPr>
-            </w:r>
-            <w:r>
-              <w:rPr>
-                <w:rFonts w:ascii="Times New Roman" w:hAnsi="Times New Roman" w:cs="Times New Roman"/>
-                <w:b/>
-                <w:i w:val="0"/>
-                <w:sz w:val="18"/>
+                <w:sz w:val="20"/>
+              </w:rPr>
+            </w:r>
+            <w:r>
+              <w:rPr>
+                <w:rFonts w:ascii="Times New Roman" w:hAnsi="Times New Roman" w:cs="Times New Roman"/>
+                <w:b w:val="0"/>
+                <w:i w:val="0"/>
+                <w:sz w:val="20"/>
               </w:rPr>
               <w:t>Method</w:t>
             </w:r>
@@ -17557,7 +18585,35 @@
           <w:i w:val="0"/>
           <w:sz w:val="24"/>
         </w:rPr>
-        <w:t xml:space="preserve"> simulation result, delivers the highest Voc among those studies, and remains competitive with the best tin-based lead-free devices, with an all-inorganic transport-layer architecture.</w:t>
+        <w:t xml:space="preserve"> simulation result, delivers the highest </w:t>
+      </w:r>
+      <w:r>
+        <w:rPr>
+          <w:rFonts w:ascii="Times New Roman" w:hAnsi="Times New Roman"/>
+          <w:b w:val="0"/>
+          <w:i w:val="0"/>
+          <w:sz w:val="24"/>
+        </w:rPr>
+        <w:t xml:space="preserve">V</w:t>
+      </w:r>
+      <w:r>
+        <w:rPr>
+          <w:rFonts w:ascii="Times New Roman" w:hAnsi="Times New Roman"/>
+          <w:b w:val="0"/>
+          <w:i w:val="0"/>
+          <w:sz w:val="24"/>
+          <w:vertAlign w:val="subscript"/>
+        </w:rPr>
+        <w:t xml:space="preserve">OC</w:t>
+      </w:r>
+      <w:r>
+        <w:rPr>
+          <w:rFonts w:ascii="Times New Roman" w:hAnsi="Times New Roman"/>
+          <w:b w:val="0"/>
+          <w:i w:val="0"/>
+          <w:sz w:val="24"/>
+        </w:rPr>
+        <w:t xml:space="preserve"> among those studies, and remains competitive with the best tin-based lead-free devices, with an all-inorganic transport-layer architecture.</w:t>
       </w:r>
     </w:p>
     <w:p>
@@ -17676,7 +18732,21 @@
       </w:r>
       <w:r>
         <w:rPr/>
-        <w:t xml:space="preserve"> owing to Ge²⁺ oxidation. Third, the model omits optical losses (front-surface reflection, parasitic absorption in transport layers), which would refine Jsc.</w:t>
+        <w:t xml:space="preserve"> owing to Ge²⁺ oxidation. Third, the model omits optical losses (front-surface reflection, parasitic absorption in transport layers), which would refine </w:t>
+      </w:r>
+      <w:r>
+        <w:rPr/>
+        <w:t xml:space="preserve">J</w:t>
+      </w:r>
+      <w:r>
+        <w:rPr>
+          <w:vertAlign w:val="subscript"/>
+        </w:rPr>
+        <w:t xml:space="preserve">SC</w:t>
+      </w:r>
+      <w:r>
+        <w:rPr/>
+        <w:t xml:space="preserve">.</w:t>
       </w:r>
     </w:p>
     <w:p>
@@ -17870,7 +18940,63 @@
           <w:i w:val="0"/>
           <w:sz w:val="24"/>
         </w:rPr>
-        <w:t xml:space="preserve">After sequential optimization of eleven device parameters, the consolidated device achieved a PCE of 26.80% (Voc = 1.12 V, Jsc = 30.32 mA/cm², FF = 78.92%). This places the device within 0.4 percentage points of the best previously reported </w:t>
+        <w:t xml:space="preserve">After sequential optimization of eleven device parameters, the consolidated device achieved a PCE of 26.80% (</w:t>
+      </w:r>
+      <w:r>
+        <w:rPr>
+          <w:rFonts w:ascii="Times New Roman" w:hAnsi="Times New Roman"/>
+          <w:b w:val="0"/>
+          <w:i w:val="0"/>
+          <w:sz w:val="24"/>
+        </w:rPr>
+        <w:t xml:space="preserve">V</w:t>
+      </w:r>
+      <w:r>
+        <w:rPr>
+          <w:rFonts w:ascii="Times New Roman" w:hAnsi="Times New Roman"/>
+          <w:b w:val="0"/>
+          <w:i w:val="0"/>
+          <w:sz w:val="24"/>
+          <w:vertAlign w:val="subscript"/>
+        </w:rPr>
+        <w:t xml:space="preserve">OC</w:t>
+      </w:r>
+      <w:r>
+        <w:rPr>
+          <w:rFonts w:ascii="Times New Roman" w:hAnsi="Times New Roman"/>
+          <w:b w:val="0"/>
+          <w:i w:val="0"/>
+          <w:sz w:val="24"/>
+        </w:rPr>
+        <w:t xml:space="preserve"> = 1.12 V, </w:t>
+      </w:r>
+      <w:r>
+        <w:rPr>
+          <w:rFonts w:ascii="Times New Roman" w:hAnsi="Times New Roman"/>
+          <w:b w:val="0"/>
+          <w:i w:val="0"/>
+          <w:sz w:val="24"/>
+        </w:rPr>
+        <w:t xml:space="preserve">J</w:t>
+      </w:r>
+      <w:r>
+        <w:rPr>
+          <w:rFonts w:ascii="Times New Roman" w:hAnsi="Times New Roman"/>
+          <w:b w:val="0"/>
+          <w:i w:val="0"/>
+          <w:sz w:val="24"/>
+          <w:vertAlign w:val="subscript"/>
+        </w:rPr>
+        <w:t xml:space="preserve">SC</w:t>
+      </w:r>
+      <w:r>
+        <w:rPr>
+          <w:rFonts w:ascii="Times New Roman" w:hAnsi="Times New Roman"/>
+          <w:b w:val="0"/>
+          <w:i w:val="0"/>
+          <w:sz w:val="24"/>
+        </w:rPr>
+        <w:t xml:space="preserve"> = 30.32 mA/cm², FF = 78.92%). This places the device within 0.4 percentage points of the best previously reported </w:t>
       </w:r>
       <w:r>
         <w:rPr>

</xml_diff>

<commit_message>
Finalize manuscript: user Fig. 15 asset + caption, stale-claim screenshots, cleaned paper circuit
</commit_message>
<xml_diff>
--- a/paper/round3/RbGeI3_Round3.docx
+++ b/paper/round3/RbGeI3_Round3.docx
@@ -12399,7 +12399,7 @@
           <w:i w:val="0"/>
           <w:sz w:val="24"/>
         </w:rPr>
-        <w:t xml:space="preserve">The equilibrium band diagram (Figure 15) shows the energy alignment across the device: the 1.8 eV conduction-band offset at CuI/</w:t>
+        <w:t>The energy band diagram of the optimized device under illumination (Figure 15) shows the energy alignment across the device: the 1.8 eV conduction-band offset at CuI/</w:t>
       </w:r>
       <w:r>
         <w:rPr>
@@ -13092,7 +13092,7 @@
       <w:r>
         <w:drawing>
           <wp:inline xmlns:a="http://schemas.openxmlformats.org/drawingml/2006/main" xmlns:pic="http://schemas.openxmlformats.org/drawingml/2006/picture">
-            <wp:extent cx="5040000" cy="3168000"/>
+            <wp:extent cx="5040000" cy="3124800"/>
             <wp:docPr id="17" name="Picture 17"/>
             <wp:cNvGraphicFramePr>
               <a:graphicFrameLocks noChangeAspect="1"/>
@@ -13132,207 +13132,69 @@
       <w:r>
         <w:rPr>
           <w:rFonts w:ascii="Times New Roman" w:hAnsi="Times New Roman"/>
-          <w:b w:val="0"/>
-          <w:i/>
           <w:sz w:val="20"/>
         </w:rPr>
-        <w:t xml:space="preserve">Fig. 15. Equilibrium energy band diagram of the optimized CuI/</w:t>
-      </w:r>
-      <w:r>
-        <w:rPr>
-          <w:rFonts w:ascii="Times New Roman" w:hAnsi="Times New Roman"/>
-          <w:b w:val="0"/>
-          <w:i/>
-          <w:sz w:val="20"/>
-        </w:rPr>
-        <w:t xml:space="preserve">RbGeI</w:t>
-      </w:r>
-      <w:r>
-        <w:rPr>
-          <w:rFonts w:ascii="Times New Roman" w:hAnsi="Times New Roman"/>
-          <w:b w:val="0"/>
-          <w:i/>
+        <w:t>Fig. 15. Energy band diagram of the optimized FTO/TiO₂/RbGeI₃/CuI/Au solar cell under illumination, showing the conduction-band edge (E</w:t>
+      </w:r>
+      <w:r>
+        <w:rPr>
+          <w:rFonts w:ascii="Times New Roman" w:hAnsi="Times New Roman"/>
           <w:sz w:val="20"/>
           <w:vertAlign w:val="subscript"/>
         </w:rPr>
-        <w:t xml:space="preserve">3</w:t>
-      </w:r>
-      <w:r>
-        <w:rPr>
-          <w:rFonts w:ascii="Times New Roman" w:hAnsi="Times New Roman"/>
-          <w:b w:val="0"/>
-          <w:i/>
+        <w:t>C</w:t>
+      </w:r>
+      <w:r>
+        <w:rPr>
+          <w:rFonts w:ascii="Times New Roman" w:hAnsi="Times New Roman"/>
           <w:sz w:val="20"/>
         </w:rPr>
-        <w:t xml:space="preserve">/</w:t>
-      </w:r>
-      <w:r>
-        <w:rPr>
-          <w:rFonts w:ascii="Times New Roman" w:hAnsi="Times New Roman"/>
-          <w:b w:val="0"/>
-          <w:i/>
-          <w:sz w:val="20"/>
-        </w:rPr>
-        <w:t xml:space="preserve">TiO</w:t>
-      </w:r>
-      <w:r>
-        <w:rPr>
-          <w:rFonts w:ascii="Times New Roman" w:hAnsi="Times New Roman"/>
-          <w:b w:val="0"/>
-          <w:i/>
+        <w:t>), valence-band edge (E</w:t>
+      </w:r>
+      <w:r>
+        <w:rPr>
+          <w:rFonts w:ascii="Times New Roman" w:hAnsi="Times New Roman"/>
           <w:sz w:val="20"/>
           <w:vertAlign w:val="subscript"/>
         </w:rPr>
-        <w:t xml:space="preserve">2</w:t>
-      </w:r>
-      <w:r>
-        <w:rPr>
-          <w:rFonts w:ascii="Times New Roman" w:hAnsi="Times New Roman"/>
-          <w:b w:val="0"/>
-          <w:i/>
+        <w:t>V</w:t>
+      </w:r>
+      <w:r>
+        <w:rPr>
+          <w:rFonts w:ascii="Times New Roman" w:hAnsi="Times New Roman"/>
           <w:sz w:val="20"/>
         </w:rPr>
-        <w:t xml:space="preserve">/FTO solar cell, showing the conduction-band edge (</w:t>
-      </w:r>
-      <w:r>
-        <w:rPr>
-          <w:rFonts w:ascii="Times New Roman" w:hAnsi="Times New Roman"/>
-          <w:b w:val="0"/>
-          <w:i/>
-          <w:sz w:val="20"/>
-        </w:rPr>
-        <w:t xml:space="preserve">E</w:t>
-      </w:r>
-      <w:r>
-        <w:rPr>
-          <w:rFonts w:ascii="Times New Roman" w:hAnsi="Times New Roman"/>
-          <w:b w:val="0"/>
-          <w:i/>
+        <w:t>), electron quasi-Fermi level (F</w:t>
+      </w:r>
+      <w:r>
+        <w:rPr>
+          <w:rFonts w:ascii="Times New Roman" w:hAnsi="Times New Roman"/>
           <w:sz w:val="20"/>
           <w:vertAlign w:val="subscript"/>
         </w:rPr>
-        <w:t xml:space="preserve">c</w:t>
-      </w:r>
-      <w:r>
-        <w:rPr>
-          <w:rFonts w:ascii="Times New Roman" w:hAnsi="Times New Roman"/>
-          <w:b w:val="0"/>
-          <w:i/>
+        <w:t>n</w:t>
+      </w:r>
+      <w:r>
+        <w:rPr>
+          <w:rFonts w:ascii="Times New Roman" w:hAnsi="Times New Roman"/>
           <w:sz w:val="20"/>
         </w:rPr>
-        <w:t xml:space="preserve">, blue) and valence-band edge (</w:t>
-      </w:r>
-      <w:r>
-        <w:rPr>
-          <w:rFonts w:ascii="Times New Roman" w:hAnsi="Times New Roman"/>
-          <w:b w:val="0"/>
-          <w:i/>
-          <w:sz w:val="20"/>
-        </w:rPr>
-        <w:t xml:space="preserve">E</w:t>
-      </w:r>
-      <w:r>
-        <w:rPr>
-          <w:rFonts w:ascii="Times New Roman" w:hAnsi="Times New Roman"/>
-          <w:b w:val="0"/>
-          <w:i/>
+        <w:t>), and hole quasi-Fermi level (F</w:t>
+      </w:r>
+      <w:r>
+        <w:rPr>
+          <w:rFonts w:ascii="Times New Roman" w:hAnsi="Times New Roman"/>
           <w:sz w:val="20"/>
           <w:vertAlign w:val="subscript"/>
         </w:rPr>
-        <w:t xml:space="preserve">v</w:t>
-      </w:r>
-      <w:r>
-        <w:rPr>
-          <w:rFonts w:ascii="Times New Roman" w:hAnsi="Times New Roman"/>
-          <w:b w:val="0"/>
-          <w:i/>
+        <w:t>p</w:t>
+      </w:r>
+      <w:r>
+        <w:rPr>
+          <w:rFonts w:ascii="Times New Roman" w:hAnsi="Times New Roman"/>
           <w:sz w:val="20"/>
         </w:rPr>
-        <w:t xml:space="preserve">, red) across all four layers. The 1.8 eV conduction-band offset at CuI/</w:t>
-      </w:r>
-      <w:r>
-        <w:rPr>
-          <w:rFonts w:ascii="Times New Roman" w:hAnsi="Times New Roman"/>
-          <w:b w:val="0"/>
-          <w:i/>
-          <w:sz w:val="20"/>
-        </w:rPr>
-        <w:t xml:space="preserve">RbGeI</w:t>
-      </w:r>
-      <w:r>
-        <w:rPr>
-          <w:rFonts w:ascii="Times New Roman" w:hAnsi="Times New Roman"/>
-          <w:b w:val="0"/>
-          <w:i/>
-          <w:sz w:val="20"/>
-          <w:vertAlign w:val="subscript"/>
-        </w:rPr>
-        <w:t xml:space="preserve">3</w:t>
-      </w:r>
-      <w:r>
-        <w:rPr>
-          <w:rFonts w:ascii="Times New Roman" w:hAnsi="Times New Roman"/>
-          <w:b w:val="0"/>
-          <w:i/>
-          <w:sz w:val="20"/>
-        </w:rPr>
-        <w:t xml:space="preserve"> blocks electron back-transfer, while the 0.10 eV conduction-band step at </w:t>
-      </w:r>
-      <w:r>
-        <w:rPr>
-          <w:rFonts w:ascii="Times New Roman" w:hAnsi="Times New Roman"/>
-          <w:b w:val="0"/>
-          <w:i/>
-          <w:sz w:val="20"/>
-        </w:rPr>
-        <w:t xml:space="preserve">RbGeI</w:t>
-      </w:r>
-      <w:r>
-        <w:rPr>
-          <w:rFonts w:ascii="Times New Roman" w:hAnsi="Times New Roman"/>
-          <w:b w:val="0"/>
-          <w:i/>
-          <w:sz w:val="20"/>
-          <w:vertAlign w:val="subscript"/>
-        </w:rPr>
-        <w:t xml:space="preserve">3</w:t>
-      </w:r>
-      <w:r>
-        <w:rPr>
-          <w:rFonts w:ascii="Times New Roman" w:hAnsi="Times New Roman"/>
-          <w:b w:val="0"/>
-          <w:i/>
-          <w:sz w:val="20"/>
-        </w:rPr>
-        <w:t xml:space="preserve">/</w:t>
-      </w:r>
-      <w:r>
-        <w:rPr>
-          <w:rFonts w:ascii="Times New Roman" w:hAnsi="Times New Roman"/>
-          <w:b w:val="0"/>
-          <w:i/>
-          <w:sz w:val="20"/>
-        </w:rPr>
-        <w:t xml:space="preserve">TiO</w:t>
-      </w:r>
-      <w:r>
-        <w:rPr>
-          <w:rFonts w:ascii="Times New Roman" w:hAnsi="Times New Roman"/>
-          <w:b w:val="0"/>
-          <w:i/>
-          <w:sz w:val="20"/>
-          <w:vertAlign w:val="subscript"/>
-        </w:rPr>
-        <w:t xml:space="preserve">2</w:t>
-      </w:r>
-      <w:r>
-        <w:rPr>
-          <w:rFonts w:ascii="Times New Roman" w:hAnsi="Times New Roman"/>
-          <w:b w:val="0"/>
-          <w:i/>
-          <w:sz w:val="20"/>
-        </w:rPr>
-        <w:t xml:space="preserve"> supports efficient electron extraction.</w:t>
+        <w:t>). The 1.8 eV conduction-band offset at the CuI/RbGeI₃ interface suppresses electron back-transfer, while the 0.10 eV conduction-band offset at the RbGeI₃/TiO₂ interface facilitates electron extraction. The 1.90 eV valence-band offset at the RbGeI₃/TiO₂ interface provides an energetic barrier against hole injection into TiO₂.</w:t>
       </w:r>
     </w:p>
     <w:p>
@@ -19073,34 +18935,34 @@
     </w:p>
     <w:p>
       <w:pPr>
-        <w:spacing w:line="192" w:lineRule="auto" w:before="10" w:after="10"/>
+        <w:spacing w:line="216" w:lineRule="auto" w:before="0" w:after="0"/>
         <w:ind w:left="454" w:hanging="454"/>
       </w:pPr>
       <w:r>
         <w:rPr>
-          <w:rFonts w:ascii="Times New Roman" w:hAnsi="Times New Roman" w:cs="Times New Roman"/>
-          <w:b w:val="0"/>
-          <w:i w:val="0"/>
-          <w:sz w:val="20"/>
+          <w:rFonts w:ascii="Times New Roman" w:hAnsi="Times New Roman" w:cs="Times New Roman" w:eastAsia="Times New Roman"/>
+          <w:b w:val="0"/>
+          <w:i w:val="0"/>
+          <w:sz w:val="24"/>
         </w:rPr>
         <w:t xml:space="preserve">[1] </w:t>
       </w:r>
       <w:r>
         <w:rPr>
-          <w:rFonts w:ascii="Times New Roman" w:hAnsi="Times New Roman" w:cs="Times New Roman"/>
-          <w:b w:val="0"/>
-          <w:i w:val="0"/>
-          <w:sz w:val="20"/>
+          <w:rFonts w:ascii="Times New Roman" w:hAnsi="Times New Roman" w:cs="Times New Roman" w:eastAsia="Times New Roman"/>
+          <w:b w:val="0"/>
+          <w:i w:val="0"/>
+          <w:sz w:val="24"/>
         </w:rPr>
         <w:t>RENEWABLES 2024 Global Status Report (REN21, 2024).</w:t>
       </w:r>
       <w:r>
         <w:rPr>
-          <w:rFonts w:ascii="Times New Roman" w:hAnsi="Times New Roman" w:cs="Times New Roman"/>
+          <w:rFonts w:ascii="Times New Roman" w:hAnsi="Times New Roman" w:cs="Times New Roman" w:eastAsia="Times New Roman"/>
           <w:b w:val="0"/>
           <w:i w:val="0"/>
           <w:color w:val="0563C1"/>
-          <w:sz w:val="20"/>
+          <w:sz w:val="24"/>
           <w:u w:val="single"/>
         </w:rPr>
         <w:t xml:space="preserve"/>
@@ -19108,34 +18970,34 @@
     </w:p>
     <w:p>
       <w:pPr>
-        <w:spacing w:line="192" w:lineRule="auto" w:before="10" w:after="10"/>
+        <w:spacing w:line="216" w:lineRule="auto" w:before="0" w:after="0"/>
         <w:ind w:left="454" w:hanging="454"/>
       </w:pPr>
       <w:r>
         <w:rPr>
-          <w:rFonts w:ascii="Times New Roman" w:hAnsi="Times New Roman" w:cs="Times New Roman"/>
-          <w:b w:val="0"/>
-          <w:i w:val="0"/>
-          <w:sz w:val="20"/>
+          <w:rFonts w:ascii="Times New Roman" w:hAnsi="Times New Roman" w:cs="Times New Roman" w:eastAsia="Times New Roman"/>
+          <w:b w:val="0"/>
+          <w:i w:val="0"/>
+          <w:sz w:val="24"/>
         </w:rPr>
         <w:t xml:space="preserve">[2] </w:t>
       </w:r>
       <w:r>
         <w:rPr>
-          <w:rFonts w:ascii="Times New Roman" w:hAnsi="Times New Roman" w:cs="Times New Roman"/>
-          <w:b w:val="0"/>
-          <w:i w:val="0"/>
-          <w:sz w:val="20"/>
+          <w:rFonts w:ascii="Times New Roman" w:hAnsi="Times New Roman" w:cs="Times New Roman" w:eastAsia="Times New Roman"/>
+          <w:b w:val="0"/>
+          <w:i w:val="0"/>
+          <w:sz w:val="24"/>
         </w:rPr>
         <w:t>World Energy Outlook 2024 (International Energy Agency, IEA, 2024).</w:t>
       </w:r>
       <w:r>
         <w:rPr>
-          <w:rFonts w:ascii="Times New Roman" w:hAnsi="Times New Roman" w:cs="Times New Roman"/>
+          <w:rFonts w:ascii="Times New Roman" w:hAnsi="Times New Roman" w:cs="Times New Roman" w:eastAsia="Times New Roman"/>
           <w:b w:val="0"/>
           <w:i w:val="0"/>
           <w:color w:val="0563C1"/>
-          <w:sz w:val="20"/>
+          <w:sz w:val="24"/>
           <w:u w:val="single"/>
         </w:rPr>
         <w:t xml:space="preserve"/>
@@ -19143,482 +19005,482 @@
     </w:p>
     <w:p>
       <w:pPr>
-        <w:spacing w:line="192" w:lineRule="auto" w:before="10" w:after="10"/>
+        <w:spacing w:line="216" w:lineRule="auto" w:before="0" w:after="0"/>
         <w:ind w:left="454" w:hanging="454"/>
       </w:pPr>
       <w:r>
         <w:rPr>
-          <w:rFonts w:ascii="Times New Roman" w:hAnsi="Times New Roman" w:cs="Times New Roman"/>
-          <w:b w:val="0"/>
-          <w:i w:val="0"/>
-          <w:sz w:val="20"/>
+          <w:rFonts w:ascii="Times New Roman" w:hAnsi="Times New Roman" w:cs="Times New Roman" w:eastAsia="Times New Roman"/>
+          <w:b w:val="0"/>
+          <w:i w:val="0"/>
+          <w:sz w:val="24"/>
         </w:rPr>
         <w:t xml:space="preserve">[3] </w:t>
       </w:r>
       <w:r>
         <w:rPr>
-          <w:rFonts w:ascii="Times New Roman" w:hAnsi="Times New Roman" w:cs="Times New Roman"/>
-          <w:b w:val="0"/>
-          <w:i w:val="0"/>
-          <w:sz w:val="20"/>
+          <w:rFonts w:ascii="Times New Roman" w:hAnsi="Times New Roman" w:cs="Times New Roman" w:eastAsia="Times New Roman"/>
+          <w:b w:val="0"/>
+          <w:i w:val="0"/>
+          <w:sz w:val="24"/>
         </w:rPr>
         <w:t>M. A. Green et al., “Solar cell efficiency tables (Version 64),” Prog. Photovolt.: Res. Appl. (2024). doi:10.1002/pip.3831.</w:t>
       </w:r>
     </w:p>
     <w:p>
       <w:pPr>
-        <w:spacing w:line="192" w:lineRule="auto" w:before="10" w:after="10"/>
+        <w:spacing w:line="216" w:lineRule="auto" w:before="0" w:after="0"/>
         <w:ind w:left="454" w:hanging="454"/>
       </w:pPr>
       <w:r>
         <w:rPr>
-          <w:rFonts w:ascii="Times New Roman" w:hAnsi="Times New Roman" w:cs="Times New Roman"/>
-          <w:b w:val="0"/>
-          <w:i w:val="0"/>
-          <w:sz w:val="20"/>
+          <w:rFonts w:ascii="Times New Roman" w:hAnsi="Times New Roman" w:cs="Times New Roman" w:eastAsia="Times New Roman"/>
+          <w:b w:val="0"/>
+          <w:i w:val="0"/>
+          <w:sz w:val="24"/>
         </w:rPr>
         <w:t xml:space="preserve">[4] </w:t>
       </w:r>
       <w:r>
         <w:rPr>
-          <w:rFonts w:ascii="Times New Roman" w:hAnsi="Times New Roman" w:cs="Times New Roman"/>
-          <w:b w:val="0"/>
-          <w:i w:val="0"/>
-          <w:sz w:val="20"/>
+          <w:rFonts w:ascii="Times New Roman" w:hAnsi="Times New Roman" w:cs="Times New Roman" w:eastAsia="Times New Roman"/>
+          <w:b w:val="0"/>
+          <w:i w:val="0"/>
+          <w:sz w:val="24"/>
         </w:rPr>
         <w:t>R. A. Afre and D. Pugliese, “Perovskite solar cells: A review of the latest advances in materials, fabrication techniques, and stability enhancement strategies,” Micromachines 15(2), 192 (2024). doi:10.3390/mi15020192.</w:t>
       </w:r>
     </w:p>
     <w:p>
       <w:pPr>
-        <w:spacing w:line="192" w:lineRule="auto" w:before="10" w:after="10"/>
+        <w:spacing w:line="216" w:lineRule="auto" w:before="0" w:after="0"/>
         <w:ind w:left="454" w:hanging="454"/>
       </w:pPr>
       <w:r>
         <w:rPr>
-          <w:rFonts w:ascii="Times New Roman" w:hAnsi="Times New Roman" w:cs="Times New Roman"/>
-          <w:b w:val="0"/>
-          <w:i w:val="0"/>
-          <w:sz w:val="20"/>
+          <w:rFonts w:ascii="Times New Roman" w:hAnsi="Times New Roman" w:cs="Times New Roman" w:eastAsia="Times New Roman"/>
+          <w:b w:val="0"/>
+          <w:i w:val="0"/>
+          <w:sz w:val="24"/>
         </w:rPr>
         <w:t xml:space="preserve">[5] </w:t>
       </w:r>
       <w:r>
         <w:rPr>
-          <w:rFonts w:ascii="Times New Roman" w:hAnsi="Times New Roman" w:cs="Times New Roman"/>
-          <w:b w:val="0"/>
-          <w:i w:val="0"/>
-          <w:sz w:val="20"/>
+          <w:rFonts w:ascii="Times New Roman" w:hAnsi="Times New Roman" w:cs="Times New Roman" w:eastAsia="Times New Roman"/>
+          <w:b w:val="0"/>
+          <w:i w:val="0"/>
+          <w:sz w:val="24"/>
         </w:rPr>
         <w:t>N.-G. Park, M. Grätzel, T. Miyasaka, K. Zhu, and K. Emery, “Towards stable and commercially available perovskite solar cells,” Nat. Energy 1(11), 16152 (2016). doi:10.1038/nenergy.2016.152.</w:t>
       </w:r>
     </w:p>
     <w:p>
       <w:pPr>
-        <w:spacing w:line="192" w:lineRule="auto" w:before="10" w:after="10"/>
+        <w:spacing w:line="216" w:lineRule="auto" w:before="0" w:after="0"/>
         <w:ind w:left="454" w:hanging="454"/>
       </w:pPr>
       <w:r>
         <w:rPr>
-          <w:rFonts w:ascii="Times New Roman" w:hAnsi="Times New Roman" w:cs="Times New Roman"/>
-          <w:b w:val="0"/>
-          <w:i w:val="0"/>
-          <w:sz w:val="20"/>
+          <w:rFonts w:ascii="Times New Roman" w:hAnsi="Times New Roman" w:cs="Times New Roman" w:eastAsia="Times New Roman"/>
+          <w:b w:val="0"/>
+          <w:i w:val="0"/>
+          <w:sz w:val="24"/>
         </w:rPr>
         <w:t xml:space="preserve">[6] </w:t>
       </w:r>
       <w:r>
         <w:rPr>
-          <w:rFonts w:ascii="Times New Roman" w:hAnsi="Times New Roman" w:cs="Times New Roman"/>
-          <w:b w:val="0"/>
-          <w:i w:val="0"/>
-          <w:sz w:val="20"/>
+          <w:rFonts w:ascii="Times New Roman" w:hAnsi="Times New Roman" w:cs="Times New Roman" w:eastAsia="Times New Roman"/>
+          <w:b w:val="0"/>
+          <w:i w:val="0"/>
+          <w:sz w:val="24"/>
         </w:rPr>
         <w:t>“Compositional engineering of perovskite materials for high-performance solar cells,” Nature 517(7535), 476–480 (2015). doi:10.1038/nature14133.</w:t>
       </w:r>
     </w:p>
     <w:p>
       <w:pPr>
-        <w:spacing w:line="192" w:lineRule="auto" w:before="10" w:after="10"/>
+        <w:spacing w:line="216" w:lineRule="auto" w:before="0" w:after="0"/>
         <w:ind w:left="454" w:hanging="454"/>
       </w:pPr>
       <w:r>
         <w:rPr>
-          <w:rFonts w:ascii="Times New Roman" w:hAnsi="Times New Roman" w:cs="Times New Roman"/>
-          <w:b w:val="0"/>
-          <w:i w:val="0"/>
-          <w:sz w:val="20"/>
+          <w:rFonts w:ascii="Times New Roman" w:hAnsi="Times New Roman" w:cs="Times New Roman" w:eastAsia="Times New Roman"/>
+          <w:b w:val="0"/>
+          <w:i w:val="0"/>
+          <w:sz w:val="24"/>
         </w:rPr>
         <w:t xml:space="preserve">[7] </w:t>
       </w:r>
       <w:r>
         <w:rPr>
-          <w:rFonts w:ascii="Times New Roman" w:hAnsi="Times New Roman" w:cs="Times New Roman"/>
-          <w:b w:val="0"/>
-          <w:i w:val="0"/>
-          <w:sz w:val="20"/>
+          <w:rFonts w:ascii="Times New Roman" w:hAnsi="Times New Roman" w:cs="Times New Roman" w:eastAsia="Times New Roman"/>
+          <w:b w:val="0"/>
+          <w:i w:val="0"/>
+          <w:sz w:val="24"/>
         </w:rPr>
         <w:t>I. Ahmed, K. Prakash, and S. M. Mobin, “Lead-free perovskites for solar cell applications: recent progress, ongoing challenges, and strategic approaches,” Chem. Commun. 61(37), 6691–6721 (2025). doi:10.1039/D4CC06835A.</w:t>
       </w:r>
     </w:p>
     <w:p>
       <w:pPr>
-        <w:spacing w:line="192" w:lineRule="auto" w:before="10" w:after="10"/>
+        <w:spacing w:line="216" w:lineRule="auto" w:before="0" w:after="0"/>
         <w:ind w:left="454" w:hanging="454"/>
       </w:pPr>
       <w:r>
         <w:rPr>
-          <w:rFonts w:ascii="Times New Roman" w:hAnsi="Times New Roman" w:cs="Times New Roman"/>
-          <w:b w:val="0"/>
-          <w:i w:val="0"/>
-          <w:sz w:val="20"/>
+          <w:rFonts w:ascii="Times New Roman" w:hAnsi="Times New Roman" w:cs="Times New Roman" w:eastAsia="Times New Roman"/>
+          <w:b w:val="0"/>
+          <w:i w:val="0"/>
+          <w:sz w:val="24"/>
         </w:rPr>
         <w:t xml:space="preserve">[8] </w:t>
       </w:r>
       <w:r>
         <w:rPr>
-          <w:rFonts w:ascii="Times New Roman" w:hAnsi="Times New Roman" w:cs="Times New Roman"/>
-          <w:b w:val="0"/>
-          <w:i w:val="0"/>
-          <w:sz w:val="20"/>
+          <w:rFonts w:ascii="Times New Roman" w:hAnsi="Times New Roman" w:cs="Times New Roman" w:eastAsia="Times New Roman"/>
+          <w:b w:val="0"/>
+          <w:i w:val="0"/>
+          <w:sz w:val="24"/>
         </w:rPr>
         <w:t>S. Kinza Fatima et al., “Lead-free perovskites for next-generation applications: a comprehensive computational and data-driven review,” Mater. Adv. 6(21), 7634–7661 (2025). doi:10.1039/D5MA00681C.</w:t>
       </w:r>
     </w:p>
     <w:p>
       <w:pPr>
-        <w:spacing w:line="192" w:lineRule="auto" w:before="10" w:after="10"/>
+        <w:spacing w:line="216" w:lineRule="auto" w:before="0" w:after="0"/>
         <w:ind w:left="454" w:hanging="454"/>
       </w:pPr>
       <w:r>
         <w:rPr>
-          <w:rFonts w:ascii="Times New Roman" w:hAnsi="Times New Roman" w:cs="Times New Roman"/>
-          <w:b w:val="0"/>
-          <w:i w:val="0"/>
-          <w:sz w:val="20"/>
+          <w:rFonts w:ascii="Times New Roman" w:hAnsi="Times New Roman" w:cs="Times New Roman" w:eastAsia="Times New Roman"/>
+          <w:b w:val="0"/>
+          <w:i w:val="0"/>
+          <w:sz w:val="24"/>
         </w:rPr>
         <w:t xml:space="preserve">[9] </w:t>
       </w:r>
       <w:r>
         <w:rPr>
-          <w:rFonts w:ascii="Times New Roman" w:hAnsi="Times New Roman" w:cs="Times New Roman"/>
-          <w:b w:val="0"/>
-          <w:i w:val="0"/>
-          <w:sz w:val="20"/>
+          <w:rFonts w:ascii="Times New Roman" w:hAnsi="Times New Roman" w:cs="Times New Roman" w:eastAsia="Times New Roman"/>
+          <w:b w:val="0"/>
+          <w:i w:val="0"/>
+          <w:sz w:val="24"/>
         </w:rPr>
         <w:t>J. Burschka, N. Pellet, S.-J. Moon, R. Humphry-Baker, P. Gao, M. K. Nazeeruddin, and M. Grätzel, “Sequential deposition as a route to high-performance perovskite-sensitized solar cells,” Nature 499(7458), 316–319 (2013). doi:10.1038/nature12340.</w:t>
       </w:r>
     </w:p>
     <w:p>
       <w:pPr>
-        <w:spacing w:line="192" w:lineRule="auto" w:before="10" w:after="10"/>
+        <w:spacing w:line="216" w:lineRule="auto" w:before="0" w:after="0"/>
         <w:ind w:left="454" w:hanging="454"/>
       </w:pPr>
       <w:r>
         <w:rPr>
-          <w:rFonts w:ascii="Times New Roman" w:hAnsi="Times New Roman" w:cs="Times New Roman"/>
-          <w:b w:val="0"/>
-          <w:i w:val="0"/>
-          <w:sz w:val="20"/>
+          <w:rFonts w:ascii="Times New Roman" w:hAnsi="Times New Roman" w:cs="Times New Roman" w:eastAsia="Times New Roman"/>
+          <w:b w:val="0"/>
+          <w:i w:val="0"/>
+          <w:sz w:val="24"/>
         </w:rPr>
         <w:t xml:space="preserve">[10] </w:t>
       </w:r>
       <w:r>
         <w:rPr>
-          <w:rFonts w:ascii="Times New Roman" w:hAnsi="Times New Roman" w:cs="Times New Roman"/>
-          <w:b w:val="0"/>
-          <w:i w:val="0"/>
-          <w:sz w:val="20"/>
+          <w:rFonts w:ascii="Times New Roman" w:hAnsi="Times New Roman" w:cs="Times New Roman" w:eastAsia="Times New Roman"/>
+          <w:b w:val="0"/>
+          <w:i w:val="0"/>
+          <w:sz w:val="24"/>
         </w:rPr>
         <w:t>M. M. Lee, J. Teuscher, T. Miyasaka, T. N. Murakami, and H. J. Snaith, “Efficient hybrid solar cells based on meso-superstructured organometal halide perovskites,” Science 338(6107), 643–647 (2012). doi:9.7726/science.1228604.</w:t>
       </w:r>
     </w:p>
     <w:p>
       <w:pPr>
-        <w:spacing w:line="192" w:lineRule="auto" w:before="10" w:after="10"/>
+        <w:spacing w:line="216" w:lineRule="auto" w:before="0" w:after="0"/>
         <w:ind w:left="454" w:hanging="454"/>
       </w:pPr>
       <w:r>
         <w:rPr>
-          <w:rFonts w:ascii="Times New Roman" w:hAnsi="Times New Roman" w:cs="Times New Roman"/>
-          <w:b w:val="0"/>
-          <w:i w:val="0"/>
-          <w:sz w:val="20"/>
+          <w:rFonts w:ascii="Times New Roman" w:hAnsi="Times New Roman" w:cs="Times New Roman" w:eastAsia="Times New Roman"/>
+          <w:b w:val="0"/>
+          <w:i w:val="0"/>
+          <w:sz w:val="24"/>
         </w:rPr>
         <w:t xml:space="preserve">[11] </w:t>
       </w:r>
       <w:r>
         <w:rPr>
-          <w:rFonts w:ascii="Times New Roman" w:hAnsi="Times New Roman" w:cs="Times New Roman"/>
-          <w:b w:val="0"/>
-          <w:i w:val="0"/>
-          <w:sz w:val="20"/>
+          <w:rFonts w:ascii="Times New Roman" w:hAnsi="Times New Roman" w:cs="Times New Roman" w:eastAsia="Times New Roman"/>
+          <w:b w:val="0"/>
+          <w:i w:val="0"/>
+          <w:sz w:val="24"/>
         </w:rPr>
         <w:t>A. K. Jena, A. Kulkarni, and T. Miyasaka, “Halide perovskite photovoltaics: Background, status, and future prospects,” Chem. Rev. 119(5), 3036–3103 (2019). doi:10.1021/acs.chemrev.8b00539.</w:t>
       </w:r>
     </w:p>
     <w:p>
       <w:pPr>
-        <w:spacing w:line="192" w:lineRule="auto" w:before="10" w:after="10"/>
+        <w:spacing w:line="216" w:lineRule="auto" w:before="0" w:after="0"/>
         <w:ind w:left="454" w:hanging="454"/>
       </w:pPr>
       <w:r>
         <w:rPr>
-          <w:rFonts w:ascii="Times New Roman" w:hAnsi="Times New Roman" w:cs="Times New Roman"/>
-          <w:b w:val="0"/>
-          <w:i w:val="0"/>
-          <w:sz w:val="20"/>
+          <w:rFonts w:ascii="Times New Roman" w:hAnsi="Times New Roman" w:cs="Times New Roman" w:eastAsia="Times New Roman"/>
+          <w:b w:val="0"/>
+          <w:i w:val="0"/>
+          <w:sz w:val="24"/>
         </w:rPr>
         <w:t xml:space="preserve">[12] </w:t>
       </w:r>
       <w:r>
         <w:rPr>
-          <w:rFonts w:ascii="Times New Roman" w:hAnsi="Times New Roman" w:cs="Times New Roman"/>
-          <w:b w:val="0"/>
-          <w:i w:val="0"/>
-          <w:sz w:val="20"/>
+          <w:rFonts w:ascii="Times New Roman" w:hAnsi="Times New Roman" w:cs="Times New Roman" w:eastAsia="Times New Roman"/>
+          <w:b w:val="0"/>
+          <w:i w:val="0"/>
+          <w:sz w:val="24"/>
         </w:rPr>
         <w:t>P. Afrin, K. Farjana, A. Vumije, and M. N. Uddin, “An investigation on the impact of temperature variation over the performance of formamidinium tin iodide perovskite solar cell using SCAPS simulation,” AIP Adv. 14(7) (2024). doi:10.1063/5.0209332.</w:t>
       </w:r>
     </w:p>
     <w:p>
       <w:pPr>
-        <w:spacing w:line="192" w:lineRule="auto" w:before="10" w:after="10"/>
+        <w:spacing w:line="216" w:lineRule="auto" w:before="0" w:after="0"/>
         <w:ind w:left="454" w:hanging="454"/>
       </w:pPr>
       <w:r>
         <w:rPr>
-          <w:rFonts w:ascii="Times New Roman" w:hAnsi="Times New Roman"/>
-          <w:b w:val="0"/>
-          <w:i w:val="0"/>
-          <w:sz w:val="20"/>
+          <w:rFonts w:ascii="Times New Roman" w:hAnsi="Times New Roman" w:eastAsia="Times New Roman" w:cs="Times New Roman"/>
+          <w:b w:val="0"/>
+          <w:i w:val="0"/>
+          <w:sz w:val="24"/>
         </w:rPr>
         <w:t>[13] S. Samaki, F. Tchangnwa Nya, G. M. Dzifack Kenfack, and A. Laref, “Materials and interfaces properties optimization for high-efficient and more stable RbGeI</w:t>
       </w:r>
       <w:r>
         <w:rPr>
-          <w:rFonts w:ascii="Times New Roman" w:hAnsi="Times New Roman"/>
-          <w:b w:val="0"/>
-          <w:i w:val="0"/>
-          <w:sz w:val="20"/>
+          <w:rFonts w:ascii="Times New Roman" w:hAnsi="Times New Roman" w:eastAsia="Times New Roman" w:cs="Times New Roman"/>
+          <w:b w:val="0"/>
+          <w:i w:val="0"/>
+          <w:sz w:val="24"/>
           <w:vertAlign w:val="subscript"/>
         </w:rPr>
         <w:t>3</w:t>
       </w:r>
       <w:r>
         <w:rPr>
-          <w:rFonts w:ascii="Times New Roman" w:hAnsi="Times New Roman"/>
-          <w:b w:val="0"/>
-          <w:i w:val="0"/>
-          <w:sz w:val="20"/>
+          <w:rFonts w:ascii="Times New Roman" w:hAnsi="Times New Roman" w:eastAsia="Times New Roman" w:cs="Times New Roman"/>
+          <w:b w:val="0"/>
+          <w:i w:val="0"/>
+          <w:sz w:val="24"/>
         </w:rPr>
         <w:t xml:space="preserve"> perovskite solar cells: optoelectrical modelling,” Sci. Rep. 13, 15517 (2023). doi:10.1038/s41598-023-42471-w.</w:t>
       </w:r>
     </w:p>
     <w:p>
       <w:pPr>
-        <w:spacing w:line="192" w:lineRule="auto" w:before="10" w:after="10"/>
+        <w:spacing w:line="216" w:lineRule="auto" w:before="0" w:after="0"/>
         <w:ind w:left="454" w:hanging="454"/>
       </w:pPr>
       <w:r>
         <w:rPr>
-          <w:rFonts w:ascii="Times New Roman" w:hAnsi="Times New Roman"/>
-          <w:b w:val="0"/>
-          <w:i w:val="0"/>
-          <w:sz w:val="20"/>
+          <w:rFonts w:ascii="Times New Roman" w:hAnsi="Times New Roman" w:eastAsia="Times New Roman" w:cs="Times New Roman"/>
+          <w:b w:val="0"/>
+          <w:i w:val="0"/>
+          <w:sz w:val="24"/>
         </w:rPr>
         <w:t>[14] G. Pindolia, S. M. Shinde, and P. K. Jha, “Optimization of an inorganic lead-free RbGeI</w:t>
       </w:r>
       <w:r>
         <w:rPr>
-          <w:rFonts w:ascii="Times New Roman" w:hAnsi="Times New Roman"/>
-          <w:b w:val="0"/>
-          <w:i w:val="0"/>
-          <w:sz w:val="20"/>
+          <w:rFonts w:ascii="Times New Roman" w:hAnsi="Times New Roman" w:eastAsia="Times New Roman" w:cs="Times New Roman"/>
+          <w:b w:val="0"/>
+          <w:i w:val="0"/>
+          <w:sz w:val="24"/>
           <w:vertAlign w:val="subscript"/>
         </w:rPr>
         <w:t>3</w:t>
       </w:r>
       <w:r>
         <w:rPr>
-          <w:rFonts w:ascii="Times New Roman" w:hAnsi="Times New Roman"/>
-          <w:b w:val="0"/>
-          <w:i w:val="0"/>
-          <w:sz w:val="20"/>
+          <w:rFonts w:ascii="Times New Roman" w:hAnsi="Times New Roman" w:eastAsia="Times New Roman" w:cs="Times New Roman"/>
+          <w:b w:val="0"/>
+          <w:i w:val="0"/>
+          <w:sz w:val="24"/>
         </w:rPr>
         <w:t xml:space="preserve"> based perovskite solar cell by SCAPS-1D simulation,” Sol. Energy 236, 802–821 (2022). doi:10.1016/j.solener.2022.03.053.</w:t>
       </w:r>
     </w:p>
     <w:p>
       <w:pPr>
-        <w:spacing w:line="192" w:lineRule="auto" w:before="10" w:after="10"/>
+        <w:spacing w:line="216" w:lineRule="auto" w:before="0" w:after="0"/>
         <w:ind w:left="454" w:hanging="454"/>
       </w:pPr>
       <w:r>
         <w:rPr>
-          <w:rFonts w:ascii="Times New Roman" w:hAnsi="Times New Roman" w:cs="Times New Roman"/>
-          <w:b w:val="0"/>
-          <w:i w:val="0"/>
-          <w:sz w:val="20"/>
+          <w:rFonts w:ascii="Times New Roman" w:hAnsi="Times New Roman" w:cs="Times New Roman" w:eastAsia="Times New Roman"/>
+          <w:b w:val="0"/>
+          <w:i w:val="0"/>
+          <w:sz w:val="24"/>
         </w:rPr>
         <w:t xml:space="preserve">[15] </w:t>
       </w:r>
       <w:r>
         <w:rPr>
-          <w:rFonts w:ascii="Times New Roman" w:hAnsi="Times New Roman" w:cs="Times New Roman"/>
-          <w:b w:val="0"/>
-          <w:i w:val="0"/>
-          <w:sz w:val="20"/>
+          <w:rFonts w:ascii="Times New Roman" w:hAnsi="Times New Roman" w:cs="Times New Roman" w:eastAsia="Times New Roman"/>
+          <w:b w:val="0"/>
+          <w:i w:val="0"/>
+          <w:sz w:val="24"/>
         </w:rPr>
         <w:t>S. Bouazizi, W. Tlili, A. Bouich, B. M. Soucase, and A. Omri, “Design and efficiency enhancement of FTO/PC60BM/CsSn0.5Ge0.5I3/Spiro-OMeTAD/Au perovskite solar cell utilizing SCAPS-1D simulator,” Mater. Res. Express 9(9), 096402 (2022). doi:10.1088/2053-1591/ac8d52.</w:t>
       </w:r>
     </w:p>
     <w:p>
       <w:pPr>
-        <w:spacing w:line="192" w:lineRule="auto" w:before="10" w:after="10"/>
+        <w:spacing w:line="216" w:lineRule="auto" w:before="0" w:after="0"/>
         <w:ind w:left="454" w:hanging="454"/>
       </w:pPr>
       <w:r>
         <w:rPr>
-          <w:rFonts w:ascii="Times New Roman" w:hAnsi="Times New Roman" w:cs="Times New Roman"/>
-          <w:b w:val="0"/>
-          <w:i w:val="0"/>
-          <w:sz w:val="20"/>
+          <w:rFonts w:ascii="Times New Roman" w:hAnsi="Times New Roman" w:cs="Times New Roman" w:eastAsia="Times New Roman"/>
+          <w:b w:val="0"/>
+          <w:i w:val="0"/>
+          <w:sz w:val="24"/>
         </w:rPr>
         <w:t xml:space="preserve">[16] </w:t>
       </w:r>
       <w:r>
         <w:rPr>
-          <w:rFonts w:ascii="Times New Roman" w:hAnsi="Times New Roman" w:cs="Times New Roman"/>
-          <w:b w:val="0"/>
-          <w:i w:val="0"/>
-          <w:sz w:val="20"/>
+          <w:rFonts w:ascii="Times New Roman" w:hAnsi="Times New Roman" w:cs="Times New Roman" w:eastAsia="Times New Roman"/>
+          <w:b w:val="0"/>
+          <w:i w:val="0"/>
+          <w:sz w:val="24"/>
         </w:rPr>
         <w:t>T. Salim, S. Sun, Y. Abe, A. Krishna, A. C. Grimsdale, and Y. M. Lam, “Perovskite-based solar cells: Impact of materials processing and device architecture,” J. Mater. Chem. A 3(17), 8943–8969 (2015). doi:10.1039/C4TA05226A.</w:t>
       </w:r>
     </w:p>
     <w:p>
       <w:pPr>
-        <w:spacing w:line="192" w:lineRule="auto" w:before="10" w:after="10"/>
+        <w:spacing w:line="216" w:lineRule="auto" w:before="0" w:after="0"/>
         <w:ind w:left="454" w:hanging="454"/>
       </w:pPr>
       <w:r>
         <w:rPr>
-          <w:rFonts w:ascii="Times New Roman" w:hAnsi="Times New Roman"/>
-          <w:b w:val="0"/>
-          <w:i w:val="0"/>
-          <w:sz w:val="20"/>
+          <w:rFonts w:ascii="Times New Roman" w:hAnsi="Times New Roman" w:eastAsia="Times New Roman" w:cs="Times New Roman"/>
+          <w:b w:val="0"/>
+          <w:i w:val="0"/>
+          <w:sz w:val="24"/>
         </w:rPr>
         <w:t>[17] P. K. Dash, P. Banarjee, A. Nyayban, and S. Panda, “Optoelectronic properties and performance optimization for photovoltaic applications of R3m-RbGeX</w:t>
       </w:r>
       <w:r>
         <w:rPr>
-          <w:rFonts w:ascii="Times New Roman" w:hAnsi="Times New Roman"/>
-          <w:b w:val="0"/>
-          <w:i w:val="0"/>
-          <w:sz w:val="20"/>
+          <w:rFonts w:ascii="Times New Roman" w:hAnsi="Times New Roman" w:eastAsia="Times New Roman" w:cs="Times New Roman"/>
+          <w:b w:val="0"/>
+          <w:i w:val="0"/>
+          <w:sz w:val="24"/>
           <w:vertAlign w:val="subscript"/>
         </w:rPr>
         <w:t>3</w:t>
       </w:r>
       <w:r>
         <w:rPr>
-          <w:rFonts w:ascii="Times New Roman" w:hAnsi="Times New Roman"/>
-          <w:b w:val="0"/>
-          <w:i w:val="0"/>
-          <w:sz w:val="20"/>
+          <w:rFonts w:ascii="Times New Roman" w:hAnsi="Times New Roman" w:eastAsia="Times New Roman" w:cs="Times New Roman"/>
+          <w:b w:val="0"/>
+          <w:i w:val="0"/>
+          <w:sz w:val="24"/>
         </w:rPr>
         <w:t xml:space="preserve"> (X = Cl, Br, I) perovskites: A combined DFT and SCAPS-1D study,” arXiv:2505.09362 (2025).</w:t>
       </w:r>
     </w:p>
     <w:p>
       <w:pPr>
-        <w:spacing w:line="192" w:lineRule="auto" w:before="10" w:after="10"/>
+        <w:spacing w:line="216" w:lineRule="auto" w:before="0" w:after="0"/>
         <w:ind w:left="454" w:hanging="454"/>
       </w:pPr>
       <w:r>
         <w:rPr>
-          <w:rFonts w:ascii="Times New Roman" w:hAnsi="Times New Roman"/>
-          <w:b w:val="0"/>
-          <w:i w:val="0"/>
-          <w:sz w:val="20"/>
+          <w:rFonts w:ascii="Times New Roman" w:hAnsi="Times New Roman" w:eastAsia="Times New Roman" w:cs="Times New Roman"/>
+          <w:b w:val="0"/>
+          <w:i w:val="0"/>
+          <w:sz w:val="24"/>
         </w:rPr>
         <w:t>[18] N. A. Abdulkareem, “A DFT study of structural, electronic and optical properties of lead-free and Ge-based cubic perovskite RbGeX</w:t>
       </w:r>
       <w:r>
         <w:rPr>
-          <w:rFonts w:ascii="Times New Roman" w:hAnsi="Times New Roman"/>
-          <w:b w:val="0"/>
-          <w:i w:val="0"/>
-          <w:sz w:val="20"/>
+          <w:rFonts w:ascii="Times New Roman" w:hAnsi="Times New Roman" w:eastAsia="Times New Roman" w:cs="Times New Roman"/>
+          <w:b w:val="0"/>
+          <w:i w:val="0"/>
+          <w:sz w:val="24"/>
           <w:vertAlign w:val="subscript"/>
         </w:rPr>
         <w:t>3</w:t>
       </w:r>
       <w:r>
         <w:rPr>
-          <w:rFonts w:ascii="Times New Roman" w:hAnsi="Times New Roman"/>
-          <w:b w:val="0"/>
-          <w:i w:val="0"/>
-          <w:sz w:val="20"/>
+          <w:rFonts w:ascii="Times New Roman" w:hAnsi="Times New Roman" w:eastAsia="Times New Roman" w:cs="Times New Roman"/>
+          <w:b w:val="0"/>
+          <w:i w:val="0"/>
+          <w:sz w:val="24"/>
         </w:rPr>
         <w:t xml:space="preserve"> (X = I, Br and Cl),” Passer J. Basic Appl. Sci. 5(1), 46–51 (2023). doi:10.24271/psr.2023.371069.1187.</w:t>
       </w:r>
     </w:p>
     <w:p>
       <w:pPr>
-        <w:spacing w:line="192" w:lineRule="auto" w:before="10" w:after="10"/>
+        <w:spacing w:line="216" w:lineRule="auto" w:before="0" w:after="0"/>
         <w:ind w:left="454" w:hanging="454"/>
       </w:pPr>
       <w:r>
         <w:rPr>
-          <w:rFonts w:ascii="Times New Roman" w:hAnsi="Times New Roman" w:cs="Times New Roman"/>
-          <w:b w:val="0"/>
-          <w:i w:val="0"/>
-          <w:sz w:val="20"/>
+          <w:rFonts w:ascii="Times New Roman" w:hAnsi="Times New Roman" w:cs="Times New Roman" w:eastAsia="Times New Roman"/>
+          <w:b w:val="0"/>
+          <w:i w:val="0"/>
+          <w:sz w:val="24"/>
         </w:rPr>
         <w:t xml:space="preserve">[19] </w:t>
       </w:r>
       <w:r>
         <w:rPr>
-          <w:rFonts w:ascii="Times New Roman" w:hAnsi="Times New Roman" w:cs="Times New Roman"/>
-          <w:b w:val="0"/>
-          <w:i w:val="0"/>
-          <w:sz w:val="20"/>
+          <w:rFonts w:ascii="Times New Roman" w:hAnsi="Times New Roman" w:cs="Times New Roman" w:eastAsia="Times New Roman"/>
+          <w:b w:val="0"/>
+          <w:i w:val="0"/>
+          <w:sz w:val="24"/>
         </w:rPr>
         <w:t>M. Burgelman, P. Nollet, and S. Degrave, “Modelling polycrystalline semiconductor solar cells,” Thin Solid Films 361–362, 527–532 (2000). doi:10.1016/S0040-6090(99)00825-1.</w:t>
       </w:r>
     </w:p>
     <w:p>
       <w:pPr>
-        <w:spacing w:line="192" w:lineRule="auto" w:before="10" w:after="10"/>
+        <w:spacing w:line="216" w:lineRule="auto" w:before="0" w:after="0"/>
         <w:ind w:left="454" w:hanging="454"/>
       </w:pPr>
       <w:r>
         <w:rPr>
-          <w:rFonts w:ascii="Times New Roman" w:hAnsi="Times New Roman" w:cs="Times New Roman"/>
-          <w:b w:val="0"/>
-          <w:i w:val="0"/>
-          <w:sz w:val="20"/>
+          <w:rFonts w:ascii="Times New Roman" w:hAnsi="Times New Roman" w:cs="Times New Roman" w:eastAsia="Times New Roman"/>
+          <w:b w:val="0"/>
+          <w:i w:val="0"/>
+          <w:sz w:val="24"/>
         </w:rPr>
         <w:t xml:space="preserve">[20] M. Burgelman, M. Debucquoy, K. Decock, J. Verschraegen, and S. Degrave, SCAPS-1D simulation program for thin film solar cells, version 3.3.10 (ELIS, University of Gent, Belgium, 2024).</w:t>
       </w:r>
       <w:r>
         <w:rPr>
-          <w:rFonts w:ascii="Times New Roman" w:hAnsi="Times New Roman" w:cs="Times New Roman"/>
-          <w:b w:val="0"/>
-          <w:i w:val="0"/>
-          <w:sz w:val="20"/>
+          <w:rFonts w:ascii="Times New Roman" w:hAnsi="Times New Roman" w:cs="Times New Roman" w:eastAsia="Times New Roman"/>
+          <w:b w:val="0"/>
+          <w:i w:val="0"/>
+          <w:sz w:val="24"/>
         </w:rPr>
         <w:t/>
       </w:r>
       <w:r>
         <w:rPr>
-          <w:rFonts w:ascii="Times New Roman" w:hAnsi="Times New Roman" w:cs="Times New Roman"/>
+          <w:rFonts w:ascii="Times New Roman" w:hAnsi="Times New Roman" w:cs="Times New Roman" w:eastAsia="Times New Roman"/>
           <w:b w:val="0"/>
           <w:i w:val="0"/>
           <w:color w:val="0563C1"/>
-          <w:sz w:val="20"/>
+          <w:sz w:val="24"/>
           <w:u w:val="single"/>
         </w:rPr>
         <w:t xml:space="preserve"/>
@@ -19626,34 +19488,34 @@
     </w:p>
     <w:p>
       <w:pPr>
-        <w:spacing w:line="192" w:lineRule="auto" w:before="10" w:after="10"/>
+        <w:spacing w:line="216" w:lineRule="auto" w:before="0" w:after="0"/>
         <w:ind w:left="454" w:hanging="454"/>
       </w:pPr>
       <w:r>
         <w:rPr>
-          <w:rFonts w:ascii="Times New Roman" w:hAnsi="Times New Roman" w:cs="Times New Roman"/>
-          <w:b w:val="0"/>
-          <w:i w:val="0"/>
-          <w:sz w:val="20"/>
+          <w:rFonts w:ascii="Times New Roman" w:hAnsi="Times New Roman" w:cs="Times New Roman" w:eastAsia="Times New Roman"/>
+          <w:b w:val="0"/>
+          <w:i w:val="0"/>
+          <w:sz w:val="24"/>
         </w:rPr>
         <w:t xml:space="preserve">[21] A. Nakane, H. Tampo, M. Tamakoshi, S. Fujimoto, K. M. Kim, S. Kim, H. Shibata, S. Niki, and H. Fujiwara, “Quantitative determination of optical and recombination losses in thin-film photovoltaic devices based on external quantum efficiency analysis,” arXiv:1604.04491 (2016); published in J. Appl. Phys. 120, 064505 (2016), doi:10.1063/1.4960698.</w:t>
       </w:r>
       <w:r>
         <w:rPr>
-          <w:rFonts w:ascii="Times New Roman" w:hAnsi="Times New Roman" w:cs="Times New Roman"/>
-          <w:b w:val="0"/>
-          <w:i w:val="0"/>
-          <w:sz w:val="20"/>
+          <w:rFonts w:ascii="Times New Roman" w:hAnsi="Times New Roman" w:cs="Times New Roman" w:eastAsia="Times New Roman"/>
+          <w:b w:val="0"/>
+          <w:i w:val="0"/>
+          <w:sz w:val="24"/>
         </w:rPr>
         <w:t/>
       </w:r>
       <w:r>
         <w:rPr>
-          <w:rFonts w:ascii="Times New Roman" w:hAnsi="Times New Roman" w:cs="Times New Roman"/>
+          <w:rFonts w:ascii="Times New Roman" w:hAnsi="Times New Roman" w:cs="Times New Roman" w:eastAsia="Times New Roman"/>
           <w:b w:val="0"/>
           <w:i w:val="0"/>
           <w:color w:val="0563C1"/>
-          <w:sz w:val="20"/>
+          <w:sz w:val="24"/>
           <w:u w:val="single"/>
         </w:rPr>
         <w:t xml:space="preserve"/>
@@ -19661,569 +19523,569 @@
     </w:p>
     <w:p>
       <w:pPr>
-        <w:spacing w:line="192" w:lineRule="auto" w:before="10" w:after="10"/>
+        <w:spacing w:line="216" w:lineRule="auto" w:before="0" w:after="0"/>
         <w:ind w:left="454" w:hanging="454"/>
       </w:pPr>
       <w:r>
         <w:rPr>
-          <w:rFonts w:ascii="Times New Roman" w:hAnsi="Times New Roman"/>
-          <w:b w:val="0"/>
-          <w:i w:val="0"/>
-          <w:sz w:val="20"/>
+          <w:rFonts w:ascii="Times New Roman" w:hAnsi="Times New Roman" w:eastAsia="Times New Roman" w:cs="Times New Roman"/>
+          <w:b w:val="0"/>
+          <w:i w:val="0"/>
+          <w:sz w:val="24"/>
         </w:rPr>
         <w:t>[22] L. Loumachi, A. Yousfi, O. Saidani, and A. S. Alsubaie, “Strengthen the power conversion efficiency of solar cell based RbGeI</w:t>
       </w:r>
       <w:r>
         <w:rPr>
-          <w:rFonts w:ascii="Times New Roman" w:hAnsi="Times New Roman"/>
-          <w:b w:val="0"/>
-          <w:i w:val="0"/>
-          <w:sz w:val="20"/>
+          <w:rFonts w:ascii="Times New Roman" w:hAnsi="Times New Roman" w:eastAsia="Times New Roman" w:cs="Times New Roman"/>
+          <w:b w:val="0"/>
+          <w:i w:val="0"/>
+          <w:sz w:val="24"/>
           <w:vertAlign w:val="subscript"/>
         </w:rPr>
         <w:t>3</w:t>
       </w:r>
       <w:r>
         <w:rPr>
-          <w:rFonts w:ascii="Times New Roman" w:hAnsi="Times New Roman"/>
-          <w:b w:val="0"/>
-          <w:i w:val="0"/>
-          <w:sz w:val="20"/>
+          <w:rFonts w:ascii="Times New Roman" w:hAnsi="Times New Roman" w:eastAsia="Times New Roman" w:cs="Times New Roman"/>
+          <w:b w:val="0"/>
+          <w:i w:val="0"/>
+          <w:sz w:val="24"/>
         </w:rPr>
         <w:t>: Numerical approach,” East Eur. J. Phys. (3), 416–424 (2024). doi:10.26565/2312-4334-2024-3-50</w:t>
       </w:r>
     </w:p>
     <w:p>
       <w:pPr>
-        <w:spacing w:line="192" w:lineRule="auto" w:before="10" w:after="10"/>
+        <w:spacing w:line="216" w:lineRule="auto" w:before="0" w:after="0"/>
         <w:ind w:left="454" w:hanging="454"/>
       </w:pPr>
       <w:r>
         <w:rPr>
-          <w:rFonts w:ascii="Times New Roman" w:hAnsi="Times New Roman"/>
-          <w:b w:val="0"/>
-          <w:i w:val="0"/>
-          <w:sz w:val="20"/>
+          <w:rFonts w:ascii="Times New Roman" w:hAnsi="Times New Roman" w:eastAsia="Times New Roman" w:cs="Times New Roman"/>
+          <w:b w:val="0"/>
+          <w:i w:val="0"/>
+          <w:sz w:val="24"/>
         </w:rPr>
         <w:t>[23] A. Pathak, K. M. D. Pravalli, R. Madaka, B. Pandey, D. Shankar, C. S. Beera, and D. J. Rao, “Computational analysis of germanium-based perovskites (MAGeI</w:t>
       </w:r>
       <w:r>
         <w:rPr>
-          <w:rFonts w:ascii="Times New Roman" w:hAnsi="Times New Roman"/>
-          <w:b w:val="0"/>
-          <w:i w:val="0"/>
-          <w:sz w:val="20"/>
+          <w:rFonts w:ascii="Times New Roman" w:hAnsi="Times New Roman" w:eastAsia="Times New Roman" w:cs="Times New Roman"/>
+          <w:b w:val="0"/>
+          <w:i w:val="0"/>
+          <w:sz w:val="24"/>
           <w:vertAlign w:val="subscript"/>
         </w:rPr>
         <w:t>3</w:t>
       </w:r>
       <w:r>
         <w:rPr>
-          <w:rFonts w:ascii="Times New Roman" w:hAnsi="Times New Roman"/>
-          <w:b w:val="0"/>
-          <w:i w:val="0"/>
-          <w:sz w:val="20"/>
+          <w:rFonts w:ascii="Times New Roman" w:hAnsi="Times New Roman" w:eastAsia="Times New Roman" w:cs="Times New Roman"/>
+          <w:b w:val="0"/>
+          <w:i w:val="0"/>
+          <w:sz w:val="24"/>
         </w:rPr>
         <w:t>, FAGeI</w:t>
       </w:r>
       <w:r>
         <w:rPr>
-          <w:rFonts w:ascii="Times New Roman" w:hAnsi="Times New Roman"/>
-          <w:b w:val="0"/>
-          <w:i w:val="0"/>
-          <w:sz w:val="20"/>
+          <w:rFonts w:ascii="Times New Roman" w:hAnsi="Times New Roman" w:eastAsia="Times New Roman" w:cs="Times New Roman"/>
+          <w:b w:val="0"/>
+          <w:i w:val="0"/>
+          <w:sz w:val="24"/>
           <w:vertAlign w:val="subscript"/>
         </w:rPr>
         <w:t>3</w:t>
       </w:r>
       <w:r>
         <w:rPr>
-          <w:rFonts w:ascii="Times New Roman" w:hAnsi="Times New Roman"/>
-          <w:b w:val="0"/>
-          <w:i w:val="0"/>
-          <w:sz w:val="20"/>
+          <w:rFonts w:ascii="Times New Roman" w:hAnsi="Times New Roman" w:eastAsia="Times New Roman" w:cs="Times New Roman"/>
+          <w:b w:val="0"/>
+          <w:i w:val="0"/>
+          <w:sz w:val="24"/>
         </w:rPr>
         <w:t>, CsGeI</w:t>
       </w:r>
       <w:r>
         <w:rPr>
-          <w:rFonts w:ascii="Times New Roman" w:hAnsi="Times New Roman"/>
-          <w:b w:val="0"/>
-          <w:i w:val="0"/>
-          <w:sz w:val="20"/>
+          <w:rFonts w:ascii="Times New Roman" w:hAnsi="Times New Roman" w:eastAsia="Times New Roman" w:cs="Times New Roman"/>
+          <w:b w:val="0"/>
+          <w:i w:val="0"/>
+          <w:sz w:val="24"/>
           <w:vertAlign w:val="subscript"/>
         </w:rPr>
         <w:t>3</w:t>
       </w:r>
       <w:r>
         <w:rPr>
-          <w:rFonts w:ascii="Times New Roman" w:hAnsi="Times New Roman"/>
-          <w:b w:val="0"/>
-          <w:i w:val="0"/>
-          <w:sz w:val="20"/>
+          <w:rFonts w:ascii="Times New Roman" w:hAnsi="Times New Roman" w:eastAsia="Times New Roman" w:cs="Times New Roman"/>
+          <w:b w:val="0"/>
+          <w:i w:val="0"/>
+          <w:sz w:val="24"/>
         </w:rPr>
         <w:t>, RbGeI</w:t>
       </w:r>
       <w:r>
         <w:rPr>
-          <w:rFonts w:ascii="Times New Roman" w:hAnsi="Times New Roman"/>
-          <w:b w:val="0"/>
-          <w:i w:val="0"/>
-          <w:sz w:val="20"/>
+          <w:rFonts w:ascii="Times New Roman" w:hAnsi="Times New Roman" w:eastAsia="Times New Roman" w:cs="Times New Roman"/>
+          <w:b w:val="0"/>
+          <w:i w:val="0"/>
+          <w:sz w:val="24"/>
           <w:vertAlign w:val="subscript"/>
         </w:rPr>
         <w:t>3</w:t>
       </w:r>
       <w:r>
         <w:rPr>
-          <w:rFonts w:ascii="Times New Roman" w:hAnsi="Times New Roman"/>
-          <w:b w:val="0"/>
-          <w:i w:val="0"/>
-          <w:sz w:val="20"/>
+          <w:rFonts w:ascii="Times New Roman" w:hAnsi="Times New Roman" w:eastAsia="Times New Roman" w:cs="Times New Roman"/>
+          <w:b w:val="0"/>
+          <w:i w:val="0"/>
+          <w:sz w:val="24"/>
         </w:rPr>
         <w:t>) for high-efficiency solar cells using SCAPS-1D,” Research Square (2026). doi:10.21203/rs.3.rs-8749975/</w:t>
       </w:r>
     </w:p>
     <w:p>
       <w:pPr>
-        <w:spacing w:line="192" w:lineRule="auto" w:before="10" w:after="10"/>
+        <w:spacing w:line="216" w:lineRule="auto" w:before="0" w:after="0"/>
         <w:ind w:left="454" w:hanging="454"/>
       </w:pPr>
       <w:r>
         <w:rPr>
-          <w:rFonts w:ascii="Times New Roman" w:hAnsi="Times New Roman"/>
-          <w:b w:val="0"/>
-          <w:i w:val="0"/>
-          <w:sz w:val="20"/>
+          <w:rFonts w:ascii="Times New Roman" w:hAnsi="Times New Roman" w:eastAsia="Times New Roman" w:cs="Times New Roman"/>
+          <w:b w:val="0"/>
+          <w:i w:val="0"/>
+          <w:sz w:val="24"/>
         </w:rPr>
         <w:t>[24] D. Saikia, J. Bera, A. Betal, and S. Sahu, “Performance evaluation of an all inorganic CsGeI</w:t>
       </w:r>
       <w:r>
         <w:rPr>
-          <w:rFonts w:ascii="Times New Roman" w:hAnsi="Times New Roman"/>
-          <w:b w:val="0"/>
-          <w:i w:val="0"/>
-          <w:sz w:val="20"/>
+          <w:rFonts w:ascii="Times New Roman" w:hAnsi="Times New Roman" w:eastAsia="Times New Roman" w:cs="Times New Roman"/>
+          <w:b w:val="0"/>
+          <w:i w:val="0"/>
+          <w:sz w:val="24"/>
           <w:vertAlign w:val="subscript"/>
         </w:rPr>
         <w:t>3</w:t>
       </w:r>
       <w:r>
         <w:rPr>
-          <w:rFonts w:ascii="Times New Roman" w:hAnsi="Times New Roman"/>
-          <w:b w:val="0"/>
-          <w:i w:val="0"/>
-          <w:sz w:val="20"/>
+          <w:rFonts w:ascii="Times New Roman" w:hAnsi="Times New Roman" w:eastAsia="Times New Roman" w:cs="Times New Roman"/>
+          <w:b w:val="0"/>
+          <w:i w:val="0"/>
+          <w:sz w:val="24"/>
         </w:rPr>
         <w:t xml:space="preserve"> based perovskite solar cell by numerical simulation,” Opt. Mater. 123, 111839 (2022). doi:10.1016/j.optmat.2021.111839.</w:t>
       </w:r>
     </w:p>
     <w:p>
       <w:pPr>
-        <w:spacing w:line="192" w:lineRule="auto" w:before="10" w:after="10"/>
+        <w:spacing w:line="216" w:lineRule="auto" w:before="0" w:after="0"/>
         <w:ind w:left="454" w:hanging="454"/>
       </w:pPr>
       <w:r>
         <w:rPr>
-          <w:rFonts w:ascii="Times New Roman" w:hAnsi="Times New Roman" w:cs="Times New Roman"/>
-          <w:b w:val="0"/>
-          <w:i w:val="0"/>
-          <w:sz w:val="20"/>
+          <w:rFonts w:ascii="Times New Roman" w:hAnsi="Times New Roman" w:cs="Times New Roman" w:eastAsia="Times New Roman"/>
+          <w:b w:val="0"/>
+          <w:i w:val="0"/>
+          <w:sz w:val="24"/>
         </w:rPr>
         <w:t xml:space="preserve">[25] R. Pau et al., “Solution-processed CuI as a hole transport layer for Sn–Pb perovskite solar cells,” J. Mater. Chem. A 13(48), 42118–42127 (2025). doi:10.1039/D5TA06770G.</w:t>
       </w:r>
     </w:p>
     <w:p>
       <w:pPr>
-        <w:spacing w:line="192" w:lineRule="auto" w:before="10" w:after="10"/>
+        <w:spacing w:line="216" w:lineRule="auto" w:before="0" w:after="0"/>
         <w:ind w:left="454" w:hanging="454"/>
       </w:pPr>
       <w:r>
         <w:rPr>
-          <w:rFonts w:ascii="Times New Roman" w:hAnsi="Times New Roman" w:cs="Times New Roman"/>
-          <w:b w:val="0"/>
-          <w:i w:val="0"/>
-          <w:sz w:val="20"/>
+          <w:rFonts w:ascii="Times New Roman" w:hAnsi="Times New Roman" w:cs="Times New Roman" w:eastAsia="Times New Roman"/>
+          <w:b w:val="0"/>
+          <w:i w:val="0"/>
+          <w:sz w:val="24"/>
         </w:rPr>
         <w:t xml:space="preserve">[26] Q. Sun, A. Sadhu, S. Lie, and L. H. Wong, “Critical review of Cu-based hole transport materials for perovskite solar cells: From theoretical insights to experimental validation,” Adv. Mater. (2024). doi:10.1002/adma.202402412.</w:t>
       </w:r>
     </w:p>
     <w:p>
       <w:pPr>
-        <w:spacing w:line="192" w:lineRule="auto" w:before="10" w:after="10"/>
+        <w:spacing w:line="216" w:lineRule="auto" w:before="0" w:after="0"/>
         <w:ind w:left="454" w:hanging="454"/>
       </w:pPr>
       <w:r>
         <w:rPr>
-          <w:rFonts w:ascii="Times New Roman" w:hAnsi="Times New Roman" w:cs="Times New Roman"/>
-          <w:b w:val="0"/>
-          <w:i w:val="0"/>
-          <w:sz w:val="20"/>
+          <w:rFonts w:ascii="Times New Roman" w:hAnsi="Times New Roman" w:cs="Times New Roman" w:eastAsia="Times New Roman"/>
+          <w:b w:val="0"/>
+          <w:i w:val="0"/>
+          <w:sz w:val="24"/>
         </w:rPr>
         <w:t xml:space="preserve">[27] J. Z. Mbese, “Advancements in inorganic hole-transport materials for perovskite solar cells: A comparative review,” Energies 18(9), 2374 (2025). doi:10.3390/en18092374.</w:t>
       </w:r>
     </w:p>
     <w:p>
       <w:pPr>
-        <w:spacing w:line="192" w:lineRule="auto" w:before="10" w:after="10"/>
+        <w:spacing w:line="216" w:lineRule="auto" w:before="0" w:after="0"/>
         <w:ind w:left="454" w:hanging="454"/>
       </w:pPr>
       <w:r>
         <w:rPr>
-          <w:rFonts w:ascii="Times New Roman" w:hAnsi="Times New Roman" w:cs="Times New Roman"/>
-          <w:b w:val="0"/>
-          <w:i w:val="0"/>
-          <w:sz w:val="20"/>
+          <w:rFonts w:ascii="Times New Roman" w:hAnsi="Times New Roman" w:cs="Times New Roman" w:eastAsia="Times New Roman"/>
+          <w:b w:val="0"/>
+          <w:i w:val="0"/>
+          <w:sz w:val="24"/>
         </w:rPr>
         <w:t xml:space="preserve">[28] L. T. C. Tuyen, S.-R. Jian, N. T. Tien, and P. H. Le, “Nanomechanical and material properties of fluorine-doped tin oxide thin films prepared by ultrasonic spray pyrolysis: Effects of F-doping,” Materials 12(10), 1665 (2019). doi:10.3390/ma12101665.</w:t>
       </w:r>
     </w:p>
     <w:p>
       <w:pPr>
-        <w:spacing w:line="192" w:lineRule="auto" w:before="10" w:after="10"/>
+        <w:spacing w:line="216" w:lineRule="auto" w:before="0" w:after="0"/>
         <w:ind w:left="454" w:hanging="454"/>
       </w:pPr>
       <w:r>
         <w:rPr>
-          <w:rFonts w:ascii="Times New Roman" w:hAnsi="Times New Roman" w:cs="Times New Roman"/>
-          <w:b w:val="0"/>
-          <w:i w:val="0"/>
-          <w:sz w:val="20"/>
+          <w:rFonts w:ascii="Times New Roman" w:hAnsi="Times New Roman" w:cs="Times New Roman" w:eastAsia="Times New Roman"/>
+          <w:b w:val="0"/>
+          <w:i w:val="0"/>
+          <w:sz w:val="24"/>
         </w:rPr>
         <w:t xml:space="preserve">[29] W. Yang et al., “The CuI/NiO gradient hole transport layer for enhanced carrier efficiency in large-area perovskite solar cell,” Appl. Phys. Lett. 128(14) (2026). doi:10.1063/5.0326539.</w:t>
       </w:r>
     </w:p>
     <w:p>
       <w:pPr>
-        <w:spacing w:line="192" w:lineRule="auto" w:before="10" w:after="10"/>
+        <w:spacing w:line="216" w:lineRule="auto" w:before="0" w:after="0"/>
         <w:ind w:left="454" w:hanging="454"/>
       </w:pPr>
       <w:r>
         <w:rPr>
-          <w:rFonts w:ascii="Times New Roman" w:hAnsi="Times New Roman"/>
-          <w:b w:val="0"/>
-          <w:i w:val="0"/>
-          <w:sz w:val="20"/>
+          <w:rFonts w:ascii="Times New Roman" w:hAnsi="Times New Roman" w:eastAsia="Times New Roman" w:cs="Times New Roman"/>
+          <w:b w:val="0"/>
+          <w:i w:val="0"/>
+          <w:sz w:val="24"/>
         </w:rPr>
         <w:t xml:space="preserve">[30] A. J. Olasoji and S. H. Im, “Perspective chapter: </w:t>
       </w:r>
       <w:r>
         <w:rPr>
-          <w:rFonts w:ascii="Times New Roman" w:hAnsi="Times New Roman"/>
-          <w:b w:val="0"/>
-          <w:i w:val="0"/>
-          <w:sz w:val="20"/>
+          <w:rFonts w:ascii="Times New Roman" w:hAnsi="Times New Roman" w:eastAsia="Times New Roman" w:cs="Times New Roman"/>
+          <w:b w:val="0"/>
+          <w:i w:val="0"/>
+          <w:sz w:val="24"/>
         </w:rPr>
         <w:t xml:space="preserve">TiO</w:t>
       </w:r>
       <w:r>
         <w:rPr>
-          <w:rFonts w:ascii="Times New Roman" w:hAnsi="Times New Roman"/>
-          <w:b w:val="0"/>
-          <w:i w:val="0"/>
-          <w:sz w:val="20"/>
+          <w:rFonts w:ascii="Times New Roman" w:hAnsi="Times New Roman" w:eastAsia="Times New Roman" w:cs="Times New Roman"/>
+          <w:b w:val="0"/>
+          <w:i w:val="0"/>
+          <w:sz w:val="24"/>
           <w:vertAlign w:val="subscript"/>
         </w:rPr>
         <w:t xml:space="preserve">2</w:t>
       </w:r>
       <w:r>
         <w:rPr>
-          <w:rFonts w:ascii="Times New Roman" w:hAnsi="Times New Roman"/>
-          <w:b w:val="0"/>
-          <w:i w:val="0"/>
-          <w:sz w:val="20"/>
+          <w:rFonts w:ascii="Times New Roman" w:hAnsi="Times New Roman" w:eastAsia="Times New Roman" w:cs="Times New Roman"/>
+          <w:b w:val="0"/>
+          <w:i w:val="0"/>
+          <w:sz w:val="24"/>
         </w:rPr>
         <w:t xml:space="preserve"> electron transporting layers for perovskite solar cells,” in Titanium Dioxide – Uses, Applications, and Advances (IntechOpen, 2024). doi:10.5772/intechopen.1007266.</w:t>
       </w:r>
     </w:p>
     <w:p>
       <w:pPr>
-        <w:spacing w:line="192" w:lineRule="auto" w:before="10" w:after="10"/>
+        <w:spacing w:line="216" w:lineRule="auto" w:before="0" w:after="0"/>
         <w:ind w:left="454" w:hanging="454"/>
       </w:pPr>
       <w:r>
         <w:rPr>
-          <w:rFonts w:ascii="Times New Roman" w:hAnsi="Times New Roman" w:cs="Times New Roman"/>
-          <w:b w:val="0"/>
-          <w:i w:val="0"/>
-          <w:sz w:val="20"/>
+          <w:rFonts w:ascii="Times New Roman" w:hAnsi="Times New Roman" w:cs="Times New Roman" w:eastAsia="Times New Roman"/>
+          <w:b w:val="0"/>
+          <w:i w:val="0"/>
+          <w:sz w:val="24"/>
         </w:rPr>
         <w:t xml:space="preserve">[31] K. Valadi, S. Gharibi, R. Taheri-Ledari, S. Akin, A. Maleki, and A. E. Shalan, “Metal oxide electron transport materials for perovskite solar cells: A review,” Environ. Chem. Lett. 19(3), 2185–2207 (2021). doi:10.1007/s10311-020-01171-x.</w:t>
       </w:r>
     </w:p>
     <w:p>
       <w:pPr>
-        <w:spacing w:line="192" w:lineRule="auto" w:before="10" w:after="10"/>
+        <w:spacing w:line="216" w:lineRule="auto" w:before="0" w:after="0"/>
         <w:ind w:left="454" w:hanging="454"/>
       </w:pPr>
       <w:r>
         <w:rPr>
-          <w:rFonts w:ascii="Times New Roman" w:hAnsi="Times New Roman"/>
-          <w:b w:val="0"/>
-          <w:i w:val="0"/>
-          <w:sz w:val="20"/>
+          <w:rFonts w:ascii="Times New Roman" w:hAnsi="Times New Roman" w:eastAsia="Times New Roman" w:cs="Times New Roman"/>
+          <w:b w:val="0"/>
+          <w:i w:val="0"/>
+          <w:sz w:val="24"/>
         </w:rPr>
         <w:t xml:space="preserve">[32] L. Ji, T. Zhang, and S. Li, “Band alignment of </w:t>
       </w:r>
       <w:r>
         <w:rPr>
-          <w:rFonts w:ascii="Times New Roman" w:hAnsi="Times New Roman"/>
-          <w:b w:val="0"/>
-          <w:i w:val="0"/>
-          <w:sz w:val="20"/>
+          <w:rFonts w:ascii="Times New Roman" w:hAnsi="Times New Roman" w:eastAsia="Times New Roman" w:cs="Times New Roman"/>
+          <w:b w:val="0"/>
+          <w:i w:val="0"/>
+          <w:sz w:val="24"/>
         </w:rPr>
         <w:t xml:space="preserve">TiO</w:t>
       </w:r>
       <w:r>
         <w:rPr>
-          <w:rFonts w:ascii="Times New Roman" w:hAnsi="Times New Roman"/>
-          <w:b w:val="0"/>
-          <w:i w:val="0"/>
-          <w:sz w:val="20"/>
+          <w:rFonts w:ascii="Times New Roman" w:hAnsi="Times New Roman" w:eastAsia="Times New Roman" w:cs="Times New Roman"/>
+          <w:b w:val="0"/>
+          <w:i w:val="0"/>
+          <w:sz w:val="24"/>
           <w:vertAlign w:val="subscript"/>
         </w:rPr>
         <w:t xml:space="preserve">2</w:t>
       </w:r>
       <w:r>
         <w:rPr>
-          <w:rFonts w:ascii="Times New Roman" w:hAnsi="Times New Roman"/>
-          <w:b w:val="0"/>
-          <w:i w:val="0"/>
-          <w:sz w:val="20"/>
+          <w:rFonts w:ascii="Times New Roman" w:hAnsi="Times New Roman" w:eastAsia="Times New Roman" w:cs="Times New Roman"/>
+          <w:b w:val="0"/>
+          <w:i w:val="0"/>
+          <w:sz w:val="24"/>
         </w:rPr>
         <w:t xml:space="preserve"> by controlling Cl content for high-efficiency perovskite solar cells,” J. Mater. Chem. C 12(36), 14597–14604 (2024). doi:10.1039/D4TC01495B.</w:t>
       </w:r>
     </w:p>
     <w:p>
       <w:pPr>
-        <w:spacing w:line="192" w:lineRule="auto" w:before="10" w:after="10"/>
+        <w:spacing w:line="216" w:lineRule="auto" w:before="0" w:after="0"/>
         <w:ind w:left="454" w:hanging="454"/>
       </w:pPr>
       <w:r>
         <w:rPr>
-          <w:rFonts w:ascii="Times New Roman" w:hAnsi="Times New Roman" w:cs="Times New Roman"/>
-          <w:b w:val="0"/>
-          <w:i w:val="0"/>
-          <w:sz w:val="20"/>
+          <w:rFonts w:ascii="Times New Roman" w:hAnsi="Times New Roman" w:cs="Times New Roman" w:eastAsia="Times New Roman"/>
+          <w:b w:val="0"/>
+          <w:i w:val="0"/>
+          <w:sz w:val="24"/>
         </w:rPr>
         <w:t xml:space="preserve">[33] A. Ghosh et al., “Solar power conversion: CuI hole transport layer and Ba3NCl3 absorber enable advanced solar cell technology boosting efficiency over 30%,” RSC Adv. 14(33), 24066–24081 (2024). doi:10.1039/D4RA03695F.</w:t>
       </w:r>
     </w:p>
     <w:p>
       <w:pPr>
-        <w:spacing w:line="192" w:lineRule="auto" w:before="10" w:after="10"/>
+        <w:spacing w:line="216" w:lineRule="auto" w:before="0" w:after="0"/>
         <w:ind w:left="454" w:hanging="454"/>
       </w:pPr>
       <w:r>
         <w:rPr>
-          <w:rFonts w:ascii="Times New Roman" w:hAnsi="Times New Roman" w:cs="Times New Roman"/>
-          <w:b w:val="0"/>
-          <w:i w:val="0"/>
-          <w:sz w:val="20"/>
+          <w:rFonts w:ascii="Times New Roman" w:hAnsi="Times New Roman" w:cs="Times New Roman" w:eastAsia="Times New Roman"/>
+          <w:b w:val="0"/>
+          <w:i w:val="0"/>
+          <w:sz w:val="24"/>
         </w:rPr>
         <w:t xml:space="preserve">[34] T. Minemoto and M. Murata, “Impact of work function of back contact of perovskite solar cells without hole transport material analyzed by device simulation,” Curr. Appl. Phys. 14(11), 1428–1433 (2014). doi:10.1016/j.cap.2014.08.002.</w:t>
       </w:r>
     </w:p>
     <w:p>
       <w:pPr>
-        <w:spacing w:line="192" w:lineRule="auto" w:before="10" w:after="10"/>
+        <w:spacing w:line="216" w:lineRule="auto" w:before="0" w:after="0"/>
         <w:ind w:left="454" w:hanging="454"/>
       </w:pPr>
       <w:r>
         <w:rPr>
-          <w:rFonts w:ascii="Times New Roman" w:hAnsi="Times New Roman" w:cs="Times New Roman"/>
-          <w:b w:val="0"/>
-          <w:i w:val="0"/>
-          <w:sz w:val="20"/>
+          <w:rFonts w:ascii="Times New Roman" w:hAnsi="Times New Roman" w:cs="Times New Roman" w:eastAsia="Times New Roman"/>
+          <w:b w:val="0"/>
+          <w:i w:val="0"/>
+          <w:sz w:val="24"/>
         </w:rPr>
         <w:t xml:space="preserve">[35] W. Shockley and H. J. Queisser, “Detailed balance limit of efficiency of p-n junction solar cells,” J. Appl. Phys. 32(3), 510–519 (1961). doi:10.1063/1.1736034.</w:t>
       </w:r>
     </w:p>
     <w:p>
       <w:pPr>
-        <w:spacing w:line="192" w:lineRule="auto" w:before="10" w:after="10"/>
+        <w:spacing w:line="216" w:lineRule="auto" w:before="0" w:after="0"/>
         <w:ind w:left="454" w:hanging="454"/>
       </w:pPr>
       <w:r>
         <w:rPr>
-          <w:rFonts w:ascii="Times New Roman" w:hAnsi="Times New Roman"/>
-          <w:b w:val="0"/>
-          <w:i w:val="0"/>
-          <w:sz w:val="20"/>
+          <w:rFonts w:ascii="Times New Roman" w:hAnsi="Times New Roman" w:eastAsia="Times New Roman" w:cs="Times New Roman"/>
+          <w:b w:val="0"/>
+          <w:i w:val="0"/>
+          <w:sz w:val="24"/>
         </w:rPr>
         <w:t xml:space="preserve">[36] S. Rühle, “Tabulated values of the Shockley–Queisser limit for single junction solar cells,” Sol. Energy 130, 139–147 (2016). doi:10.1016/j.solener.2016.02.015.</w:t>
       </w:r>
     </w:p>
     <w:p>
       <w:pPr>
-        <w:spacing w:line="192" w:lineRule="auto" w:before="10" w:after="10"/>
+        <w:spacing w:line="216" w:lineRule="auto" w:before="0" w:after="0"/>
         <w:ind w:left="454" w:hanging="454"/>
       </w:pPr>
       <w:r>
         <w:rPr>
-          <w:rFonts w:ascii="Times New Roman" w:hAnsi="Times New Roman"/>
-          <w:b w:val="0"/>
-          <w:i w:val="0"/>
-          <w:sz w:val="20"/>
+          <w:rFonts w:ascii="Times New Roman" w:hAnsi="Times New Roman" w:eastAsia="Times New Roman" w:cs="Times New Roman"/>
+          <w:b w:val="0"/>
+          <w:i w:val="0"/>
+          <w:sz w:val="24"/>
         </w:rPr>
         <w:t xml:space="preserve">[37] C. H. Henry, “Limiting efficiencies of ideal single and multiple energy gap terrestrial solar cells,” J. Appl. Phys. 51(8), 4494–4500 (1980). doi:10.1063/1.328272.</w:t>
       </w:r>
     </w:p>
     <w:p>
       <w:pPr>
-        <w:spacing w:line="192" w:lineRule="auto" w:before="10" w:after="10"/>
+        <w:spacing w:line="216" w:lineRule="auto" w:before="0" w:after="0"/>
         <w:ind w:left="454" w:hanging="454"/>
       </w:pPr>
       <w:r>
         <w:rPr>
-          <w:rFonts w:ascii="Times New Roman" w:hAnsi="Times New Roman" w:cs="Times New Roman"/>
-          <w:b w:val="0"/>
-          <w:i w:val="0"/>
-          <w:sz w:val="20"/>
+          <w:rFonts w:ascii="Times New Roman" w:hAnsi="Times New Roman" w:cs="Times New Roman" w:eastAsia="Times New Roman"/>
+          <w:b w:val="0"/>
+          <w:i w:val="0"/>
+          <w:sz w:val="24"/>
         </w:rPr>
         <w:t xml:space="preserve">[38] O. J. Sandberg and A. Armin, “On the effect of surface recombination in thin film solar cells, light emitting diodes and photodetectors,” arXiv:1905.07291 (2019); published in Synth. Met. 254, 114–121 (2019), doi:10.1016/j.synthmet.2019.06.008.</w:t>
       </w:r>
     </w:p>
     <w:p>
       <w:pPr>
-        <w:spacing w:line="192" w:lineRule="auto" w:before="10" w:after="10"/>
+        <w:spacing w:line="216" w:lineRule="auto" w:before="0" w:after="0"/>
         <w:ind w:left="454" w:hanging="454"/>
       </w:pPr>
       <w:r>
         <w:rPr>
-          <w:rFonts w:ascii="Times New Roman" w:hAnsi="Times New Roman"/>
-          <w:b w:val="0"/>
-          <w:i w:val="0"/>
-          <w:sz w:val="20"/>
+          <w:rFonts w:ascii="Times New Roman" w:hAnsi="Times New Roman" w:eastAsia="Times New Roman" w:cs="Times New Roman"/>
+          <w:b w:val="0"/>
+          <w:i w:val="0"/>
+          <w:sz w:val="24"/>
         </w:rPr>
         <w:t xml:space="preserve">[39] M. Raj, A. Aggarwal, A. Kushwaha, and N. Goel, “Moisture-resistant sustainable solar cell with </w:t>
       </w:r>
       <w:r>
         <w:rPr>
-          <w:rFonts w:ascii="Times New Roman" w:hAnsi="Times New Roman"/>
-          <w:b w:val="0"/>
-          <w:i w:val="0"/>
-          <w:sz w:val="20"/>
+          <w:rFonts w:ascii="Times New Roman" w:hAnsi="Times New Roman" w:eastAsia="Times New Roman" w:cs="Times New Roman"/>
+          <w:b w:val="0"/>
+          <w:i w:val="0"/>
+          <w:sz w:val="24"/>
         </w:rPr>
         <w:t xml:space="preserve">RbGeI</w:t>
       </w:r>
       <w:r>
         <w:rPr>
-          <w:rFonts w:ascii="Times New Roman" w:hAnsi="Times New Roman"/>
-          <w:b w:val="0"/>
-          <w:i w:val="0"/>
-          <w:sz w:val="20"/>
+          <w:rFonts w:ascii="Times New Roman" w:hAnsi="Times New Roman" w:eastAsia="Times New Roman" w:cs="Times New Roman"/>
+          <w:b w:val="0"/>
+          <w:i w:val="0"/>
+          <w:sz w:val="24"/>
           <w:vertAlign w:val="subscript"/>
         </w:rPr>
         <w:t xml:space="preserve">3</w:t>
       </w:r>
       <w:r>
         <w:rPr>
-          <w:rFonts w:ascii="Times New Roman" w:hAnsi="Times New Roman"/>
-          <w:b w:val="0"/>
-          <w:i w:val="0"/>
-          <w:sz w:val="20"/>
+          <w:rFonts w:ascii="Times New Roman" w:hAnsi="Times New Roman" w:eastAsia="Times New Roman" w:cs="Times New Roman"/>
+          <w:b w:val="0"/>
+          <w:i w:val="0"/>
+          <w:sz w:val="24"/>
         </w:rPr>
         <w:t xml:space="preserve"> absorber layer,” J. Mater. Sci. 60(22), 9176–9196 (2025). doi:10.1007/s10853-025-11002-5.</w:t>
       </w:r>
     </w:p>
     <w:p>
       <w:pPr>
-        <w:spacing w:line="192" w:lineRule="auto" w:before="10" w:after="10"/>
+        <w:spacing w:line="216" w:lineRule="auto" w:before="0" w:after="0"/>
         <w:ind w:left="454" w:hanging="454"/>
       </w:pPr>
       <w:r>
         <w:rPr>
-          <w:rFonts w:ascii="Times New Roman" w:hAnsi="Times New Roman"/>
-          <w:b w:val="0"/>
-          <w:i w:val="0"/>
-          <w:sz w:val="20"/>
+          <w:rFonts w:ascii="Times New Roman" w:hAnsi="Times New Roman" w:eastAsia="Times New Roman" w:cs="Times New Roman"/>
+          <w:b w:val="0"/>
+          <w:i w:val="0"/>
+          <w:sz w:val="24"/>
         </w:rPr>
         <w:t xml:space="preserve">[40] H.-J. Park, H. Son, and B.-S. Jeong, “SCAPS-1D Simulation for Device Optimization to Improve Efficiency in Lead-Free </w:t>
       </w:r>
       <w:r>
         <w:rPr>
-          <w:rFonts w:ascii="Times New Roman" w:hAnsi="Times New Roman"/>
-          <w:b w:val="0"/>
-          <w:i w:val="0"/>
-          <w:sz w:val="20"/>
+          <w:rFonts w:ascii="Times New Roman" w:hAnsi="Times New Roman" w:eastAsia="Times New Roman" w:cs="Times New Roman"/>
+          <w:b w:val="0"/>
+          <w:i w:val="0"/>
+          <w:sz w:val="24"/>
         </w:rPr>
         <w:t xml:space="preserve">CsSnI</w:t>
       </w:r>
       <w:r>
         <w:rPr>
-          <w:rFonts w:ascii="Times New Roman" w:hAnsi="Times New Roman"/>
-          <w:b w:val="0"/>
-          <w:i w:val="0"/>
-          <w:sz w:val="20"/>
+          <w:rFonts w:ascii="Times New Roman" w:hAnsi="Times New Roman" w:eastAsia="Times New Roman" w:cs="Times New Roman"/>
+          <w:b w:val="0"/>
+          <w:i w:val="0"/>
+          <w:sz w:val="24"/>
           <w:vertAlign w:val="subscript"/>
         </w:rPr>
         <w:t xml:space="preserve">3</w:t>
       </w:r>
       <w:r>
         <w:rPr>
-          <w:rFonts w:ascii="Times New Roman" w:hAnsi="Times New Roman"/>
-          <w:b w:val="0"/>
-          <w:i w:val="0"/>
-          <w:sz w:val="20"/>
+          <w:rFonts w:ascii="Times New Roman" w:hAnsi="Times New Roman" w:eastAsia="Times New Roman" w:cs="Times New Roman"/>
+          <w:b w:val="0"/>
+          <w:i w:val="0"/>
+          <w:sz w:val="24"/>
         </w:rPr>
         <w:t xml:space="preserve"> Perovskite Solar Cells,” Inorganics 12(4), 123 (2024). doi:10.3390/inorganics12040123.</w:t>
       </w:r>
     </w:p>
     <w:p>
       <w:pPr>
-        <w:spacing w:line="192" w:lineRule="auto" w:before="10" w:after="10"/>
+        <w:spacing w:line="216" w:lineRule="auto" w:before="0" w:after="0"/>
         <w:ind w:left="454" w:hanging="454"/>
       </w:pPr>
       <w:r>
         <w:rPr>
-          <w:rFonts w:ascii="Times New Roman" w:hAnsi="Times New Roman"/>
-          <w:b w:val="0"/>
-          <w:i w:val="0"/>
-          <w:sz w:val="20"/>
+          <w:rFonts w:ascii="Times New Roman" w:hAnsi="Times New Roman" w:eastAsia="Times New Roman" w:cs="Times New Roman"/>
+          <w:b w:val="0"/>
+          <w:i w:val="0"/>
+          <w:sz w:val="24"/>
         </w:rPr>
         <w:t xml:space="preserve">[41] R. Islam, M. N. Uddin, M. J. Hossen, and A. Begum, “Photovoltaic performance of lead-free </w:t>
       </w:r>
       <w:r>
         <w:rPr>
-          <w:rFonts w:ascii="Times New Roman" w:hAnsi="Times New Roman"/>
-          <w:b w:val="0"/>
-          <w:i w:val="0"/>
-          <w:sz w:val="20"/>
+          <w:rFonts w:ascii="Times New Roman" w:hAnsi="Times New Roman" w:eastAsia="Times New Roman" w:cs="Times New Roman"/>
+          <w:b w:val="0"/>
+          <w:i w:val="0"/>
+          <w:sz w:val="24"/>
         </w:rPr>
         <w:t xml:space="preserve">MASnI</w:t>
       </w:r>
       <w:r>
         <w:rPr>
-          <w:rFonts w:ascii="Times New Roman" w:hAnsi="Times New Roman"/>
-          <w:b w:val="0"/>
-          <w:i w:val="0"/>
-          <w:sz w:val="20"/>
+          <w:rFonts w:ascii="Times New Roman" w:hAnsi="Times New Roman" w:eastAsia="Times New Roman" w:cs="Times New Roman"/>
+          <w:b w:val="0"/>
+          <w:i w:val="0"/>
+          <w:sz w:val="24"/>
           <w:vertAlign w:val="subscript"/>
         </w:rPr>
         <w:t xml:space="preserve">3</w:t>
       </w:r>
       <w:r>
         <w:rPr>
-          <w:rFonts w:ascii="Times New Roman" w:hAnsi="Times New Roman"/>
-          <w:b w:val="0"/>
-          <w:i w:val="0"/>
-          <w:sz w:val="20"/>
+          <w:rFonts w:ascii="Times New Roman" w:hAnsi="Times New Roman" w:eastAsia="Times New Roman" w:cs="Times New Roman"/>
+          <w:b w:val="0"/>
+          <w:i w:val="0"/>
+          <w:sz w:val="24"/>
         </w:rPr>
         <w:t xml:space="preserve">-based perovskite solar cells with kesterite hole transport materials,” AIP Adv. 16(5) (2026). doi:10.1063/5.0315071.</w:t>
       </w:r>
     </w:p>
     <w:p>
       <w:pPr>
-        <w:spacing w:line="192" w:lineRule="auto" w:before="10" w:after="10"/>
+        <w:spacing w:line="216" w:lineRule="auto" w:before="0" w:after="0"/>
         <w:ind w:left="454" w:hanging="454"/>
       </w:pPr>
       <w:r>
         <w:rPr>
-          <w:rFonts w:ascii="Times New Roman" w:hAnsi="Times New Roman" w:cs="Times New Roman"/>
-          <w:b w:val="0"/>
-          <w:i w:val="0"/>
-          <w:sz w:val="20"/>
+          <w:rFonts w:ascii="Times New Roman" w:hAnsi="Times New Roman" w:cs="Times New Roman" w:eastAsia="Times New Roman"/>
+          <w:b w:val="0"/>
+          <w:i w:val="0"/>
+          <w:sz w:val="24"/>
         </w:rPr>
         <w:t xml:space="preserve">[42] A. C. Piñón Reyes et al., “Study of a lead-free perovskite solar cell using CZTS as HTL to achieve a 20% PCE by SCAPS-1D simulation,” Micromachines 12(12), 1508 (2021). doi:10.3390/mi12121508.</w:t>
       </w:r>

</xml_diff>